<commit_message>
docs/guides: rebuild the crew guides with doc-builder; add gizmoduck and rule-of-two guides
crew-overview, crew-capabilities and crew-technical-reference regenerated,
and gizmoduck and rule-of-two overview + technical-reference guides added,
each as HTML in the neutral and Solomon brands plus DOCX and PDF. Built with
doc-builder's house_style.py (--profile guide) and LibreOffice 26.2.5.2;
Word rendering unverified on this host. PDFs are A4.

The crew guides describe crew 0.20.11 as of post-207-checklist@541b2b70,
which is PR #208 and not yet on main; they run ahead of main's plugin code
until that merges. Pushed directly to main at the owner's instruction,
bypassing the PR and its required checks.

Co-Authored-By: Claude Opus 5.5 (1M context) <noreply@anthropic.com>
</commit_message>
<xml_diff>
--- a/docs/guides/crew-capabilities.docx
+++ b/docs/guides/crew-capabilities.docx
@@ -12,7 +12,7 @@
       </w:pPr>
       <w:r>
         <w:rPr/>
-        <w:t>The crew plugin: what it does and why</w:t>
+        <w:t>The Crew Plugin: What It Does and Why</w:t>
       </w:r>
     </w:p>
     <w:p>
@@ -24,6 +24,8 @@
       </w:pPr>
       <w:r>
         <w:rPr/>
+        <w:t>Generated from useful-claude-add-ons@541b2b70 on 2026-09-22. Verify before trusting.</w:t>
+        <w:br/>
         <w:t xml:space="preserve">The combined guide: high-level and technical in one document. Two companion documents split it: </w:t>
       </w:r>
       <w:r>
@@ -44,17 +46,7 @@
       </w:r>
       <w:r>
         <w:rPr/>
-        <w:t xml:space="preserve"> for the people who run it. Written 20 September 2026 against crew 0.19.92 on </w:t>
-      </w:r>
-      <w:r>
-        <w:rPr>
-          <w:rStyle w:val="SourceText"/>
-        </w:rPr>
-        <w:t>main</w:t>
-      </w:r>
-      <w:r>
-        <w:rPr/>
-        <w:t xml:space="preserve"> (commit 621d50dc), with the Stop-gate fix (0.19.93) described as it stands in review.</w:t>
+        <w:t xml:space="preserve"> for the people who run it. Written against crew 0.20.11.</w:t>
       </w:r>
     </w:p>
     <w:p>
@@ -66,21 +58,21 @@
         <w:jc w:val="left"/>
         <w:rPr>
           <w:bdr w:val="single" w:sz="2" w:space="8" w:color="1F4E79"/>
-          <w:shd w:fill="F3F6FA" w:val="clear"/>
+          <w:shd w:fill="F6F7F9" w:val="clear"/>
         </w:rPr>
       </w:pPr>
       <w:r>
         <w:rPr>
           <w:b/>
           <w:bdr w:val="single" w:sz="2" w:space="8" w:color="1F4E79"/>
-          <w:shd w:fill="F3F6FA" w:val="clear"/>
+          <w:shd w:fill="F6F7F9" w:val="clear"/>
         </w:rPr>
         <w:t>In one paragraph.</w:t>
       </w:r>
       <w:r>
         <w:rPr>
           <w:bdr w:val="single" w:sz="2" w:space="8" w:color="1F4E79"/>
-          <w:shd w:fill="F3F6FA" w:val="clear"/>
+          <w:shd w:fill="F6F7F9" w:val="clear"/>
         </w:rPr>
         <w:t xml:space="preserve"> Crew turns Claude Code from a single assistant into a small, disciplined software team. One agent manages, one investigates, one implements, an independent one from a different AI vendor reviews, and automatic gates stop anything that fails from being merged or released. Everything it knows about a codebase is written down in files that live with the code, so nothing depends on one person's memory or one chat session. It exists because an AI that writes code, reviews its own work, and never loses focus is a fiction; crew makes each of those a separate, checkable step.</w:t>
       </w:r>
@@ -95,7 +87,7 @@
       </w:pPr>
       <w:r>
         <w:rPr/>
-        <w:t>1. The problem it solves</w:t>
+        <w:t>1. The Problem It Solves</w:t>
       </w:r>
     </w:p>
     <w:p>
@@ -242,7 +234,7 @@
       </w:pPr>
       <w:r>
         <w:rPr/>
-        <w:t>2. How it works, in plain terms</w:t>
+        <w:t>2. How It Works, in Plain Terms</w:t>
       </w:r>
     </w:p>
     <w:p>
@@ -254,21 +246,21 @@
         <w:jc w:val="left"/>
         <w:rPr>
           <w:bdr w:val="single" w:sz="24" w:space="10" w:color="1F4E79"/>
-          <w:shd w:fill="F7F9FB" w:val="clear"/>
+          <w:shd w:fill="F6F7F9" w:val="clear"/>
         </w:rPr>
       </w:pPr>
       <w:r>
         <w:rPr>
           <w:b/>
           <w:bdr w:val="single" w:sz="24" w:space="10" w:color="1F4E79"/>
-          <w:shd w:fill="F7F9FB" w:val="clear"/>
+          <w:shd w:fill="F6F7F9" w:val="clear"/>
         </w:rPr>
         <w:t>Think of it as a very small consultancy inside your editor.</w:t>
       </w:r>
       <w:r>
         <w:rPr>
           <w:bdr w:val="single" w:sz="24" w:space="10" w:color="1F4E79"/>
-          <w:shd w:fill="F7F9FB" w:val="clear"/>
+          <w:shd w:fill="F6F7F9" w:val="clear"/>
         </w:rPr>
         <w:t xml:space="preserve"> You write a ticket. A manager (the PM) decides who should do what and keeps the overall picture. A developer takes the ticket into a private workspace and does only that job. When it is done, a reviewer from a different company reads the change looking for defects, and reports them in a fixed format. A set of automatic checks runs before anything is merged or promoted, and if one fails, the release stops. Every decision and every lesson is written into files in the repository, so the next session, or the next person, starts where this one left off.</w:t>
       </w:r>
@@ -295,7 +287,7 @@
       </w:pPr>
       <w:r>
         <w:rPr/>
-        <w:t>The people, so to speak</w:t>
+        <w:t>The People, So to Speak</w:t>
       </w:r>
     </w:p>
     <w:tbl>
@@ -312,9 +304,9 @@
         </w:tblCellMar>
       </w:tblPr>
       <w:tblGrid>
-        <w:gridCol w:w="2480"/>
-        <w:gridCol w:w="4626"/>
-        <w:gridCol w:w="4233"/>
+        <w:gridCol w:w="2391"/>
+        <w:gridCol w:w="4300"/>
+        <w:gridCol w:w="4648"/>
       </w:tblGrid>
       <w:tr>
         <w:trPr>
@@ -322,7 +314,7 @@
         </w:trPr>
         <w:tc>
           <w:tcPr>
-            <w:tcW w:w="2480" w:type="dxa"/>
+            <w:tcW w:w="2391" w:type="dxa"/>
             <w:tcBorders/>
             <w:vAlign w:val="center"/>
           </w:tcPr>
@@ -344,7 +336,7 @@
         </w:tc>
         <w:tc>
           <w:tcPr>
-            <w:tcW w:w="4626" w:type="dxa"/>
+            <w:tcW w:w="4300" w:type="dxa"/>
             <w:tcBorders/>
             <w:vAlign w:val="center"/>
           </w:tcPr>
@@ -366,7 +358,7 @@
         </w:tc>
         <w:tc>
           <w:tcPr>
-            <w:tcW w:w="4233" w:type="dxa"/>
+            <w:tcW w:w="4648" w:type="dxa"/>
             <w:tcBorders/>
             <w:vAlign w:val="center"/>
           </w:tcPr>
@@ -391,7 +383,7 @@
         <w:trPr/>
         <w:tc>
           <w:tcPr>
-            <w:tcW w:w="2480" w:type="dxa"/>
+            <w:tcW w:w="2391" w:type="dxa"/>
             <w:tcBorders/>
             <w:vAlign w:val="center"/>
           </w:tcPr>
@@ -411,7 +403,7 @@
         </w:tc>
         <w:tc>
           <w:tcPr>
-            <w:tcW w:w="4626" w:type="dxa"/>
+            <w:tcW w:w="4300" w:type="dxa"/>
             <w:tcBorders/>
             <w:vAlign w:val="center"/>
           </w:tcPr>
@@ -431,30 +423,30 @@
         </w:tc>
         <w:tc>
           <w:tcPr>
-            <w:tcW w:w="4233" w:type="dxa"/>
-            <w:tcBorders/>
-            <w:vAlign w:val="center"/>
-          </w:tcPr>
-          <w:p>
-            <w:pPr>
-              <w:pStyle w:val="TableContents"/>
-              <w:bidi w:val="0"/>
-              <w:spacing w:before="120" w:after="120"/>
-              <w:jc w:val="left"/>
-              <w:rPr/>
-            </w:pPr>
-            <w:r>
-              <w:rPr/>
-              <w:t>Keeps the whole picture in one place. From 0.19.92 it is mechanically prevented from writing code by the write guard.</w:t>
-            </w:r>
-          </w:p>
-        </w:tc>
-      </w:tr>
-      <w:tr>
-        <w:trPr/>
-        <w:tc>
-          <w:tcPr>
-            <w:tcW w:w="2480" w:type="dxa"/>
+            <w:tcW w:w="4648" w:type="dxa"/>
+            <w:tcBorders/>
+            <w:vAlign w:val="center"/>
+          </w:tcPr>
+          <w:p>
+            <w:pPr>
+              <w:pStyle w:val="TableContents"/>
+              <w:bidi w:val="0"/>
+              <w:spacing w:before="120" w:after="120"/>
+              <w:jc w:val="left"/>
+              <w:rPr/>
+            </w:pPr>
+            <w:r>
+              <w:rPr/>
+              <w:t>Keeps the whole picture in one place. Mechanically prevented from writing code by the role write guard, off by default and turned on per repository.</w:t>
+            </w:r>
+          </w:p>
+        </w:tc>
+      </w:tr>
+      <w:tr>
+        <w:trPr/>
+        <w:tc>
+          <w:tcPr>
+            <w:tcW w:w="2391" w:type="dxa"/>
             <w:tcBorders/>
             <w:vAlign w:val="center"/>
           </w:tcPr>
@@ -474,7 +466,7 @@
         </w:tc>
         <w:tc>
           <w:tcPr>
-            <w:tcW w:w="4626" w:type="dxa"/>
+            <w:tcW w:w="4300" w:type="dxa"/>
             <w:tcBorders/>
             <w:vAlign w:val="center"/>
           </w:tcPr>
@@ -494,7 +486,7 @@
         </w:tc>
         <w:tc>
           <w:tcPr>
-            <w:tcW w:w="4233" w:type="dxa"/>
+            <w:tcW w:w="4648" w:type="dxa"/>
             <w:tcBorders/>
             <w:vAlign w:val="center"/>
           </w:tcPr>
@@ -517,7 +509,7 @@
         <w:trPr/>
         <w:tc>
           <w:tcPr>
-            <w:tcW w:w="2480" w:type="dxa"/>
+            <w:tcW w:w="2391" w:type="dxa"/>
             <w:tcBorders/>
             <w:vAlign w:val="center"/>
           </w:tcPr>
@@ -537,7 +529,7 @@
         </w:tc>
         <w:tc>
           <w:tcPr>
-            <w:tcW w:w="4626" w:type="dxa"/>
+            <w:tcW w:w="4300" w:type="dxa"/>
             <w:tcBorders/>
             <w:vAlign w:val="center"/>
           </w:tcPr>
@@ -557,7 +549,7 @@
         </w:tc>
         <w:tc>
           <w:tcPr>
-            <w:tcW w:w="4233" w:type="dxa"/>
+            <w:tcW w:w="4648" w:type="dxa"/>
             <w:tcBorders/>
             <w:vAlign w:val="center"/>
           </w:tcPr>
@@ -580,7 +572,7 @@
         <w:trPr/>
         <w:tc>
           <w:tcPr>
-            <w:tcW w:w="2480" w:type="dxa"/>
+            <w:tcW w:w="2391" w:type="dxa"/>
             <w:tcBorders/>
             <w:vAlign w:val="center"/>
           </w:tcPr>
@@ -600,7 +592,7 @@
         </w:tc>
         <w:tc>
           <w:tcPr>
-            <w:tcW w:w="4626" w:type="dxa"/>
+            <w:tcW w:w="4300" w:type="dxa"/>
             <w:tcBorders/>
             <w:vAlign w:val="center"/>
           </w:tcPr>
@@ -620,7 +612,7 @@
         </w:tc>
         <w:tc>
           <w:tcPr>
-            <w:tcW w:w="4233" w:type="dxa"/>
+            <w:tcW w:w="4648" w:type="dxa"/>
             <w:tcBorders/>
             <w:vAlign w:val="center"/>
           </w:tcPr>
@@ -643,7 +635,7 @@
         <w:trPr/>
         <w:tc>
           <w:tcPr>
-            <w:tcW w:w="2480" w:type="dxa"/>
+            <w:tcW w:w="2391" w:type="dxa"/>
             <w:tcBorders/>
             <w:vAlign w:val="center"/>
           </w:tcPr>
@@ -663,7 +655,7 @@
         </w:tc>
         <w:tc>
           <w:tcPr>
-            <w:tcW w:w="4626" w:type="dxa"/>
+            <w:tcW w:w="4300" w:type="dxa"/>
             <w:tcBorders/>
             <w:vAlign w:val="center"/>
           </w:tcPr>
@@ -683,7 +675,7 @@
         </w:tc>
         <w:tc>
           <w:tcPr>
-            <w:tcW w:w="4233" w:type="dxa"/>
+            <w:tcW w:w="4648" w:type="dxa"/>
             <w:tcBorders/>
             <w:vAlign w:val="center"/>
           </w:tcPr>
@@ -706,7 +698,7 @@
         <w:trPr/>
         <w:tc>
           <w:tcPr>
-            <w:tcW w:w="2480" w:type="dxa"/>
+            <w:tcW w:w="2391" w:type="dxa"/>
             <w:tcBorders/>
             <w:vAlign w:val="center"/>
           </w:tcPr>
@@ -726,7 +718,7 @@
         </w:tc>
         <w:tc>
           <w:tcPr>
-            <w:tcW w:w="4626" w:type="dxa"/>
+            <w:tcW w:w="4300" w:type="dxa"/>
             <w:tcBorders/>
             <w:vAlign w:val="center"/>
           </w:tcPr>
@@ -746,7 +738,7 @@
         </w:tc>
         <w:tc>
           <w:tcPr>
-            <w:tcW w:w="4233" w:type="dxa"/>
+            <w:tcW w:w="4648" w:type="dxa"/>
             <w:tcBorders/>
             <w:vAlign w:val="center"/>
           </w:tcPr>
@@ -769,7 +761,7 @@
         <w:trPr/>
         <w:tc>
           <w:tcPr>
-            <w:tcW w:w="2480" w:type="dxa"/>
+            <w:tcW w:w="2391" w:type="dxa"/>
             <w:tcBorders/>
             <w:vAlign w:val="center"/>
           </w:tcPr>
@@ -789,7 +781,7 @@
         </w:tc>
         <w:tc>
           <w:tcPr>
-            <w:tcW w:w="4626" w:type="dxa"/>
+            <w:tcW w:w="4300" w:type="dxa"/>
             <w:tcBorders/>
             <w:vAlign w:val="center"/>
           </w:tcPr>
@@ -809,7 +801,7 @@
         </w:tc>
         <w:tc>
           <w:tcPr>
-            <w:tcW w:w="4233" w:type="dxa"/>
+            <w:tcW w:w="4648" w:type="dxa"/>
             <w:tcBorders/>
             <w:vAlign w:val="center"/>
           </w:tcPr>
@@ -832,7 +824,7 @@
         <w:trPr/>
         <w:tc>
           <w:tcPr>
-            <w:tcW w:w="2480" w:type="dxa"/>
+            <w:tcW w:w="2391" w:type="dxa"/>
             <w:tcBorders/>
             <w:vAlign w:val="center"/>
           </w:tcPr>
@@ -852,7 +844,7 @@
         </w:tc>
         <w:tc>
           <w:tcPr>
-            <w:tcW w:w="4626" w:type="dxa"/>
+            <w:tcW w:w="4300" w:type="dxa"/>
             <w:tcBorders/>
             <w:vAlign w:val="center"/>
           </w:tcPr>
@@ -872,7 +864,7 @@
         </w:tc>
         <w:tc>
           <w:tcPr>
-            <w:tcW w:w="4233" w:type="dxa"/>
+            <w:tcW w:w="4648" w:type="dxa"/>
             <w:tcBorders/>
             <w:vAlign w:val="center"/>
           </w:tcPr>
@@ -901,7 +893,7 @@
       </w:pPr>
       <w:r>
         <w:rPr/>
-        <w:t>Tiers: the crew grows only when there is evidence it should</w:t>
+        <w:t>Tiers: The Crew Grows Only When There Is Evidence It Should</w:t>
       </w:r>
     </w:p>
     <w:tbl>
@@ -918,9 +910,9 @@
         </w:tblCellMar>
       </w:tblPr>
       <w:tblGrid>
-        <w:gridCol w:w="617"/>
-        <w:gridCol w:w="4031"/>
-        <w:gridCol w:w="6691"/>
+        <w:gridCol w:w="675"/>
+        <w:gridCol w:w="4043"/>
+        <w:gridCol w:w="6621"/>
       </w:tblGrid>
       <w:tr>
         <w:trPr>
@@ -928,7 +920,7 @@
         </w:trPr>
         <w:tc>
           <w:tcPr>
-            <w:tcW w:w="617" w:type="dxa"/>
+            <w:tcW w:w="675" w:type="dxa"/>
             <w:tcBorders/>
             <w:vAlign w:val="center"/>
           </w:tcPr>
@@ -950,7 +942,7 @@
         </w:tc>
         <w:tc>
           <w:tcPr>
-            <w:tcW w:w="4031" w:type="dxa"/>
+            <w:tcW w:w="4043" w:type="dxa"/>
             <w:tcBorders/>
             <w:vAlign w:val="center"/>
           </w:tcPr>
@@ -972,7 +964,7 @@
         </w:tc>
         <w:tc>
           <w:tcPr>
-            <w:tcW w:w="6691" w:type="dxa"/>
+            <w:tcW w:w="6621" w:type="dxa"/>
             <w:tcBorders/>
             <w:vAlign w:val="center"/>
           </w:tcPr>
@@ -997,7 +989,7 @@
         <w:trPr/>
         <w:tc>
           <w:tcPr>
-            <w:tcW w:w="617" w:type="dxa"/>
+            <w:tcW w:w="675" w:type="dxa"/>
             <w:tcBorders/>
             <w:vAlign w:val="center"/>
           </w:tcPr>
@@ -1017,7 +1009,7 @@
         </w:tc>
         <w:tc>
           <w:tcPr>
-            <w:tcW w:w="4031" w:type="dxa"/>
+            <w:tcW w:w="4043" w:type="dxa"/>
             <w:tcBorders/>
             <w:vAlign w:val="center"/>
           </w:tcPr>
@@ -1037,7 +1029,7 @@
         </w:tc>
         <w:tc>
           <w:tcPr>
-            <w:tcW w:w="6691" w:type="dxa"/>
+            <w:tcW w:w="6621" w:type="dxa"/>
             <w:tcBorders/>
             <w:vAlign w:val="center"/>
           </w:tcPr>
@@ -1060,7 +1052,7 @@
         <w:trPr/>
         <w:tc>
           <w:tcPr>
-            <w:tcW w:w="617" w:type="dxa"/>
+            <w:tcW w:w="675" w:type="dxa"/>
             <w:tcBorders/>
             <w:vAlign w:val="center"/>
           </w:tcPr>
@@ -1080,7 +1072,7 @@
         </w:tc>
         <w:tc>
           <w:tcPr>
-            <w:tcW w:w="4031" w:type="dxa"/>
+            <w:tcW w:w="4043" w:type="dxa"/>
             <w:tcBorders/>
             <w:vAlign w:val="center"/>
           </w:tcPr>
@@ -1100,7 +1092,7 @@
         </w:tc>
         <w:tc>
           <w:tcPr>
-            <w:tcW w:w="6691" w:type="dxa"/>
+            <w:tcW w:w="6621" w:type="dxa"/>
             <w:tcBorders/>
             <w:vAlign w:val="center"/>
           </w:tcPr>
@@ -1123,7 +1115,7 @@
         <w:trPr/>
         <w:tc>
           <w:tcPr>
-            <w:tcW w:w="617" w:type="dxa"/>
+            <w:tcW w:w="675" w:type="dxa"/>
             <w:tcBorders/>
             <w:vAlign w:val="center"/>
           </w:tcPr>
@@ -1143,7 +1135,7 @@
         </w:tc>
         <w:tc>
           <w:tcPr>
-            <w:tcW w:w="4031" w:type="dxa"/>
+            <w:tcW w:w="4043" w:type="dxa"/>
             <w:tcBorders/>
             <w:vAlign w:val="center"/>
           </w:tcPr>
@@ -1163,7 +1155,7 @@
         </w:tc>
         <w:tc>
           <w:tcPr>
-            <w:tcW w:w="6691" w:type="dxa"/>
+            <w:tcW w:w="6621" w:type="dxa"/>
             <w:tcBorders/>
             <w:vAlign w:val="center"/>
           </w:tcPr>
@@ -1186,7 +1178,7 @@
         <w:trPr/>
         <w:tc>
           <w:tcPr>
-            <w:tcW w:w="617" w:type="dxa"/>
+            <w:tcW w:w="675" w:type="dxa"/>
             <w:tcBorders/>
             <w:vAlign w:val="center"/>
           </w:tcPr>
@@ -1206,7 +1198,7 @@
         </w:tc>
         <w:tc>
           <w:tcPr>
-            <w:tcW w:w="4031" w:type="dxa"/>
+            <w:tcW w:w="4043" w:type="dxa"/>
             <w:tcBorders/>
             <w:vAlign w:val="center"/>
           </w:tcPr>
@@ -1226,7 +1218,7 @@
         </w:tc>
         <w:tc>
           <w:tcPr>
-            <w:tcW w:w="6691" w:type="dxa"/>
+            <w:tcW w:w="6621" w:type="dxa"/>
             <w:tcBorders/>
             <w:vAlign w:val="center"/>
           </w:tcPr>
@@ -1277,7 +1269,7 @@
       </w:pPr>
       <w:r>
         <w:rPr/>
-        <w:t>Specialists: 40 more roles you switch on per repository</w:t>
+        <w:t>Specialists: Forty More Roles You Switch on per Repository</w:t>
       </w:r>
     </w:p>
     <w:p>
@@ -1316,8 +1308,8 @@
         </w:tblCellMar>
       </w:tblPr>
       <w:tblGrid>
-        <w:gridCol w:w="2063"/>
-        <w:gridCol w:w="9276"/>
+        <w:gridCol w:w="2221"/>
+        <w:gridCol w:w="9118"/>
       </w:tblGrid>
       <w:tr>
         <w:trPr>
@@ -1325,7 +1317,7 @@
         </w:trPr>
         <w:tc>
           <w:tcPr>
-            <w:tcW w:w="2063" w:type="dxa"/>
+            <w:tcW w:w="2221" w:type="dxa"/>
             <w:tcBorders/>
             <w:vAlign w:val="center"/>
           </w:tcPr>
@@ -1347,7 +1339,7 @@
         </w:tc>
         <w:tc>
           <w:tcPr>
-            <w:tcW w:w="9276" w:type="dxa"/>
+            <w:tcW w:w="9118" w:type="dxa"/>
             <w:tcBorders/>
             <w:vAlign w:val="center"/>
           </w:tcPr>
@@ -1372,7 +1364,7 @@
         <w:trPr/>
         <w:tc>
           <w:tcPr>
-            <w:tcW w:w="2063" w:type="dxa"/>
+            <w:tcW w:w="2221" w:type="dxa"/>
             <w:tcBorders/>
             <w:vAlign w:val="center"/>
           </w:tcPr>
@@ -1392,7 +1384,7 @@
         </w:tc>
         <w:tc>
           <w:tcPr>
-            <w:tcW w:w="9276" w:type="dxa"/>
+            <w:tcW w:w="9118" w:type="dxa"/>
             <w:tcBorders/>
             <w:vAlign w:val="center"/>
           </w:tcPr>
@@ -1415,7 +1407,7 @@
         <w:trPr/>
         <w:tc>
           <w:tcPr>
-            <w:tcW w:w="2063" w:type="dxa"/>
+            <w:tcW w:w="2221" w:type="dxa"/>
             <w:tcBorders/>
             <w:vAlign w:val="center"/>
           </w:tcPr>
@@ -1435,7 +1427,7 @@
         </w:tc>
         <w:tc>
           <w:tcPr>
-            <w:tcW w:w="9276" w:type="dxa"/>
+            <w:tcW w:w="9118" w:type="dxa"/>
             <w:tcBorders/>
             <w:vAlign w:val="center"/>
           </w:tcPr>
@@ -1458,7 +1450,7 @@
         <w:trPr/>
         <w:tc>
           <w:tcPr>
-            <w:tcW w:w="2063" w:type="dxa"/>
+            <w:tcW w:w="2221" w:type="dxa"/>
             <w:tcBorders/>
             <w:vAlign w:val="center"/>
           </w:tcPr>
@@ -1478,7 +1470,7 @@
         </w:tc>
         <w:tc>
           <w:tcPr>
-            <w:tcW w:w="9276" w:type="dxa"/>
+            <w:tcW w:w="9118" w:type="dxa"/>
             <w:tcBorders/>
             <w:vAlign w:val="center"/>
           </w:tcPr>
@@ -1501,7 +1493,7 @@
         <w:trPr/>
         <w:tc>
           <w:tcPr>
-            <w:tcW w:w="2063" w:type="dxa"/>
+            <w:tcW w:w="2221" w:type="dxa"/>
             <w:tcBorders/>
             <w:vAlign w:val="center"/>
           </w:tcPr>
@@ -1521,7 +1513,7 @@
         </w:tc>
         <w:tc>
           <w:tcPr>
-            <w:tcW w:w="9276" w:type="dxa"/>
+            <w:tcW w:w="9118" w:type="dxa"/>
             <w:tcBorders/>
             <w:vAlign w:val="center"/>
           </w:tcPr>
@@ -1544,7 +1536,7 @@
         <w:trPr/>
         <w:tc>
           <w:tcPr>
-            <w:tcW w:w="2063" w:type="dxa"/>
+            <w:tcW w:w="2221" w:type="dxa"/>
             <w:tcBorders/>
             <w:vAlign w:val="center"/>
           </w:tcPr>
@@ -1564,7 +1556,7 @@
         </w:tc>
         <w:tc>
           <w:tcPr>
-            <w:tcW w:w="9276" w:type="dxa"/>
+            <w:tcW w:w="9118" w:type="dxa"/>
             <w:tcBorders/>
             <w:vAlign w:val="center"/>
           </w:tcPr>
@@ -1593,7 +1585,7 @@
       </w:pPr>
       <w:r>
         <w:rPr/>
-        <w:t>3. Commands: what you can ask for</w:t>
+        <w:t>3. Commands: What You Can Ask For</w:t>
       </w:r>
     </w:p>
     <w:p>
@@ -1615,7 +1607,7 @@
       </w:r>
       <w:r>
         <w:rPr/>
-        <w:t xml:space="preserve"> in Claude Code. The right-hand column says what it means for someone who does not read code.</w:t>
+        <w:t xml:space="preserve"> in Claude Code. 28 ship with crew. The right-hand column says what it means for someone who does not read code.</w:t>
       </w:r>
     </w:p>
     <w:tbl>
@@ -1632,9 +1624,9 @@
         </w:tblCellMar>
       </w:tblPr>
       <w:tblGrid>
-        <w:gridCol w:w="1942"/>
-        <w:gridCol w:w="5038"/>
-        <w:gridCol w:w="4359"/>
+        <w:gridCol w:w="2038"/>
+        <w:gridCol w:w="4915"/>
+        <w:gridCol w:w="4386"/>
       </w:tblGrid>
       <w:tr>
         <w:trPr>
@@ -1642,7 +1634,7 @@
         </w:trPr>
         <w:tc>
           <w:tcPr>
-            <w:tcW w:w="1942" w:type="dxa"/>
+            <w:tcW w:w="2038" w:type="dxa"/>
             <w:tcBorders/>
             <w:vAlign w:val="center"/>
           </w:tcPr>
@@ -1664,7 +1656,7 @@
         </w:tc>
         <w:tc>
           <w:tcPr>
-            <w:tcW w:w="5038" w:type="dxa"/>
+            <w:tcW w:w="4915" w:type="dxa"/>
             <w:tcBorders/>
             <w:vAlign w:val="center"/>
           </w:tcPr>
@@ -1686,7 +1678,7 @@
         </w:tc>
         <w:tc>
           <w:tcPr>
-            <w:tcW w:w="4359" w:type="dxa"/>
+            <w:tcW w:w="4386" w:type="dxa"/>
             <w:tcBorders/>
             <w:vAlign w:val="center"/>
           </w:tcPr>
@@ -1711,7 +1703,7 @@
         <w:trPr/>
         <w:tc>
           <w:tcPr>
-            <w:tcW w:w="1942" w:type="dxa"/>
+            <w:tcW w:w="2038" w:type="dxa"/>
             <w:tcBorders/>
             <w:vAlign w:val="center"/>
           </w:tcPr>
@@ -1731,7 +1723,7 @@
         </w:tc>
         <w:tc>
           <w:tcPr>
-            <w:tcW w:w="5038" w:type="dxa"/>
+            <w:tcW w:w="4915" w:type="dxa"/>
             <w:tcBorders/>
             <w:vAlign w:val="center"/>
           </w:tcPr>
@@ -1751,7 +1743,7 @@
         </w:tc>
         <w:tc>
           <w:tcPr>
-            <w:tcW w:w="4359" w:type="dxa"/>
+            <w:tcW w:w="4386" w:type="dxa"/>
             <w:tcBorders/>
             <w:vAlign w:val="center"/>
           </w:tcPr>
@@ -1774,7 +1766,7 @@
         <w:trPr/>
         <w:tc>
           <w:tcPr>
-            <w:tcW w:w="1942" w:type="dxa"/>
+            <w:tcW w:w="2038" w:type="dxa"/>
             <w:tcBorders/>
             <w:vAlign w:val="center"/>
           </w:tcPr>
@@ -1794,7 +1786,7 @@
         </w:tc>
         <w:tc>
           <w:tcPr>
-            <w:tcW w:w="5038" w:type="dxa"/>
+            <w:tcW w:w="4915" w:type="dxa"/>
             <w:tcBorders/>
             <w:vAlign w:val="center"/>
           </w:tcPr>
@@ -1814,7 +1806,7 @@
         </w:tc>
         <w:tc>
           <w:tcPr>
-            <w:tcW w:w="4359" w:type="dxa"/>
+            <w:tcW w:w="4386" w:type="dxa"/>
             <w:tcBorders/>
             <w:vAlign w:val="center"/>
           </w:tcPr>
@@ -1837,7 +1829,7 @@
         <w:trPr/>
         <w:tc>
           <w:tcPr>
-            <w:tcW w:w="1942" w:type="dxa"/>
+            <w:tcW w:w="2038" w:type="dxa"/>
             <w:tcBorders/>
             <w:vAlign w:val="center"/>
           </w:tcPr>
@@ -1857,7 +1849,7 @@
         </w:tc>
         <w:tc>
           <w:tcPr>
-            <w:tcW w:w="5038" w:type="dxa"/>
+            <w:tcW w:w="4915" w:type="dxa"/>
             <w:tcBorders/>
             <w:vAlign w:val="center"/>
           </w:tcPr>
@@ -1877,7 +1869,7 @@
         </w:tc>
         <w:tc>
           <w:tcPr>
-            <w:tcW w:w="4359" w:type="dxa"/>
+            <w:tcW w:w="4386" w:type="dxa"/>
             <w:tcBorders/>
             <w:vAlign w:val="center"/>
           </w:tcPr>
@@ -1900,7 +1892,7 @@
         <w:trPr/>
         <w:tc>
           <w:tcPr>
-            <w:tcW w:w="1942" w:type="dxa"/>
+            <w:tcW w:w="2038" w:type="dxa"/>
             <w:tcBorders/>
             <w:vAlign w:val="center"/>
           </w:tcPr>
@@ -1920,7 +1912,7 @@
         </w:tc>
         <w:tc>
           <w:tcPr>
-            <w:tcW w:w="5038" w:type="dxa"/>
+            <w:tcW w:w="4915" w:type="dxa"/>
             <w:tcBorders/>
             <w:vAlign w:val="center"/>
           </w:tcPr>
@@ -1940,7 +1932,7 @@
         </w:tc>
         <w:tc>
           <w:tcPr>
-            <w:tcW w:w="4359" w:type="dxa"/>
+            <w:tcW w:w="4386" w:type="dxa"/>
             <w:tcBorders/>
             <w:vAlign w:val="center"/>
           </w:tcPr>
@@ -1963,7 +1955,7 @@
         <w:trPr/>
         <w:tc>
           <w:tcPr>
-            <w:tcW w:w="1942" w:type="dxa"/>
+            <w:tcW w:w="2038" w:type="dxa"/>
             <w:tcBorders/>
             <w:vAlign w:val="center"/>
           </w:tcPr>
@@ -1983,7 +1975,7 @@
         </w:tc>
         <w:tc>
           <w:tcPr>
-            <w:tcW w:w="5038" w:type="dxa"/>
+            <w:tcW w:w="4915" w:type="dxa"/>
             <w:tcBorders/>
             <w:vAlign w:val="center"/>
           </w:tcPr>
@@ -2003,7 +1995,7 @@
         </w:tc>
         <w:tc>
           <w:tcPr>
-            <w:tcW w:w="4359" w:type="dxa"/>
+            <w:tcW w:w="4386" w:type="dxa"/>
             <w:tcBorders/>
             <w:vAlign w:val="center"/>
           </w:tcPr>
@@ -2026,7 +2018,7 @@
         <w:trPr/>
         <w:tc>
           <w:tcPr>
-            <w:tcW w:w="1942" w:type="dxa"/>
+            <w:tcW w:w="2038" w:type="dxa"/>
             <w:tcBorders/>
             <w:vAlign w:val="center"/>
           </w:tcPr>
@@ -2046,7 +2038,7 @@
         </w:tc>
         <w:tc>
           <w:tcPr>
-            <w:tcW w:w="5038" w:type="dxa"/>
+            <w:tcW w:w="4915" w:type="dxa"/>
             <w:tcBorders/>
             <w:vAlign w:val="center"/>
           </w:tcPr>
@@ -2066,7 +2058,7 @@
         </w:tc>
         <w:tc>
           <w:tcPr>
-            <w:tcW w:w="4359" w:type="dxa"/>
+            <w:tcW w:w="4386" w:type="dxa"/>
             <w:tcBorders/>
             <w:vAlign w:val="center"/>
           </w:tcPr>
@@ -2089,7 +2081,7 @@
         <w:trPr/>
         <w:tc>
           <w:tcPr>
-            <w:tcW w:w="1942" w:type="dxa"/>
+            <w:tcW w:w="2038" w:type="dxa"/>
             <w:tcBorders/>
             <w:vAlign w:val="center"/>
           </w:tcPr>
@@ -2109,7 +2101,7 @@
         </w:tc>
         <w:tc>
           <w:tcPr>
-            <w:tcW w:w="5038" w:type="dxa"/>
+            <w:tcW w:w="4915" w:type="dxa"/>
             <w:tcBorders/>
             <w:vAlign w:val="center"/>
           </w:tcPr>
@@ -2129,7 +2121,7 @@
         </w:tc>
         <w:tc>
           <w:tcPr>
-            <w:tcW w:w="4359" w:type="dxa"/>
+            <w:tcW w:w="4386" w:type="dxa"/>
             <w:tcBorders/>
             <w:vAlign w:val="center"/>
           </w:tcPr>
@@ -2152,7 +2144,7 @@
         <w:trPr/>
         <w:tc>
           <w:tcPr>
-            <w:tcW w:w="1942" w:type="dxa"/>
+            <w:tcW w:w="2038" w:type="dxa"/>
             <w:tcBorders/>
             <w:vAlign w:val="center"/>
           </w:tcPr>
@@ -2172,7 +2164,7 @@
         </w:tc>
         <w:tc>
           <w:tcPr>
-            <w:tcW w:w="5038" w:type="dxa"/>
+            <w:tcW w:w="4915" w:type="dxa"/>
             <w:tcBorders/>
             <w:vAlign w:val="center"/>
           </w:tcPr>
@@ -2192,7 +2184,7 @@
         </w:tc>
         <w:tc>
           <w:tcPr>
-            <w:tcW w:w="4359" w:type="dxa"/>
+            <w:tcW w:w="4386" w:type="dxa"/>
             <w:tcBorders/>
             <w:vAlign w:val="center"/>
           </w:tcPr>
@@ -2215,7 +2207,7 @@
         <w:trPr/>
         <w:tc>
           <w:tcPr>
-            <w:tcW w:w="1942" w:type="dxa"/>
+            <w:tcW w:w="2038" w:type="dxa"/>
             <w:tcBorders/>
             <w:vAlign w:val="center"/>
           </w:tcPr>
@@ -2235,7 +2227,7 @@
         </w:tc>
         <w:tc>
           <w:tcPr>
-            <w:tcW w:w="5038" w:type="dxa"/>
+            <w:tcW w:w="4915" w:type="dxa"/>
             <w:tcBorders/>
             <w:vAlign w:val="center"/>
           </w:tcPr>
@@ -2255,7 +2247,7 @@
         </w:tc>
         <w:tc>
           <w:tcPr>
-            <w:tcW w:w="4359" w:type="dxa"/>
+            <w:tcW w:w="4386" w:type="dxa"/>
             <w:tcBorders/>
             <w:vAlign w:val="center"/>
           </w:tcPr>
@@ -2278,7 +2270,7 @@
         <w:trPr/>
         <w:tc>
           <w:tcPr>
-            <w:tcW w:w="1942" w:type="dxa"/>
+            <w:tcW w:w="2038" w:type="dxa"/>
             <w:tcBorders/>
             <w:vAlign w:val="center"/>
           </w:tcPr>
@@ -2298,7 +2290,7 @@
         </w:tc>
         <w:tc>
           <w:tcPr>
-            <w:tcW w:w="5038" w:type="dxa"/>
+            <w:tcW w:w="4915" w:type="dxa"/>
             <w:tcBorders/>
             <w:vAlign w:val="center"/>
           </w:tcPr>
@@ -2318,7 +2310,7 @@
         </w:tc>
         <w:tc>
           <w:tcPr>
-            <w:tcW w:w="4359" w:type="dxa"/>
+            <w:tcW w:w="4386" w:type="dxa"/>
             <w:tcBorders/>
             <w:vAlign w:val="center"/>
           </w:tcPr>
@@ -2341,7 +2333,7 @@
         <w:trPr/>
         <w:tc>
           <w:tcPr>
-            <w:tcW w:w="1942" w:type="dxa"/>
+            <w:tcW w:w="2038" w:type="dxa"/>
             <w:tcBorders/>
             <w:vAlign w:val="center"/>
           </w:tcPr>
@@ -2361,7 +2353,7 @@
         </w:tc>
         <w:tc>
           <w:tcPr>
-            <w:tcW w:w="5038" w:type="dxa"/>
+            <w:tcW w:w="4915" w:type="dxa"/>
             <w:tcBorders/>
             <w:vAlign w:val="center"/>
           </w:tcPr>
@@ -2381,7 +2373,7 @@
         </w:tc>
         <w:tc>
           <w:tcPr>
-            <w:tcW w:w="4359" w:type="dxa"/>
+            <w:tcW w:w="4386" w:type="dxa"/>
             <w:tcBorders/>
             <w:vAlign w:val="center"/>
           </w:tcPr>
@@ -2404,7 +2396,7 @@
         <w:trPr/>
         <w:tc>
           <w:tcPr>
-            <w:tcW w:w="1942" w:type="dxa"/>
+            <w:tcW w:w="2038" w:type="dxa"/>
             <w:tcBorders/>
             <w:vAlign w:val="center"/>
           </w:tcPr>
@@ -2424,7 +2416,7 @@
         </w:tc>
         <w:tc>
           <w:tcPr>
-            <w:tcW w:w="5038" w:type="dxa"/>
+            <w:tcW w:w="4915" w:type="dxa"/>
             <w:tcBorders/>
             <w:vAlign w:val="center"/>
           </w:tcPr>
@@ -2444,7 +2436,7 @@
         </w:tc>
         <w:tc>
           <w:tcPr>
-            <w:tcW w:w="4359" w:type="dxa"/>
+            <w:tcW w:w="4386" w:type="dxa"/>
             <w:tcBorders/>
             <w:vAlign w:val="center"/>
           </w:tcPr>
@@ -2467,7 +2459,7 @@
         <w:trPr/>
         <w:tc>
           <w:tcPr>
-            <w:tcW w:w="1942" w:type="dxa"/>
+            <w:tcW w:w="2038" w:type="dxa"/>
             <w:tcBorders/>
             <w:vAlign w:val="center"/>
           </w:tcPr>
@@ -2487,7 +2479,7 @@
         </w:tc>
         <w:tc>
           <w:tcPr>
-            <w:tcW w:w="5038" w:type="dxa"/>
+            <w:tcW w:w="4915" w:type="dxa"/>
             <w:tcBorders/>
             <w:vAlign w:val="center"/>
           </w:tcPr>
@@ -2507,7 +2499,7 @@
         </w:tc>
         <w:tc>
           <w:tcPr>
-            <w:tcW w:w="4359" w:type="dxa"/>
+            <w:tcW w:w="4386" w:type="dxa"/>
             <w:tcBorders/>
             <w:vAlign w:val="center"/>
           </w:tcPr>
@@ -2530,7 +2522,7 @@
         <w:trPr/>
         <w:tc>
           <w:tcPr>
-            <w:tcW w:w="1942" w:type="dxa"/>
+            <w:tcW w:w="2038" w:type="dxa"/>
             <w:tcBorders/>
             <w:vAlign w:val="center"/>
           </w:tcPr>
@@ -2550,7 +2542,7 @@
         </w:tc>
         <w:tc>
           <w:tcPr>
-            <w:tcW w:w="5038" w:type="dxa"/>
+            <w:tcW w:w="4915" w:type="dxa"/>
             <w:tcBorders/>
             <w:vAlign w:val="center"/>
           </w:tcPr>
@@ -2570,7 +2562,7 @@
         </w:tc>
         <w:tc>
           <w:tcPr>
-            <w:tcW w:w="4359" w:type="dxa"/>
+            <w:tcW w:w="4386" w:type="dxa"/>
             <w:tcBorders/>
             <w:vAlign w:val="center"/>
           </w:tcPr>
@@ -2593,7 +2585,7 @@
         <w:trPr/>
         <w:tc>
           <w:tcPr>
-            <w:tcW w:w="1942" w:type="dxa"/>
+            <w:tcW w:w="2038" w:type="dxa"/>
             <w:tcBorders/>
             <w:vAlign w:val="center"/>
           </w:tcPr>
@@ -2613,7 +2605,7 @@
         </w:tc>
         <w:tc>
           <w:tcPr>
-            <w:tcW w:w="5038" w:type="dxa"/>
+            <w:tcW w:w="4915" w:type="dxa"/>
             <w:tcBorders/>
             <w:vAlign w:val="center"/>
           </w:tcPr>
@@ -2633,7 +2625,7 @@
         </w:tc>
         <w:tc>
           <w:tcPr>
-            <w:tcW w:w="4359" w:type="dxa"/>
+            <w:tcW w:w="4386" w:type="dxa"/>
             <w:tcBorders/>
             <w:vAlign w:val="center"/>
           </w:tcPr>
@@ -2656,7 +2648,7 @@
         <w:trPr/>
         <w:tc>
           <w:tcPr>
-            <w:tcW w:w="1942" w:type="dxa"/>
+            <w:tcW w:w="2038" w:type="dxa"/>
             <w:tcBorders/>
             <w:vAlign w:val="center"/>
           </w:tcPr>
@@ -2676,7 +2668,7 @@
         </w:tc>
         <w:tc>
           <w:tcPr>
-            <w:tcW w:w="5038" w:type="dxa"/>
+            <w:tcW w:w="4915" w:type="dxa"/>
             <w:tcBorders/>
             <w:vAlign w:val="center"/>
           </w:tcPr>
@@ -2696,7 +2688,7 @@
         </w:tc>
         <w:tc>
           <w:tcPr>
-            <w:tcW w:w="4359" w:type="dxa"/>
+            <w:tcW w:w="4386" w:type="dxa"/>
             <w:tcBorders/>
             <w:vAlign w:val="center"/>
           </w:tcPr>
@@ -2719,7 +2711,7 @@
         <w:trPr/>
         <w:tc>
           <w:tcPr>
-            <w:tcW w:w="1942" w:type="dxa"/>
+            <w:tcW w:w="2038" w:type="dxa"/>
             <w:tcBorders/>
             <w:vAlign w:val="center"/>
           </w:tcPr>
@@ -2739,7 +2731,7 @@
         </w:tc>
         <w:tc>
           <w:tcPr>
-            <w:tcW w:w="5038" w:type="dxa"/>
+            <w:tcW w:w="4915" w:type="dxa"/>
             <w:tcBorders/>
             <w:vAlign w:val="center"/>
           </w:tcPr>
@@ -2759,7 +2751,7 @@
         </w:tc>
         <w:tc>
           <w:tcPr>
-            <w:tcW w:w="4359" w:type="dxa"/>
+            <w:tcW w:w="4386" w:type="dxa"/>
             <w:tcBorders/>
             <w:vAlign w:val="center"/>
           </w:tcPr>
@@ -2782,7 +2774,7 @@
         <w:trPr/>
         <w:tc>
           <w:tcPr>
-            <w:tcW w:w="1942" w:type="dxa"/>
+            <w:tcW w:w="2038" w:type="dxa"/>
             <w:tcBorders/>
             <w:vAlign w:val="center"/>
           </w:tcPr>
@@ -2802,7 +2794,7 @@
         </w:tc>
         <w:tc>
           <w:tcPr>
-            <w:tcW w:w="5038" w:type="dxa"/>
+            <w:tcW w:w="4915" w:type="dxa"/>
             <w:tcBorders/>
             <w:vAlign w:val="center"/>
           </w:tcPr>
@@ -2822,7 +2814,7 @@
         </w:tc>
         <w:tc>
           <w:tcPr>
-            <w:tcW w:w="4359" w:type="dxa"/>
+            <w:tcW w:w="4386" w:type="dxa"/>
             <w:tcBorders/>
             <w:vAlign w:val="center"/>
           </w:tcPr>
@@ -2845,7 +2837,7 @@
         <w:trPr/>
         <w:tc>
           <w:tcPr>
-            <w:tcW w:w="1942" w:type="dxa"/>
+            <w:tcW w:w="2038" w:type="dxa"/>
             <w:tcBorders/>
             <w:vAlign w:val="center"/>
           </w:tcPr>
@@ -2865,7 +2857,7 @@
         </w:tc>
         <w:tc>
           <w:tcPr>
-            <w:tcW w:w="5038" w:type="dxa"/>
+            <w:tcW w:w="4915" w:type="dxa"/>
             <w:tcBorders/>
             <w:vAlign w:val="center"/>
           </w:tcPr>
@@ -2885,7 +2877,7 @@
         </w:tc>
         <w:tc>
           <w:tcPr>
-            <w:tcW w:w="4359" w:type="dxa"/>
+            <w:tcW w:w="4386" w:type="dxa"/>
             <w:tcBorders/>
             <w:vAlign w:val="center"/>
           </w:tcPr>
@@ -2908,7 +2900,7 @@
         <w:trPr/>
         <w:tc>
           <w:tcPr>
-            <w:tcW w:w="1942" w:type="dxa"/>
+            <w:tcW w:w="2038" w:type="dxa"/>
             <w:tcBorders/>
             <w:vAlign w:val="center"/>
           </w:tcPr>
@@ -2928,7 +2920,7 @@
         </w:tc>
         <w:tc>
           <w:tcPr>
-            <w:tcW w:w="5038" w:type="dxa"/>
+            <w:tcW w:w="4915" w:type="dxa"/>
             <w:tcBorders/>
             <w:vAlign w:val="center"/>
           </w:tcPr>
@@ -2948,7 +2940,7 @@
         </w:tc>
         <w:tc>
           <w:tcPr>
-            <w:tcW w:w="4359" w:type="dxa"/>
+            <w:tcW w:w="4386" w:type="dxa"/>
             <w:tcBorders/>
             <w:vAlign w:val="center"/>
           </w:tcPr>
@@ -2971,7 +2963,7 @@
         <w:trPr/>
         <w:tc>
           <w:tcPr>
-            <w:tcW w:w="1942" w:type="dxa"/>
+            <w:tcW w:w="2038" w:type="dxa"/>
             <w:tcBorders/>
             <w:vAlign w:val="center"/>
           </w:tcPr>
@@ -2991,7 +2983,7 @@
         </w:tc>
         <w:tc>
           <w:tcPr>
-            <w:tcW w:w="5038" w:type="dxa"/>
+            <w:tcW w:w="4915" w:type="dxa"/>
             <w:tcBorders/>
             <w:vAlign w:val="center"/>
           </w:tcPr>
@@ -3011,7 +3003,7 @@
         </w:tc>
         <w:tc>
           <w:tcPr>
-            <w:tcW w:w="4359" w:type="dxa"/>
+            <w:tcW w:w="4386" w:type="dxa"/>
             <w:tcBorders/>
             <w:vAlign w:val="center"/>
           </w:tcPr>
@@ -3034,7 +3026,7 @@
         <w:trPr/>
         <w:tc>
           <w:tcPr>
-            <w:tcW w:w="1942" w:type="dxa"/>
+            <w:tcW w:w="2038" w:type="dxa"/>
             <w:tcBorders/>
             <w:vAlign w:val="center"/>
           </w:tcPr>
@@ -3054,7 +3046,7 @@
         </w:tc>
         <w:tc>
           <w:tcPr>
-            <w:tcW w:w="5038" w:type="dxa"/>
+            <w:tcW w:w="4915" w:type="dxa"/>
             <w:tcBorders/>
             <w:vAlign w:val="center"/>
           </w:tcPr>
@@ -3074,7 +3066,7 @@
         </w:tc>
         <w:tc>
           <w:tcPr>
-            <w:tcW w:w="4359" w:type="dxa"/>
+            <w:tcW w:w="4386" w:type="dxa"/>
             <w:tcBorders/>
             <w:vAlign w:val="center"/>
           </w:tcPr>
@@ -3097,7 +3089,7 @@
         <w:trPr/>
         <w:tc>
           <w:tcPr>
-            <w:tcW w:w="1942" w:type="dxa"/>
+            <w:tcW w:w="2038" w:type="dxa"/>
             <w:tcBorders/>
             <w:vAlign w:val="center"/>
           </w:tcPr>
@@ -3117,7 +3109,7 @@
         </w:tc>
         <w:tc>
           <w:tcPr>
-            <w:tcW w:w="5038" w:type="dxa"/>
+            <w:tcW w:w="4915" w:type="dxa"/>
             <w:tcBorders/>
             <w:vAlign w:val="center"/>
           </w:tcPr>
@@ -3137,7 +3129,7 @@
         </w:tc>
         <w:tc>
           <w:tcPr>
-            <w:tcW w:w="4359" w:type="dxa"/>
+            <w:tcW w:w="4386" w:type="dxa"/>
             <w:tcBorders/>
             <w:vAlign w:val="center"/>
           </w:tcPr>
@@ -3166,7 +3158,7 @@
       </w:pPr>
       <w:r>
         <w:rPr/>
-        <w:t>4. Skills: the know-how behind the commands</w:t>
+        <w:t>4. Skills: The Know-How Behind the Commands</w:t>
       </w:r>
     </w:p>
     <w:p>
@@ -3195,8 +3187,8 @@
         </w:tblCellMar>
       </w:tblPr>
       <w:tblGrid>
-        <w:gridCol w:w="3641"/>
-        <w:gridCol w:w="7698"/>
+        <w:gridCol w:w="3417"/>
+        <w:gridCol w:w="7922"/>
       </w:tblGrid>
       <w:tr>
         <w:trPr>
@@ -3204,7 +3196,7 @@
         </w:trPr>
         <w:tc>
           <w:tcPr>
-            <w:tcW w:w="3641" w:type="dxa"/>
+            <w:tcW w:w="3417" w:type="dxa"/>
             <w:tcBorders/>
             <w:vAlign w:val="center"/>
           </w:tcPr>
@@ -3226,7 +3218,7 @@
         </w:tc>
         <w:tc>
           <w:tcPr>
-            <w:tcW w:w="7698" w:type="dxa"/>
+            <w:tcW w:w="7922" w:type="dxa"/>
             <w:tcBorders/>
             <w:vAlign w:val="center"/>
           </w:tcPr>
@@ -3251,7 +3243,7 @@
         <w:trPr/>
         <w:tc>
           <w:tcPr>
-            <w:tcW w:w="3641" w:type="dxa"/>
+            <w:tcW w:w="3417" w:type="dxa"/>
             <w:tcBorders/>
             <w:vAlign w:val="center"/>
           </w:tcPr>
@@ -3271,7 +3263,7 @@
         </w:tc>
         <w:tc>
           <w:tcPr>
-            <w:tcW w:w="7698" w:type="dxa"/>
+            <w:tcW w:w="7922" w:type="dxa"/>
             <w:tcBorders/>
             <w:vAlign w:val="center"/>
           </w:tcPr>
@@ -3294,7 +3286,7 @@
         <w:trPr/>
         <w:tc>
           <w:tcPr>
-            <w:tcW w:w="3641" w:type="dxa"/>
+            <w:tcW w:w="3417" w:type="dxa"/>
             <w:tcBorders/>
             <w:vAlign w:val="center"/>
           </w:tcPr>
@@ -3314,7 +3306,7 @@
         </w:tc>
         <w:tc>
           <w:tcPr>
-            <w:tcW w:w="7698" w:type="dxa"/>
+            <w:tcW w:w="7922" w:type="dxa"/>
             <w:tcBorders/>
             <w:vAlign w:val="center"/>
           </w:tcPr>
@@ -3337,7 +3329,7 @@
         <w:trPr/>
         <w:tc>
           <w:tcPr>
-            <w:tcW w:w="3641" w:type="dxa"/>
+            <w:tcW w:w="3417" w:type="dxa"/>
             <w:tcBorders/>
             <w:vAlign w:val="center"/>
           </w:tcPr>
@@ -3357,7 +3349,7 @@
         </w:tc>
         <w:tc>
           <w:tcPr>
-            <w:tcW w:w="7698" w:type="dxa"/>
+            <w:tcW w:w="7922" w:type="dxa"/>
             <w:tcBorders/>
             <w:vAlign w:val="center"/>
           </w:tcPr>
@@ -3380,7 +3372,7 @@
         <w:trPr/>
         <w:tc>
           <w:tcPr>
-            <w:tcW w:w="3641" w:type="dxa"/>
+            <w:tcW w:w="3417" w:type="dxa"/>
             <w:tcBorders/>
             <w:vAlign w:val="center"/>
           </w:tcPr>
@@ -3400,7 +3392,7 @@
         </w:tc>
         <w:tc>
           <w:tcPr>
-            <w:tcW w:w="7698" w:type="dxa"/>
+            <w:tcW w:w="7922" w:type="dxa"/>
             <w:tcBorders/>
             <w:vAlign w:val="center"/>
           </w:tcPr>
@@ -3423,7 +3415,7 @@
         <w:trPr/>
         <w:tc>
           <w:tcPr>
-            <w:tcW w:w="3641" w:type="dxa"/>
+            <w:tcW w:w="3417" w:type="dxa"/>
             <w:tcBorders/>
             <w:vAlign w:val="center"/>
           </w:tcPr>
@@ -3443,7 +3435,7 @@
         </w:tc>
         <w:tc>
           <w:tcPr>
-            <w:tcW w:w="7698" w:type="dxa"/>
+            <w:tcW w:w="7922" w:type="dxa"/>
             <w:tcBorders/>
             <w:vAlign w:val="center"/>
           </w:tcPr>
@@ -3466,7 +3458,7 @@
         <w:trPr/>
         <w:tc>
           <w:tcPr>
-            <w:tcW w:w="3641" w:type="dxa"/>
+            <w:tcW w:w="3417" w:type="dxa"/>
             <w:tcBorders/>
             <w:vAlign w:val="center"/>
           </w:tcPr>
@@ -3486,7 +3478,7 @@
         </w:tc>
         <w:tc>
           <w:tcPr>
-            <w:tcW w:w="7698" w:type="dxa"/>
+            <w:tcW w:w="7922" w:type="dxa"/>
             <w:tcBorders/>
             <w:vAlign w:val="center"/>
           </w:tcPr>
@@ -3509,7 +3501,7 @@
         <w:trPr/>
         <w:tc>
           <w:tcPr>
-            <w:tcW w:w="3641" w:type="dxa"/>
+            <w:tcW w:w="3417" w:type="dxa"/>
             <w:tcBorders/>
             <w:vAlign w:val="center"/>
           </w:tcPr>
@@ -3529,21 +3521,31 @@
         </w:tc>
         <w:tc>
           <w:tcPr>
-            <w:tcW w:w="7698" w:type="dxa"/>
-            <w:tcBorders/>
-            <w:vAlign w:val="center"/>
-          </w:tcPr>
-          <w:p>
-            <w:pPr>
-              <w:pStyle w:val="TableContents"/>
-              <w:bidi w:val="0"/>
-              <w:spacing w:before="120" w:after="120"/>
-              <w:jc w:val="left"/>
-              <w:rPr/>
-            </w:pPr>
-            <w:r>
-              <w:rPr/>
-              <w:t>The change-request template; document style for anything handed to a human; community practices for Claude Code; discovering skills from the open ecosystem.</w:t>
+            <w:tcW w:w="7922" w:type="dxa"/>
+            <w:tcBorders/>
+            <w:vAlign w:val="center"/>
+          </w:tcPr>
+          <w:p>
+            <w:pPr>
+              <w:pStyle w:val="TableContents"/>
+              <w:bidi w:val="0"/>
+              <w:spacing w:before="120" w:after="120"/>
+              <w:jc w:val="left"/>
+              <w:rPr/>
+            </w:pPr>
+            <w:r>
+              <w:rPr/>
+              <w:t xml:space="preserve">The change-request template; document style for anything handed to a human, including how HTML routes through </w:t>
+            </w:r>
+            <w:r>
+              <w:rPr>
+                <w:rStyle w:val="SourceText"/>
+              </w:rPr>
+              <w:t>doc-builder</w:t>
+            </w:r>
+            <w:r>
+              <w:rPr/>
+              <w:t>; community practices for Claude Code; discovering skills from the open ecosystem.</w:t>
             </w:r>
           </w:p>
         </w:tc>
@@ -3558,7 +3560,7 @@
       </w:pPr>
       <w:r>
         <w:rPr/>
-        <w:t>5. Safety: the gates and guards</w:t>
+        <w:t>5. Safety: The Gates and Guards</w:t>
       </w:r>
     </w:p>
     <w:p>
@@ -3597,9 +3599,9 @@
         </w:tblCellMar>
       </w:tblPr>
       <w:tblGrid>
-        <w:gridCol w:w="2301"/>
-        <w:gridCol w:w="5726"/>
-        <w:gridCol w:w="3312"/>
+        <w:gridCol w:w="2334"/>
+        <w:gridCol w:w="5649"/>
+        <w:gridCol w:w="3356"/>
       </w:tblGrid>
       <w:tr>
         <w:trPr>
@@ -3607,7 +3609,7 @@
         </w:trPr>
         <w:tc>
           <w:tcPr>
-            <w:tcW w:w="2301" w:type="dxa"/>
+            <w:tcW w:w="2334" w:type="dxa"/>
             <w:tcBorders/>
             <w:vAlign w:val="center"/>
           </w:tcPr>
@@ -3629,7 +3631,7 @@
         </w:tc>
         <w:tc>
           <w:tcPr>
-            <w:tcW w:w="5726" w:type="dxa"/>
+            <w:tcW w:w="5649" w:type="dxa"/>
             <w:tcBorders/>
             <w:vAlign w:val="center"/>
           </w:tcPr>
@@ -3651,7 +3653,7 @@
         </w:tc>
         <w:tc>
           <w:tcPr>
-            <w:tcW w:w="3312" w:type="dxa"/>
+            <w:tcW w:w="3356" w:type="dxa"/>
             <w:tcBorders/>
             <w:vAlign w:val="center"/>
           </w:tcPr>
@@ -3676,7 +3678,7 @@
         <w:trPr/>
         <w:tc>
           <w:tcPr>
-            <w:tcW w:w="2301" w:type="dxa"/>
+            <w:tcW w:w="2334" w:type="dxa"/>
             <w:tcBorders/>
             <w:vAlign w:val="center"/>
           </w:tcPr>
@@ -3696,7 +3698,7 @@
         </w:tc>
         <w:tc>
           <w:tcPr>
-            <w:tcW w:w="5726" w:type="dxa"/>
+            <w:tcW w:w="5649" w:type="dxa"/>
             <w:tcBorders/>
             <w:vAlign w:val="center"/>
           </w:tcPr>
@@ -3716,7 +3718,7 @@
         </w:tc>
         <w:tc>
           <w:tcPr>
-            <w:tcW w:w="3312" w:type="dxa"/>
+            <w:tcW w:w="3356" w:type="dxa"/>
             <w:tcBorders/>
             <w:vAlign w:val="center"/>
           </w:tcPr>
@@ -3739,7 +3741,7 @@
         <w:trPr/>
         <w:tc>
           <w:tcPr>
-            <w:tcW w:w="2301" w:type="dxa"/>
+            <w:tcW w:w="2334" w:type="dxa"/>
             <w:tcBorders/>
             <w:vAlign w:val="center"/>
           </w:tcPr>
@@ -3759,7 +3761,7 @@
         </w:tc>
         <w:tc>
           <w:tcPr>
-            <w:tcW w:w="5726" w:type="dxa"/>
+            <w:tcW w:w="5649" w:type="dxa"/>
             <w:tcBorders/>
             <w:vAlign w:val="center"/>
           </w:tcPr>
@@ -3799,7 +3801,7 @@
         </w:tc>
         <w:tc>
           <w:tcPr>
-            <w:tcW w:w="3312" w:type="dxa"/>
+            <w:tcW w:w="3356" w:type="dxa"/>
             <w:tcBorders/>
             <w:vAlign w:val="center"/>
           </w:tcPr>
@@ -3822,27 +3824,27 @@
         <w:trPr/>
         <w:tc>
           <w:tcPr>
-            <w:tcW w:w="2301" w:type="dxa"/>
-            <w:tcBorders/>
-            <w:vAlign w:val="center"/>
-          </w:tcPr>
-          <w:p>
-            <w:pPr>
-              <w:pStyle w:val="TableContents"/>
-              <w:bidi w:val="0"/>
-              <w:spacing w:before="120" w:after="120"/>
-              <w:jc w:val="left"/>
-              <w:rPr/>
-            </w:pPr>
-            <w:r>
-              <w:rPr/>
-              <w:t>Before a file write (new in 0.19.92)</w:t>
-            </w:r>
-          </w:p>
-        </w:tc>
-        <w:tc>
-          <w:tcPr>
-            <w:tcW w:w="5726" w:type="dxa"/>
+            <w:tcW w:w="2334" w:type="dxa"/>
+            <w:tcBorders/>
+            <w:vAlign w:val="center"/>
+          </w:tcPr>
+          <w:p>
+            <w:pPr>
+              <w:pStyle w:val="TableContents"/>
+              <w:bidi w:val="0"/>
+              <w:spacing w:before="120" w:after="120"/>
+              <w:jc w:val="left"/>
+              <w:rPr/>
+            </w:pPr>
+            <w:r>
+              <w:rPr/>
+              <w:t>Before a file write</w:t>
+            </w:r>
+          </w:p>
+        </w:tc>
+        <w:tc>
+          <w:tcPr>
+            <w:tcW w:w="5649" w:type="dxa"/>
             <w:tcBorders/>
             <w:vAlign w:val="center"/>
           </w:tcPr>
@@ -3862,7 +3864,7 @@
         </w:tc>
         <w:tc>
           <w:tcPr>
-            <w:tcW w:w="3312" w:type="dxa"/>
+            <w:tcW w:w="3356" w:type="dxa"/>
             <w:tcBorders/>
             <w:vAlign w:val="center"/>
           </w:tcPr>
@@ -3885,7 +3887,7 @@
         <w:trPr/>
         <w:tc>
           <w:tcPr>
-            <w:tcW w:w="2301" w:type="dxa"/>
+            <w:tcW w:w="2334" w:type="dxa"/>
             <w:tcBorders/>
             <w:vAlign w:val="center"/>
           </w:tcPr>
@@ -3905,7 +3907,7 @@
         </w:tc>
         <w:tc>
           <w:tcPr>
-            <w:tcW w:w="5726" w:type="dxa"/>
+            <w:tcW w:w="5649" w:type="dxa"/>
             <w:tcBorders/>
             <w:vAlign w:val="center"/>
           </w:tcPr>
@@ -3925,7 +3927,7 @@
         </w:tc>
         <w:tc>
           <w:tcPr>
-            <w:tcW w:w="3312" w:type="dxa"/>
+            <w:tcW w:w="3356" w:type="dxa"/>
             <w:tcBorders/>
             <w:vAlign w:val="center"/>
           </w:tcPr>
@@ -3948,7 +3950,7 @@
         <w:trPr/>
         <w:tc>
           <w:tcPr>
-            <w:tcW w:w="2301" w:type="dxa"/>
+            <w:tcW w:w="2334" w:type="dxa"/>
             <w:tcBorders/>
             <w:vAlign w:val="center"/>
           </w:tcPr>
@@ -3968,7 +3970,7 @@
         </w:tc>
         <w:tc>
           <w:tcPr>
-            <w:tcW w:w="5726" w:type="dxa"/>
+            <w:tcW w:w="5649" w:type="dxa"/>
             <w:tcBorders/>
             <w:vAlign w:val="center"/>
           </w:tcPr>
@@ -3988,7 +3990,7 @@
         </w:tc>
         <w:tc>
           <w:tcPr>
-            <w:tcW w:w="3312" w:type="dxa"/>
+            <w:tcW w:w="3356" w:type="dxa"/>
             <w:tcBorders/>
             <w:vAlign w:val="center"/>
           </w:tcPr>
@@ -4011,7 +4013,7 @@
         <w:trPr/>
         <w:tc>
           <w:tcPr>
-            <w:tcW w:w="2301" w:type="dxa"/>
+            <w:tcW w:w="2334" w:type="dxa"/>
             <w:tcBorders/>
             <w:vAlign w:val="center"/>
           </w:tcPr>
@@ -4031,41 +4033,41 @@
         </w:tc>
         <w:tc>
           <w:tcPr>
-            <w:tcW w:w="5726" w:type="dxa"/>
-            <w:tcBorders/>
-            <w:vAlign w:val="center"/>
-          </w:tcPr>
-          <w:p>
-            <w:pPr>
-              <w:pStyle w:val="TableContents"/>
-              <w:bidi w:val="0"/>
-              <w:spacing w:before="120" w:after="120"/>
-              <w:jc w:val="left"/>
-              <w:rPr/>
-            </w:pPr>
-            <w:r>
-              <w:rPr/>
-              <w:t>Runs the verification map for the files that changed; blocks the turn on failure.</w:t>
-            </w:r>
-          </w:p>
-        </w:tc>
-        <w:tc>
-          <w:tcPr>
-            <w:tcW w:w="3312" w:type="dxa"/>
-            <w:tcBorders/>
-            <w:vAlign w:val="center"/>
-          </w:tcPr>
-          <w:p>
-            <w:pPr>
-              <w:pStyle w:val="TableContents"/>
-              <w:bidi w:val="0"/>
-              <w:spacing w:before="120" w:after="120"/>
-              <w:jc w:val="left"/>
-              <w:rPr/>
-            </w:pPr>
-            <w:r>
-              <w:rPr/>
-              <w:t>The safety net under every change. Section 8 is about fixing it.</w:t>
+            <w:tcW w:w="5649" w:type="dxa"/>
+            <w:tcBorders/>
+            <w:vAlign w:val="center"/>
+          </w:tcPr>
+          <w:p>
+            <w:pPr>
+              <w:pStyle w:val="TableContents"/>
+              <w:bidi w:val="0"/>
+              <w:spacing w:before="120" w:after="120"/>
+              <w:jc w:val="left"/>
+              <w:rPr/>
+            </w:pPr>
+            <w:r>
+              <w:rPr/>
+              <w:t>Runs the verification map for the files that changed; blocks the turn on failure; now keeps the per-rule record even when one rule in the batch fails.</w:t>
+            </w:r>
+          </w:p>
+        </w:tc>
+        <w:tc>
+          <w:tcPr>
+            <w:tcW w:w="3356" w:type="dxa"/>
+            <w:tcBorders/>
+            <w:vAlign w:val="center"/>
+          </w:tcPr>
+          <w:p>
+            <w:pPr>
+              <w:pStyle w:val="TableContents"/>
+              <w:bidi w:val="0"/>
+              <w:spacing w:before="120" w:after="120"/>
+              <w:jc w:val="left"/>
+              <w:rPr/>
+            </w:pPr>
+            <w:r>
+              <w:rPr/>
+              <w:t>The safety net under every change, and no longer all-or-nothing.</w:t>
             </w:r>
           </w:p>
         </w:tc>
@@ -4134,7 +4136,7 @@
       </w:pPr>
       <w:r>
         <w:rPr/>
-        <w:t>6. Knowledge: what crew remembers, and where</w:t>
+        <w:t>6. Knowledge: What Crew Remembers, and Where</w:t>
       </w:r>
     </w:p>
     <w:p>
@@ -4347,7 +4349,7 @@
       </w:pPr>
       <w:r>
         <w:rPr/>
-        <w:t>7. What changed this week, and what it means</w:t>
+        <w:t>7. What Changed Recently, and What It Means</w:t>
       </w:r>
     </w:p>
     <w:p>
@@ -4359,17 +4361,27 @@
       </w:pPr>
       <w:r>
         <w:rPr/>
-        <w:t xml:space="preserve">Between 19 and 20 September, crew moved from 0.19.89 to 0.19.92 on </w:t>
+        <w:t xml:space="preserve">Crew is at 0.20.11. The most recent fix, recorded in </w:t>
       </w:r>
       <w:r>
         <w:rPr>
           <w:rStyle w:val="SourceText"/>
         </w:rPr>
-        <w:t>main</w:t>
-      </w:r>
-      <w:r>
-        <w:rPr/>
-        <w:t>, with 0.19.93 in review. Each change is the result of a root-cause finding, and each was reviewed by Codex across several rounds before merging.</w:t>
+        <w:t>CHANGELOG.md</w:t>
+      </w:r>
+      <w:r>
+        <w:rPr/>
+        <w:t xml:space="preserve">'s </w:t>
+      </w:r>
+      <w:r>
+        <w:rPr>
+          <w:rStyle w:val="SourceText"/>
+        </w:rPr>
+        <w:t>[Unreleased]</w:t>
+      </w:r>
+      <w:r>
+        <w:rPr/>
+        <w:t xml:space="preserve"> section, closes three problems in the Stop gate and the PM in one pass.</w:t>
       </w:r>
     </w:p>
     <w:tbl>
@@ -4386,9 +4398,8 @@
         </w:tblCellMar>
       </w:tblPr>
       <w:tblGrid>
-        <w:gridCol w:w="1038"/>
-        <w:gridCol w:w="5981"/>
-        <w:gridCol w:w="4320"/>
+        <w:gridCol w:w="2685"/>
+        <w:gridCol w:w="8654"/>
       </w:tblGrid>
       <w:tr>
         <w:trPr>
@@ -4396,7 +4407,7 @@
         </w:trPr>
         <w:tc>
           <w:tcPr>
-            <w:tcW w:w="1038" w:type="dxa"/>
+            <w:tcW w:w="2685" w:type="dxa"/>
             <w:tcBorders/>
             <w:vAlign w:val="center"/>
           </w:tcPr>
@@ -4412,13 +4423,13 @@
             </w:pPr>
             <w:r>
               <w:rPr/>
-              <w:t>Version</w:t>
-            </w:r>
-          </w:p>
-        </w:tc>
-        <w:tc>
-          <w:tcPr>
-            <w:tcW w:w="5981" w:type="dxa"/>
+              <w:t>Change</w:t>
+            </w:r>
+          </w:p>
+        </w:tc>
+        <w:tc>
+          <w:tcPr>
+            <w:tcW w:w="8654" w:type="dxa"/>
             <w:tcBorders/>
             <w:vAlign w:val="center"/>
           </w:tcPr>
@@ -4434,28 +4445,6 @@
             </w:pPr>
             <w:r>
               <w:rPr/>
-              <w:t>Change</w:t>
-            </w:r>
-          </w:p>
-        </w:tc>
-        <w:tc>
-          <w:tcPr>
-            <w:tcW w:w="4320" w:type="dxa"/>
-            <w:tcBorders/>
-            <w:vAlign w:val="center"/>
-          </w:tcPr>
-          <w:p>
-            <w:pPr>
-              <w:pStyle w:val="TableHeading"/>
-              <w:suppressLineNumbers/>
-              <w:shd w:fill="1F4E79" w:val="clear"/>
-              <w:bidi w:val="0"/>
-              <w:spacing w:before="120" w:after="120"/>
-              <w:jc w:val="left"/>
-              <w:rPr/>
-            </w:pPr>
-            <w:r>
-              <w:rPr/>
               <w:t>What it means for you</w:t>
             </w:r>
           </w:p>
@@ -4465,283 +4454,283 @@
         <w:trPr/>
         <w:tc>
           <w:tcPr>
-            <w:tcW w:w="1038" w:type="dxa"/>
-            <w:tcBorders/>
-            <w:vAlign w:val="center"/>
-          </w:tcPr>
-          <w:p>
-            <w:pPr>
-              <w:pStyle w:val="TableContents"/>
-              <w:bidi w:val="0"/>
-              <w:spacing w:before="120" w:after="120"/>
-              <w:jc w:val="left"/>
-              <w:rPr/>
-            </w:pPr>
-            <w:r>
-              <w:rPr/>
-              <w:t>0.19.90</w:t>
-            </w:r>
-          </w:p>
-        </w:tc>
-        <w:tc>
-          <w:tcPr>
-            <w:tcW w:w="5981" w:type="dxa"/>
-            <w:tcBorders/>
-            <w:vAlign w:val="center"/>
-          </w:tcPr>
-          <w:p>
-            <w:pPr>
-              <w:pStyle w:val="TableContents"/>
-              <w:bidi w:val="0"/>
-              <w:spacing w:before="120" w:after="120"/>
-              <w:jc w:val="left"/>
-              <w:rPr/>
-            </w:pPr>
-            <w:r>
-              <w:rPr>
-                <w:b/>
-              </w:rPr>
-              <w:t>The idle rule, in both directions.</w:t>
-            </w:r>
-            <w:r>
-              <w:rPr/>
-              <w:t xml:space="preserve"> Every role that runs a check runs it in the foreground and never ends its turn waiting on a background task, because a finished agent is never woken. The PM learns the other half: an idle signal is not proof a role stopped; check the workspace's file times against the clock and escalate rather than restart.</w:t>
-            </w:r>
-          </w:p>
-        </w:tc>
-        <w:tc>
-          <w:tcPr>
-            <w:tcW w:w="4320" w:type="dxa"/>
-            <w:tcBorders/>
-            <w:vAlign w:val="center"/>
-          </w:tcPr>
-          <w:p>
-            <w:pPr>
-              <w:pStyle w:val="TableContents"/>
-              <w:bidi w:val="0"/>
-              <w:spacing w:before="120" w:after="120"/>
-              <w:jc w:val="left"/>
-              <w:rPr/>
-            </w:pPr>
-            <w:r>
-              <w:rPr/>
-              <w:t>Three agents in one night had stalled forever "waiting for a notification". That cannot happen now, and the manager will not throw away live work by restarting it.</w:t>
-            </w:r>
-          </w:p>
-        </w:tc>
-      </w:tr>
-      <w:tr>
-        <w:trPr/>
-        <w:tc>
-          <w:tcPr>
-            <w:tcW w:w="1038" w:type="dxa"/>
-            <w:tcBorders/>
-            <w:vAlign w:val="center"/>
-          </w:tcPr>
-          <w:p>
-            <w:pPr>
-              <w:pStyle w:val="TableContents"/>
-              <w:bidi w:val="0"/>
-              <w:spacing w:before="120" w:after="120"/>
-              <w:jc w:val="left"/>
-              <w:rPr/>
-            </w:pPr>
-            <w:r>
-              <w:rPr/>
-              <w:t>0.19.91</w:t>
-            </w:r>
-          </w:p>
-        </w:tc>
-        <w:tc>
-          <w:tcPr>
-            <w:tcW w:w="5981" w:type="dxa"/>
-            <w:tcBorders/>
-            <w:vAlign w:val="center"/>
-          </w:tcPr>
-          <w:p>
-            <w:pPr>
-              <w:pStyle w:val="TableContents"/>
-              <w:bidi w:val="0"/>
-              <w:spacing w:before="120" w:after="120"/>
-              <w:jc w:val="left"/>
-              <w:rPr/>
-            </w:pPr>
-            <w:r>
-              <w:rPr>
-                <w:b/>
-              </w:rPr>
-              <w:t>A behaviour eval suite.</w:t>
-            </w:r>
-            <w:r>
-              <w:rPr/>
-              <w:t xml:space="preserve"> Five live tests, each tempting one documented rule, graded by structure rather than by a judge model. A matched pair of runner scripts and a CI workflow that skips visibly without an API key.</w:t>
-            </w:r>
-          </w:p>
-        </w:tc>
-        <w:tc>
-          <w:tcPr>
-            <w:tcW w:w="4320" w:type="dxa"/>
-            <w:tcBorders/>
-            <w:vAlign w:val="center"/>
-          </w:tcPr>
-          <w:p>
-            <w:pPr>
-              <w:pStyle w:val="TableContents"/>
-              <w:bidi w:val="0"/>
-              <w:spacing w:before="120" w:after="120"/>
-              <w:jc w:val="left"/>
-              <w:rPr/>
-            </w:pPr>
-            <w:r>
-              <w:rPr/>
-              <w:t>The rules are tested against a real model, not just read. The first run caught the PM writing code itself.</w:t>
-            </w:r>
-          </w:p>
-        </w:tc>
-      </w:tr>
-      <w:tr>
-        <w:trPr/>
-        <w:tc>
-          <w:tcPr>
-            <w:tcW w:w="1038" w:type="dxa"/>
-            <w:tcBorders/>
-            <w:vAlign w:val="center"/>
-          </w:tcPr>
-          <w:p>
-            <w:pPr>
-              <w:pStyle w:val="TableContents"/>
-              <w:bidi w:val="0"/>
-              <w:spacing w:before="120" w:after="120"/>
-              <w:jc w:val="left"/>
-              <w:rPr/>
-            </w:pPr>
-            <w:r>
-              <w:rPr/>
-              <w:t>0.19.92</w:t>
-            </w:r>
-          </w:p>
-        </w:tc>
-        <w:tc>
-          <w:tcPr>
-            <w:tcW w:w="5981" w:type="dxa"/>
-            <w:tcBorders/>
-            <w:vAlign w:val="center"/>
-          </w:tcPr>
-          <w:p>
-            <w:pPr>
-              <w:pStyle w:val="TableContents"/>
-              <w:bidi w:val="0"/>
-              <w:spacing w:before="120" w:after="120"/>
-              <w:jc w:val="left"/>
-              <w:rPr/>
-            </w:pPr>
-            <w:r>
-              <w:rPr>
-                <w:b/>
-              </w:rPr>
-              <w:t>The role write guard.</w:t>
-            </w:r>
-            <w:r>
-              <w:rPr/>
-              <w:t xml:space="preserve"> A hook that enforces each role's write scope from its own definition. Off by default; the strictest setting is the floor once enabled. Corrupt configuration forces the strict setting. Paths are resolved through symlinks and junctions with each operating system's own ordering.</w:t>
-            </w:r>
-          </w:p>
-        </w:tc>
-        <w:tc>
-          <w:tcPr>
-            <w:tcW w:w="4320" w:type="dxa"/>
-            <w:tcBorders/>
-            <w:vAlign w:val="center"/>
-          </w:tcPr>
-          <w:p>
-            <w:pPr>
-              <w:pStyle w:val="TableContents"/>
-              <w:bidi w:val="0"/>
-              <w:spacing w:before="120" w:after="120"/>
-              <w:jc w:val="left"/>
-              <w:rPr/>
-            </w:pPr>
-            <w:r>
-              <w:rPr/>
-              <w:t xml:space="preserve">Prose said the PM must not write code, and it did anyway for four hours. Now the tool refuses. Enable it per repository with </w:t>
+            <w:tcW w:w="2685" w:type="dxa"/>
+            <w:tcBorders/>
+            <w:vAlign w:val="center"/>
+          </w:tcPr>
+          <w:p>
+            <w:pPr>
+              <w:pStyle w:val="TableContents"/>
+              <w:bidi w:val="0"/>
+              <w:spacing w:before="120" w:after="120"/>
+              <w:jc w:val="left"/>
+              <w:rPr/>
+            </w:pPr>
+            <w:r>
+              <w:rPr/>
+              <w:t>The Stop gate kept no evidence when one rule failed.</w:t>
+            </w:r>
+          </w:p>
+        </w:tc>
+        <w:tc>
+          <w:tcPr>
+            <w:tcW w:w="8654" w:type="dxa"/>
+            <w:tcBorders/>
+            <w:vAlign w:val="center"/>
+          </w:tcPr>
+          <w:p>
+            <w:pPr>
+              <w:pStyle w:val="TableContents"/>
+              <w:bidi w:val="0"/>
+              <w:spacing w:before="120" w:after="120"/>
+              <w:jc w:val="left"/>
+              <w:rPr/>
+            </w:pPr>
+            <w:r>
+              <w:rPr/>
+              <w:t>Before: a single failing check discarded the passing record of every other check that turn, so the next turn re-verified everything. Now: each rule's own outcome is recorded on its own, and only the rule that actually failed is left unrecorded.</w:t>
+            </w:r>
+          </w:p>
+        </w:tc>
+      </w:tr>
+      <w:tr>
+        <w:trPr/>
+        <w:tc>
+          <w:tcPr>
+            <w:tcW w:w="2685" w:type="dxa"/>
+            <w:tcBorders/>
+            <w:vAlign w:val="center"/>
+          </w:tcPr>
+          <w:p>
+            <w:pPr>
+              <w:pStyle w:val="TableContents"/>
+              <w:bidi w:val="0"/>
+              <w:spacing w:before="120" w:after="120"/>
+              <w:jc w:val="left"/>
+              <w:rPr/>
+            </w:pPr>
+            <w:r>
+              <w:rPr/>
+              <w:t xml:space="preserve">A Git Bash </w:t>
             </w:r>
             <w:r>
               <w:rPr>
                 <w:rStyle w:val="SourceText"/>
               </w:rPr>
-              <w:t>guards.roleWrites: block</w:t>
-            </w:r>
-            <w:r>
-              <w:rPr/>
-              <w:t>.</w:t>
-            </w:r>
-          </w:p>
-        </w:tc>
-      </w:tr>
-      <w:tr>
-        <w:trPr/>
-        <w:tc>
-          <w:tcPr>
-            <w:tcW w:w="1038" w:type="dxa"/>
-            <w:tcBorders/>
-            <w:vAlign w:val="center"/>
-          </w:tcPr>
-          <w:p>
-            <w:pPr>
-              <w:pStyle w:val="TableContents"/>
-              <w:bidi w:val="0"/>
-              <w:spacing w:before="120" w:after="120"/>
-              <w:jc w:val="left"/>
-              <w:rPr/>
-            </w:pPr>
-            <w:r>
-              <w:rPr/>
-              <w:t>also merged</w:t>
-            </w:r>
-          </w:p>
-        </w:tc>
-        <w:tc>
-          <w:tcPr>
-            <w:tcW w:w="5981" w:type="dxa"/>
-            <w:tcBorders/>
-            <w:vAlign w:val="center"/>
-          </w:tcPr>
-          <w:p>
-            <w:pPr>
-              <w:pStyle w:val="TableContents"/>
-              <w:bidi w:val="0"/>
-              <w:spacing w:before="120" w:after="120"/>
-              <w:jc w:val="left"/>
-              <w:rPr/>
-            </w:pPr>
-            <w:r>
-              <w:rPr/>
-              <w:t>Frontmatter across all 54 agents and every command is parsed as YAML by the marketplace check, after four command files were found to load with no frontmatter at all. All 21 verification rules in this repository are priced.</w:t>
-            </w:r>
-          </w:p>
-        </w:tc>
-        <w:tc>
-          <w:tcPr>
-            <w:tcW w:w="4320" w:type="dxa"/>
-            <w:tcBorders/>
-            <w:vAlign w:val="center"/>
-          </w:tcPr>
-          <w:p>
-            <w:pPr>
-              <w:pStyle w:val="TableContents"/>
-              <w:bidi w:val="0"/>
-              <w:spacing w:before="120" w:after="120"/>
-              <w:jc w:val="left"/>
-              <w:rPr/>
-            </w:pPr>
-            <w:r>
-              <w:rPr/>
-              <w:t>Silent breakage in the definitions is now a failing check, and the Stop budget can defer instead of running everything.</w:t>
+              <w:t>python3</w:t>
+            </w:r>
+            <w:r>
+              <w:rPr/>
+              <w:t xml:space="preserve"> landmine reached the gate and three hooks.</w:t>
+            </w:r>
+          </w:p>
+        </w:tc>
+        <w:tc>
+          <w:tcPr>
+            <w:tcW w:w="8654" w:type="dxa"/>
+            <w:tcBorders/>
+            <w:vAlign w:val="center"/>
+          </w:tcPr>
+          <w:p>
+            <w:pPr>
+              <w:pStyle w:val="TableContents"/>
+              <w:bidi w:val="0"/>
+              <w:spacing w:before="120" w:after="120"/>
+              <w:jc w:val="left"/>
+              <w:rPr/>
+            </w:pPr>
+            <w:r>
+              <w:rPr/>
+              <w:t xml:space="preserve">The gate now builds a </w:t>
+            </w:r>
+            <w:r>
+              <w:rPr>
+                <w:rStyle w:val="SourceText"/>
+              </w:rPr>
+              <w:t>python3</w:t>
+            </w:r>
+            <w:r>
+              <w:rPr/>
+              <w:t xml:space="preserve"> shim from a proved resolver only when </w:t>
+            </w:r>
+            <w:r>
+              <w:rPr>
+                <w:rStyle w:val="SourceText"/>
+              </w:rPr>
+              <w:t>python3</w:t>
+            </w:r>
+            <w:r>
+              <w:rPr/>
+              <w:t xml:space="preserve"> is genuinely absent, never shadowing </w:t>
+            </w:r>
+            <w:r>
+              <w:rPr>
+                <w:rStyle w:val="SourceText"/>
+              </w:rPr>
+              <w:t>python</w:t>
+            </w:r>
+            <w:r>
+              <w:rPr/>
+              <w:t xml:space="preserve"> or </w:t>
+            </w:r>
+            <w:r>
+              <w:rPr>
+                <w:rStyle w:val="SourceText"/>
+              </w:rPr>
+              <w:t>py</w:t>
+            </w:r>
+            <w:r>
+              <w:rPr/>
+              <w:t xml:space="preserve">, and fails closed with a remediation hint when nothing resolves. </w:t>
+            </w:r>
+            <w:r>
+              <w:rPr>
+                <w:rStyle w:val="SourceText"/>
+              </w:rPr>
+              <w:t>context-watch</w:t>
+            </w:r>
+            <w:r>
+              <w:rPr/>
+              <w:t xml:space="preserve">, </w:t>
+            </w:r>
+            <w:r>
+              <w:rPr>
+                <w:rStyle w:val="SourceText"/>
+              </w:rPr>
+              <w:t>pm-brief</w:t>
+            </w:r>
+            <w:r>
+              <w:rPr/>
+              <w:t xml:space="preserve"> and </w:t>
+            </w:r>
+            <w:r>
+              <w:rPr>
+                <w:rStyle w:val="SourceText"/>
+              </w:rPr>
+              <w:t>platform-sync</w:t>
+            </w:r>
+            <w:r>
+              <w:rPr/>
+              <w:t xml:space="preserve"> go through the same strict resolver.</w:t>
+            </w:r>
+          </w:p>
+        </w:tc>
+      </w:tr>
+      <w:tr>
+        <w:trPr/>
+        <w:tc>
+          <w:tcPr>
+            <w:tcW w:w="2685" w:type="dxa"/>
+            <w:tcBorders/>
+            <w:vAlign w:val="center"/>
+          </w:tcPr>
+          <w:p>
+            <w:pPr>
+              <w:pStyle w:val="TableContents"/>
+              <w:bidi w:val="0"/>
+              <w:spacing w:before="120" w:after="120"/>
+              <w:jc w:val="left"/>
+              <w:rPr/>
+            </w:pPr>
+            <w:r>
+              <w:rPr/>
+              <w:t>The PM read project state once per pass, not once per decision.</w:t>
+            </w:r>
+          </w:p>
+        </w:tc>
+        <w:tc>
+          <w:tcPr>
+            <w:tcW w:w="8654" w:type="dxa"/>
+            <w:tcBorders/>
+            <w:vAlign w:val="center"/>
+          </w:tcPr>
+          <w:p>
+            <w:pPr>
+              <w:pStyle w:val="TableContents"/>
+              <w:bidi w:val="0"/>
+              <w:spacing w:before="120" w:after="120"/>
+              <w:jc w:val="left"/>
+              <w:rPr/>
+            </w:pPr>
+            <w:r>
+              <w:rPr/>
+              <w:t xml:space="preserve">It now re-reads </w:t>
+            </w:r>
+            <w:r>
+              <w:rPr>
+                <w:rStyle w:val="SourceText"/>
+              </w:rPr>
+              <w:t>crew_state.py</w:t>
+            </w:r>
+            <w:r>
+              <w:rPr/>
+              <w:t>'s output plus HEAD, branch and working-tree status before every dispatch, and checks its own HEAD position again on every return, so a backward, sideways or foreign-forward HEAD is reported rather than missed.</w:t>
+            </w:r>
+          </w:p>
+        </w:tc>
+      </w:tr>
+      <w:tr>
+        <w:trPr/>
+        <w:tc>
+          <w:tcPr>
+            <w:tcW w:w="2685" w:type="dxa"/>
+            <w:tcBorders/>
+            <w:vAlign w:val="center"/>
+          </w:tcPr>
+          <w:p>
+            <w:pPr>
+              <w:pStyle w:val="TableContents"/>
+              <w:bidi w:val="0"/>
+              <w:spacing w:before="120" w:after="120"/>
+              <w:jc w:val="left"/>
+              <w:rPr/>
+            </w:pPr>
+            <w:r>
+              <w:rPr>
+                <w:rStyle w:val="SourceText"/>
+              </w:rPr>
+              <w:t>render.sh</w:t>
+            </w:r>
+            <w:r>
+              <w:rPr/>
+              <w:t xml:space="preserve"> handles flags in any position.</w:t>
+            </w:r>
+          </w:p>
+        </w:tc>
+        <w:tc>
+          <w:tcPr>
+            <w:tcW w:w="8654" w:type="dxa"/>
+            <w:tcBorders/>
+            <w:vAlign w:val="center"/>
+          </w:tcPr>
+          <w:p>
+            <w:pPr>
+              <w:pStyle w:val="TableContents"/>
+              <w:bidi w:val="0"/>
+              <w:spacing w:before="120" w:after="120"/>
+              <w:jc w:val="left"/>
+              <w:rPr/>
+            </w:pPr>
+            <w:r>
+              <w:rPr/>
+              <w:t>It now exits 1 on an empty diagram directory and 2 on contradictory flags, renders to a temporary file so a failed re-render never overwrites the last good diagram, and prints separate ok/skipped/failed counts.</w:t>
             </w:r>
           </w:p>
         </w:tc>
       </w:tr>
     </w:tbl>
+    <w:p>
+      <w:pPr>
+        <w:pStyle w:val="BodyText"/>
+        <w:bidi w:val="0"/>
+        <w:jc w:val="left"/>
+        <w:rPr/>
+      </w:pPr>
+      <w:r>
+        <w:rPr/>
+        <w:t>Earlier in the 0.19.x and 0.20.x line: the idle rule stopped agents stalling forever waiting for a notification that would never wake them; a behaviour-eval suite started testing the rules against a live model rather than only reading them, and its first run caught the PM writing code itself; the role write guard now mechanically enforces each role's write scope, off by default and the strictest layer wins when enabled; and every registered PowerShell hook now stands down off Windows, closing a defect where a host with both interpreters silently ran every hook twice.</w:t>
+      </w:r>
+    </w:p>
     <w:p>
       <w:pPr>
         <w:pStyle w:val="Heading2"/>
@@ -4751,72 +4740,7 @@
       </w:pPr>
       <w:r>
         <w:rPr/>
-        <w:t>8. The Stop-gate fix (0.19.93, in review)</w:t>
-      </w:r>
-    </w:p>
-    <w:p>
-      <w:pPr>
-        <w:pStyle w:val="BodyText"/>
-        <w:bidi w:val="0"/>
-        <w:spacing w:before="160" w:after="160"/>
-        <w:ind w:hanging="0" w:left="160" w:right="160"/>
-        <w:jc w:val="left"/>
-        <w:rPr>
-          <w:bdr w:val="single" w:sz="24" w:space="10" w:color="1F4E79"/>
-          <w:shd w:fill="F7F9FB" w:val="clear"/>
-        </w:rPr>
-      </w:pPr>
-      <w:r>
-        <w:rPr>
-          <w:b/>
-          <w:bdr w:val="single" w:sz="24" w:space="10" w:color="1F4E79"/>
-          <w:shd w:fill="F7F9FB" w:val="clear"/>
-        </w:rPr>
-        <w:t>The problem in one sentence.</w:t>
-      </w:r>
-      <w:r>
-        <w:rPr>
-          <w:bdr w:val="single" w:sz="24" w:space="10" w:color="1F4E79"/>
-          <w:shd w:fill="F7F9FB" w:val="clear"/>
-        </w:rPr>
-        <w:t xml:space="preserve"> The safety net at the end of every turn was taking seven minutes, every turn, on this machine, and people were cancelling it, which is worse than not having it.</w:t>
-      </w:r>
-    </w:p>
-    <w:p>
-      <w:pPr>
-        <w:pStyle w:val="Heading3"/>
-        <w:bidi w:val="0"/>
-        <w:ind w:hanging="0"/>
-        <w:jc w:val="left"/>
-        <w:rPr/>
-      </w:pPr>
-      <w:r>
-        <w:rPr/>
-        <w:t>What was wrong</w:t>
-      </w:r>
-    </w:p>
-    <w:p>
-      <w:pPr>
-        <w:pStyle w:val="BodyText"/>
-        <w:bidi w:val="0"/>
-        <w:jc w:val="left"/>
-        <w:rPr/>
-      </w:pPr>
-      <w:r>
-        <w:rPr/>
-        <w:t>The gate decides what to check by comparing the current files against the last commit it fully verified, recorded in a marker file. That marker only advanced when nothing had been deferred. One rule in this repository costs 185 seconds against a 60-second budget, so it was deferred on every turn, the marker never moved, and every turn re-checked 59 files across 13 rules. Separately, a rule with no declared cost could never be deferred at all, so ten of them ran whole every turn regardless of budget. Two other repositories on the same machine were worse: one had no marker at all and no priced rules, with a 499-second Stop; the other had ten rules that ran a smoke script which, without a flag, fired commands at a live development web server over SSM on every turn, with the target chosen by an ambient environment variable.</w:t>
-      </w:r>
-    </w:p>
-    <w:p>
-      <w:pPr>
-        <w:pStyle w:val="Heading3"/>
-        <w:bidi w:val="0"/>
-        <w:jc w:val="left"/>
-        <w:rPr/>
-      </w:pPr>
-      <w:r>
-        <w:rPr/>
-        <w:t>What the fix does</w:t>
+        <w:t>8. Integrations</w:t>
       </w:r>
     </w:p>
     <w:tbl>
@@ -4833,9 +4757,8 @@
         </w:tblCellMar>
       </w:tblPr>
       <w:tblGrid>
-        <w:gridCol w:w="1585"/>
-        <w:gridCol w:w="6746"/>
-        <w:gridCol w:w="3008"/>
+        <w:gridCol w:w="1933"/>
+        <w:gridCol w:w="9406"/>
       </w:tblGrid>
       <w:tr>
         <w:trPr>
@@ -4843,7 +4766,7 @@
         </w:trPr>
         <w:tc>
           <w:tcPr>
-            <w:tcW w:w="1585" w:type="dxa"/>
+            <w:tcW w:w="1933" w:type="dxa"/>
             <w:tcBorders/>
             <w:vAlign w:val="center"/>
           </w:tcPr>
@@ -4859,13 +4782,13 @@
             </w:pPr>
             <w:r>
               <w:rPr/>
-              <w:t>Component</w:t>
-            </w:r>
-          </w:p>
-        </w:tc>
-        <w:tc>
-          <w:tcPr>
-            <w:tcW w:w="6746" w:type="dxa"/>
+              <w:t>Area</w:t>
+            </w:r>
+          </w:p>
+        </w:tc>
+        <w:tc>
+          <w:tcPr>
+            <w:tcW w:w="9406" w:type="dxa"/>
             <w:tcBorders/>
             <w:vAlign w:val="center"/>
           </w:tcPr>
@@ -4881,533 +4804,271 @@
             </w:pPr>
             <w:r>
               <w:rPr/>
-              <w:t>Technical</w:t>
-            </w:r>
-          </w:p>
-        </w:tc>
-        <w:tc>
-          <w:tcPr>
-            <w:tcW w:w="3008" w:type="dxa"/>
-            <w:tcBorders/>
-            <w:vAlign w:val="center"/>
-          </w:tcPr>
-          <w:p>
-            <w:pPr>
-              <w:pStyle w:val="TableHeading"/>
-              <w:suppressLineNumbers/>
-              <w:shd w:fill="1F4E79" w:val="clear"/>
-              <w:bidi w:val="0"/>
-              <w:spacing w:before="120" w:after="120"/>
-              <w:jc w:val="left"/>
-              <w:rPr/>
-            </w:pPr>
-            <w:r>
-              <w:rPr/>
-              <w:t>Plain terms</w:t>
-            </w:r>
-          </w:p>
-        </w:tc>
-      </w:tr>
-      <w:tr>
-        <w:trPr/>
-        <w:tc>
-          <w:tcPr>
-            <w:tcW w:w="1585" w:type="dxa"/>
-            <w:tcBorders/>
-            <w:vAlign w:val="center"/>
-          </w:tcPr>
-          <w:p>
-            <w:pPr>
-              <w:pStyle w:val="TableContents"/>
-              <w:bidi w:val="0"/>
-              <w:spacing w:before="120" w:after="120"/>
-              <w:jc w:val="left"/>
-              <w:rPr/>
-            </w:pPr>
-            <w:r>
-              <w:rPr/>
-              <w:t>Per-rule verified record</w:t>
-            </w:r>
-          </w:p>
-        </w:tc>
-        <w:tc>
-          <w:tcPr>
-            <w:tcW w:w="6746" w:type="dxa"/>
-            <w:tcBorders/>
-            <w:vAlign w:val="center"/>
-          </w:tcPr>
-          <w:p>
-            <w:pPr>
-              <w:pStyle w:val="TableContents"/>
-              <w:bidi w:val="0"/>
-              <w:spacing w:before="120" w:after="120"/>
-              <w:jc w:val="left"/>
-              <w:rPr/>
-            </w:pPr>
-            <w:r>
-              <w:rPr/>
-              <w:t xml:space="preserve">Each rule that ran and passed on the current tree is recorded by content hash; the record advances rule by rule. A chronically over-budget rule, one excluded for reach, one needing a clean tree, or one that skipped is listed as unverified until </w:t>
-            </w:r>
+              <w:t>What crew connects to</w:t>
+            </w:r>
+          </w:p>
+        </w:tc>
+      </w:tr>
+      <w:tr>
+        <w:trPr/>
+        <w:tc>
+          <w:tcPr>
+            <w:tcW w:w="1933" w:type="dxa"/>
+            <w:tcBorders/>
+            <w:vAlign w:val="center"/>
+          </w:tcPr>
+          <w:p>
+            <w:pPr>
+              <w:pStyle w:val="TableContents"/>
+              <w:bidi w:val="0"/>
+              <w:spacing w:before="120" w:after="120"/>
+              <w:jc w:val="left"/>
+              <w:rPr/>
+            </w:pPr>
+            <w:r>
+              <w:rPr/>
+              <w:t>Trackers</w:t>
+            </w:r>
+          </w:p>
+        </w:tc>
+        <w:tc>
+          <w:tcPr>
+            <w:tcW w:w="9406" w:type="dxa"/>
+            <w:tcBorders/>
+            <w:vAlign w:val="center"/>
+          </w:tcPr>
+          <w:p>
+            <w:pPr>
+              <w:pStyle w:val="TableContents"/>
+              <w:bidi w:val="0"/>
+              <w:spacing w:before="120" w:after="120"/>
+              <w:jc w:val="left"/>
+              <w:rPr/>
+            </w:pPr>
+            <w:r>
+              <w:rPr/>
+              <w:t>Jira and ServiceDesk Plus through MCP; an Obsidian Kanban board; a local file cache always.</w:t>
+            </w:r>
+          </w:p>
+        </w:tc>
+      </w:tr>
+      <w:tr>
+        <w:trPr/>
+        <w:tc>
+          <w:tcPr>
+            <w:tcW w:w="1933" w:type="dxa"/>
+            <w:tcBorders/>
+            <w:vAlign w:val="center"/>
+          </w:tcPr>
+          <w:p>
+            <w:pPr>
+              <w:pStyle w:val="TableContents"/>
+              <w:bidi w:val="0"/>
+              <w:spacing w:before="120" w:after="120"/>
+              <w:jc w:val="left"/>
+              <w:rPr/>
+            </w:pPr>
+            <w:r>
+              <w:rPr/>
+              <w:t>Reviewers and models</w:t>
+            </w:r>
+          </w:p>
+        </w:tc>
+        <w:tc>
+          <w:tcPr>
+            <w:tcW w:w="9406" w:type="dxa"/>
+            <w:tcBorders/>
+            <w:vAlign w:val="center"/>
+          </w:tcPr>
+          <w:p>
+            <w:pPr>
+              <w:pStyle w:val="TableContents"/>
+              <w:bidi w:val="0"/>
+              <w:spacing w:before="120" w:after="120"/>
+              <w:jc w:val="left"/>
+              <w:rPr/>
+            </w:pPr>
+            <w:r>
+              <w:rPr/>
+              <w:t>Codex (OpenAI) as the first-choice reviewer; GitHub Copilot models including Kimi as an alternative family; Gemini as a design partner; per-role model pins with a probe that confirms the model answers before it is trusted.</w:t>
+            </w:r>
+          </w:p>
+        </w:tc>
+      </w:tr>
+      <w:tr>
+        <w:trPr/>
+        <w:tc>
+          <w:tcPr>
+            <w:tcW w:w="1933" w:type="dxa"/>
+            <w:tcBorders/>
+            <w:vAlign w:val="center"/>
+          </w:tcPr>
+          <w:p>
+            <w:pPr>
+              <w:pStyle w:val="TableContents"/>
+              <w:bidi w:val="0"/>
+              <w:spacing w:before="120" w:after="120"/>
+              <w:jc w:val="left"/>
+              <w:rPr/>
+            </w:pPr>
+            <w:r>
+              <w:rPr/>
+              <w:t>Cloud</w:t>
+            </w:r>
+          </w:p>
+        </w:tc>
+        <w:tc>
+          <w:tcPr>
+            <w:tcW w:w="9406" w:type="dxa"/>
+            <w:tcBorders/>
+            <w:vAlign w:val="center"/>
+          </w:tcPr>
+          <w:p>
+            <w:pPr>
+              <w:pStyle w:val="TableContents"/>
+              <w:bidi w:val="0"/>
+              <w:spacing w:before="120" w:after="120"/>
+              <w:jc w:val="left"/>
+              <w:rPr/>
+            </w:pPr>
+            <w:r>
+              <w:rPr/>
+              <w:t>The official AWS and Azure MCP servers, configured per repository with guardrails.</w:t>
+            </w:r>
+          </w:p>
+        </w:tc>
+      </w:tr>
+      <w:tr>
+        <w:trPr/>
+        <w:tc>
+          <w:tcPr>
+            <w:tcW w:w="1933" w:type="dxa"/>
+            <w:tcBorders/>
+            <w:vAlign w:val="center"/>
+          </w:tcPr>
+          <w:p>
+            <w:pPr>
+              <w:pStyle w:val="TableContents"/>
+              <w:bidi w:val="0"/>
+              <w:spacing w:before="120" w:after="120"/>
+              <w:jc w:val="left"/>
+              <w:rPr/>
+            </w:pPr>
+            <w:r>
+              <w:rPr/>
+              <w:t>Notifications</w:t>
+            </w:r>
+          </w:p>
+        </w:tc>
+        <w:tc>
+          <w:tcPr>
+            <w:tcW w:w="9406" w:type="dxa"/>
+            <w:tcBorders/>
+            <w:vAlign w:val="center"/>
+          </w:tcPr>
+          <w:p>
+            <w:pPr>
+              <w:pStyle w:val="TableContents"/>
+              <w:bidi w:val="0"/>
+              <w:spacing w:before="120" w:after="120"/>
+              <w:jc w:val="left"/>
+              <w:rPr/>
+            </w:pPr>
+            <w:r>
+              <w:rPr/>
+              <w:t>Microsoft Teams and Telegram, outbound; two-way options documented.</w:t>
+            </w:r>
+          </w:p>
+        </w:tc>
+      </w:tr>
+      <w:tr>
+        <w:trPr/>
+        <w:tc>
+          <w:tcPr>
+            <w:tcW w:w="1933" w:type="dxa"/>
+            <w:tcBorders/>
+            <w:vAlign w:val="center"/>
+          </w:tcPr>
+          <w:p>
+            <w:pPr>
+              <w:pStyle w:val="TableContents"/>
+              <w:bidi w:val="0"/>
+              <w:spacing w:before="120" w:after="120"/>
+              <w:jc w:val="left"/>
+              <w:rPr/>
+            </w:pPr>
+            <w:r>
+              <w:rPr/>
+              <w:t>Memory</w:t>
+            </w:r>
+          </w:p>
+        </w:tc>
+        <w:tc>
+          <w:tcPr>
+            <w:tcW w:w="9406" w:type="dxa"/>
+            <w:tcBorders/>
+            <w:vAlign w:val="center"/>
+          </w:tcPr>
+          <w:p>
+            <w:pPr>
+              <w:pStyle w:val="TableContents"/>
+              <w:bidi w:val="0"/>
+              <w:spacing w:before="120" w:after="120"/>
+              <w:jc w:val="left"/>
+              <w:rPr/>
+            </w:pPr>
+            <w:r>
+              <w:rPr/>
+              <w:t>Optional Obsidian vault for cross-repository notes; never written to without explicit consent in the session.</w:t>
+            </w:r>
+          </w:p>
+        </w:tc>
+      </w:tr>
+      <w:tr>
+        <w:trPr/>
+        <w:tc>
+          <w:tcPr>
+            <w:tcW w:w="1933" w:type="dxa"/>
+            <w:tcBorders/>
+            <w:vAlign w:val="center"/>
+          </w:tcPr>
+          <w:p>
+            <w:pPr>
+              <w:pStyle w:val="TableContents"/>
+              <w:bidi w:val="0"/>
+              <w:spacing w:before="120" w:after="120"/>
+              <w:jc w:val="left"/>
+              <w:rPr/>
+            </w:pPr>
+            <w:r>
+              <w:rPr/>
+              <w:t>Documents</w:t>
+            </w:r>
+          </w:p>
+        </w:tc>
+        <w:tc>
+          <w:tcPr>
+            <w:tcW w:w="9406" w:type="dxa"/>
+            <w:tcBorders/>
+            <w:vAlign w:val="center"/>
+          </w:tcPr>
+          <w:p>
+            <w:pPr>
+              <w:pStyle w:val="TableContents"/>
+              <w:bidi w:val="0"/>
+              <w:spacing w:before="120" w:after="120"/>
+              <w:jc w:val="left"/>
+              <w:rPr/>
+            </w:pPr>
             <w:r>
               <w:rPr>
                 <w:rStyle w:val="SourceText"/>
               </w:rPr>
-              <w:t>/crew:verify --all</w:t>
-            </w:r>
-            <w:r>
-              <w:rPr/>
-              <w:t xml:space="preserve"> runs it, and reported every turn.</w:t>
-            </w:r>
-          </w:p>
-        </w:tc>
-        <w:tc>
-          <w:tcPr>
-            <w:tcW w:w="3008" w:type="dxa"/>
-            <w:tcBorders/>
-            <w:vAlign w:val="center"/>
-          </w:tcPr>
-          <w:p>
-            <w:pPr>
-              <w:pStyle w:val="TableContents"/>
-              <w:bidi w:val="0"/>
-              <w:spacing w:before="120" w:after="120"/>
-              <w:jc w:val="left"/>
-              <w:rPr/>
-            </w:pPr>
-            <w:r>
-              <w:rPr/>
-              <w:t>One slow check no longer freezes all the others. Nothing is forgotten; it is listed.</w:t>
-            </w:r>
-          </w:p>
-        </w:tc>
-      </w:tr>
-      <w:tr>
-        <w:trPr/>
-        <w:tc>
-          <w:tcPr>
-            <w:tcW w:w="1585" w:type="dxa"/>
-            <w:tcBorders/>
-            <w:vAlign w:val="center"/>
-          </w:tcPr>
-          <w:p>
-            <w:pPr>
-              <w:pStyle w:val="TableContents"/>
-              <w:bidi w:val="0"/>
-              <w:spacing w:before="120" w:after="120"/>
-              <w:jc w:val="left"/>
-              <w:rPr/>
-            </w:pPr>
-            <w:r>
-              <w:rPr/>
-              <w:t>Measure and cache</w:t>
-            </w:r>
-          </w:p>
-        </w:tc>
-        <w:tc>
-          <w:tcPr>
-            <w:tcW w:w="6746" w:type="dxa"/>
-            <w:tcBorders/>
-            <w:vAlign w:val="center"/>
-          </w:tcPr>
-          <w:p>
-            <w:pPr>
-              <w:pStyle w:val="TableContents"/>
-              <w:bidi w:val="0"/>
-              <w:spacing w:before="120" w:after="120"/>
-              <w:jc w:val="left"/>
-              <w:rPr/>
-            </w:pPr>
-            <w:r>
-              <w:rPr/>
-              <w:t xml:space="preserve">An unpriced rule is timed on its first run and the measurement cached locally, so it is deferrable next turn. </w:t>
-            </w:r>
-            <w:r>
-              <w:rPr>
-                <w:rStyle w:val="SourceText"/>
-              </w:rPr>
-              <w:t>--price</w:t>
-            </w:r>
-            <w:r>
-              <w:rPr/>
-              <w:t xml:space="preserve"> writes </w:t>
-            </w:r>
-            <w:r>
-              <w:rPr>
-                <w:rStyle w:val="SourceText"/>
-              </w:rPr>
-              <w:t>seconds</w:t>
-            </w:r>
-            <w:r>
-              <w:rPr/>
-              <w:t xml:space="preserve"> into the map for the author; it is never reachable from the hook.</w:t>
-            </w:r>
-          </w:p>
-        </w:tc>
-        <w:tc>
-          <w:tcPr>
-            <w:tcW w:w="3008" w:type="dxa"/>
-            <w:tcBorders/>
-            <w:vAlign w:val="center"/>
-          </w:tcPr>
-          <w:p>
-            <w:pPr>
-              <w:pStyle w:val="TableContents"/>
-              <w:bidi w:val="0"/>
-              <w:spacing w:before="120" w:after="120"/>
-              <w:jc w:val="left"/>
-              <w:rPr/>
-            </w:pPr>
-            <w:r>
-              <w:rPr/>
-              <w:t>Checks price themselves. Unknown cost means "mandatory once", not "mandatory forever".</w:t>
-            </w:r>
-          </w:p>
-        </w:tc>
-      </w:tr>
-      <w:tr>
-        <w:trPr/>
-        <w:tc>
-          <w:tcPr>
-            <w:tcW w:w="1585" w:type="dxa"/>
-            <w:tcBorders/>
-            <w:vAlign w:val="center"/>
-          </w:tcPr>
-          <w:p>
-            <w:pPr>
-              <w:pStyle w:val="TableContents"/>
-              <w:bidi w:val="0"/>
-              <w:spacing w:before="120" w:after="120"/>
-              <w:jc w:val="left"/>
-              <w:rPr/>
-            </w:pPr>
-            <w:r>
-              <w:rPr/>
-              <w:t>Reach declarations</w:t>
-            </w:r>
-          </w:p>
-        </w:tc>
-        <w:tc>
-          <w:tcPr>
-            <w:tcW w:w="6746" w:type="dxa"/>
-            <w:tcBorders/>
-            <w:vAlign w:val="center"/>
-          </w:tcPr>
-          <w:p>
-            <w:pPr>
-              <w:pStyle w:val="TableContents"/>
-              <w:bidi w:val="0"/>
-              <w:spacing w:before="120" w:after="120"/>
-              <w:jc w:val="left"/>
-              <w:rPr/>
-            </w:pPr>
-            <w:r>
-              <w:rPr/>
-              <w:t xml:space="preserve">Rules declare </w:t>
-            </w:r>
-            <w:r>
-              <w:rPr>
-                <w:rStyle w:val="SourceText"/>
-              </w:rPr>
-              <w:t>local</w:t>
-            </w:r>
-            <w:r>
-              <w:rPr/>
-              <w:t xml:space="preserve">, </w:t>
-            </w:r>
-            <w:r>
-              <w:rPr>
-                <w:rStyle w:val="SourceText"/>
-              </w:rPr>
-              <w:t>network</w:t>
-            </w:r>
-            <w:r>
-              <w:rPr/>
-              <w:t xml:space="preserve"> or </w:t>
-            </w:r>
-            <w:r>
-              <w:rPr>
-                <w:rStyle w:val="SourceText"/>
-              </w:rPr>
-              <w:t>host</w:t>
-            </w:r>
-            <w:r>
-              <w:rPr/>
-              <w:t xml:space="preserve">. Only local rules run on Stop. Inspection may only reject: an undeclared rule that runs any script, inline shell or </w:t>
-            </w:r>
-            <w:r>
-              <w:rPr>
-                <w:rStyle w:val="SourceText"/>
-              </w:rPr>
-              <w:t>cd</w:t>
-            </w:r>
-            <w:r>
-              <w:rPr/>
-              <w:t xml:space="preserve"> is deferred until the map declares it. A parse-only </w:t>
-            </w:r>
-            <w:r>
-              <w:rPr>
-                <w:rStyle w:val="SourceText"/>
-              </w:rPr>
-              <w:t>bash -n</w:t>
-            </w:r>
-            <w:r>
-              <w:rPr/>
-              <w:t xml:space="preserve"> stays local.</w:t>
-            </w:r>
-          </w:p>
-        </w:tc>
-        <w:tc>
-          <w:tcPr>
-            <w:tcW w:w="3008" w:type="dxa"/>
-            <w:tcBorders/>
-            <w:vAlign w:val="center"/>
-          </w:tcPr>
-          <w:p>
-            <w:pPr>
-              <w:pStyle w:val="TableContents"/>
-              <w:bidi w:val="0"/>
-              <w:spacing w:before="120" w:after="120"/>
-              <w:jc w:val="left"/>
-              <w:rPr/>
-            </w:pPr>
-            <w:r>
-              <w:rPr/>
-              <w:t>Nothing reaches a live server unattended. Each repository declares its wrapper scripts once; the PM tells it which.</w:t>
-            </w:r>
-          </w:p>
-        </w:tc>
-      </w:tr>
-      <w:tr>
-        <w:trPr/>
-        <w:tc>
-          <w:tcPr>
-            <w:tcW w:w="1585" w:type="dxa"/>
-            <w:tcBorders/>
-            <w:vAlign w:val="center"/>
-          </w:tcPr>
-          <w:p>
-            <w:pPr>
-              <w:pStyle w:val="TableContents"/>
-              <w:bidi w:val="0"/>
-              <w:spacing w:before="120" w:after="120"/>
-              <w:jc w:val="left"/>
-              <w:rPr/>
-            </w:pPr>
-            <w:r>
-              <w:rPr/>
-              <w:t>Environment pinning</w:t>
-            </w:r>
-          </w:p>
-        </w:tc>
-        <w:tc>
-          <w:tcPr>
-            <w:tcW w:w="6746" w:type="dxa"/>
-            <w:tcBorders/>
-            <w:vAlign w:val="center"/>
-          </w:tcPr>
-          <w:p>
-            <w:pPr>
-              <w:pStyle w:val="TableContents"/>
-              <w:bidi w:val="0"/>
-              <w:spacing w:before="120" w:after="120"/>
-              <w:jc w:val="left"/>
-              <w:rPr/>
-            </w:pPr>
-            <w:r>
-              <w:rPr>
-                <w:rStyle w:val="SourceText"/>
-              </w:rPr>
-              <w:t>ENV</w:t>
-            </w:r>
-            <w:r>
-              <w:rPr/>
-              <w:t xml:space="preserve">, </w:t>
-            </w:r>
-            <w:r>
-              <w:rPr>
-                <w:rStyle w:val="SourceText"/>
-              </w:rPr>
-              <w:t>AWS_PROFILE</w:t>
-            </w:r>
-            <w:r>
-              <w:rPr/>
-              <w:t xml:space="preserve">, </w:t>
-            </w:r>
-            <w:r>
-              <w:rPr>
-                <w:rStyle w:val="SourceText"/>
-              </w:rPr>
-              <w:t>AWS_DEFAULT_REGION</w:t>
-            </w:r>
-            <w:r>
-              <w:rPr/>
-              <w:t xml:space="preserve">, </w:t>
-            </w:r>
-            <w:r>
-              <w:rPr>
-                <w:rStyle w:val="SourceText"/>
-              </w:rPr>
-              <w:t>KUBECONFIG</w:t>
-            </w:r>
-            <w:r>
-              <w:rPr/>
-              <w:t xml:space="preserve"> and </w:t>
-            </w:r>
-            <w:r>
-              <w:rPr>
-                <w:rStyle w:val="SourceText"/>
-              </w:rPr>
-              <w:t>TF_WORKSPACE</w:t>
-            </w:r>
-            <w:r>
-              <w:rPr/>
-              <w:t xml:space="preserve"> are unset for every rule unless the map declares them; the gate prints what it pinned.</w:t>
-            </w:r>
-          </w:p>
-        </w:tc>
-        <w:tc>
-          <w:tcPr>
-            <w:tcW w:w="3008" w:type="dxa"/>
-            <w:tcBorders/>
-            <w:vAlign w:val="center"/>
-          </w:tcPr>
-          <w:p>
-            <w:pPr>
-              <w:pStyle w:val="TableContents"/>
-              <w:bidi w:val="0"/>
-              <w:spacing w:before="120" w:after="120"/>
-              <w:jc w:val="left"/>
-              <w:rPr/>
-            </w:pPr>
-            <w:r>
-              <w:rPr/>
-              <w:t>A leftover variable in a terminal cannot point a check at production.</w:t>
-            </w:r>
-          </w:p>
-        </w:tc>
-      </w:tr>
-      <w:tr>
-        <w:trPr/>
-        <w:tc>
-          <w:tcPr>
-            <w:tcW w:w="1585" w:type="dxa"/>
-            <w:tcBorders/>
-            <w:vAlign w:val="center"/>
-          </w:tcPr>
-          <w:p>
-            <w:pPr>
-              <w:pStyle w:val="TableContents"/>
-              <w:bidi w:val="0"/>
-              <w:spacing w:before="120" w:after="120"/>
-              <w:jc w:val="left"/>
-              <w:rPr/>
-            </w:pPr>
-            <w:r>
-              <w:rPr/>
-              <w:t>Exit 77 as SKIP</w:t>
-            </w:r>
-          </w:p>
-        </w:tc>
-        <w:tc>
-          <w:tcPr>
-            <w:tcW w:w="6746" w:type="dxa"/>
-            <w:tcBorders/>
-            <w:vAlign w:val="center"/>
-          </w:tcPr>
-          <w:p>
-            <w:pPr>
-              <w:pStyle w:val="TableContents"/>
-              <w:bidi w:val="0"/>
-              <w:spacing w:before="120" w:after="120"/>
-              <w:jc w:val="left"/>
-              <w:rPr/>
-            </w:pPr>
-            <w:r>
-              <w:rPr/>
-              <w:t>The standard "environment absent" code is neither pass nor fail, never advances the marker, and deletes any earlier clean fingerprint.</w:t>
-            </w:r>
-          </w:p>
-        </w:tc>
-        <w:tc>
-          <w:tcPr>
-            <w:tcW w:w="3008" w:type="dxa"/>
-            <w:tcBorders/>
-            <w:vAlign w:val="center"/>
-          </w:tcPr>
-          <w:p>
-            <w:pPr>
-              <w:pStyle w:val="TableContents"/>
-              <w:bidi w:val="0"/>
-              <w:spacing w:before="120" w:after="120"/>
-              <w:jc w:val="left"/>
-              <w:rPr/>
-            </w:pPr>
-            <w:r>
-              <w:rPr/>
-              <w:t>A check that could not run is not counted as passed.</w:t>
-            </w:r>
-          </w:p>
-        </w:tc>
-      </w:tr>
-      <w:tr>
-        <w:trPr/>
-        <w:tc>
-          <w:tcPr>
-            <w:tcW w:w="1585" w:type="dxa"/>
-            <w:tcBorders/>
-            <w:vAlign w:val="center"/>
-          </w:tcPr>
-          <w:p>
-            <w:pPr>
-              <w:pStyle w:val="TableContents"/>
-              <w:bidi w:val="0"/>
-              <w:spacing w:before="120" w:after="120"/>
-              <w:jc w:val="left"/>
-              <w:rPr/>
-            </w:pPr>
-            <w:r>
-              <w:rPr/>
-              <w:t>Three PM triggers</w:t>
-            </w:r>
-          </w:p>
-        </w:tc>
-        <w:tc>
-          <w:tcPr>
-            <w:tcW w:w="6746" w:type="dxa"/>
-            <w:tcBorders/>
-            <w:vAlign w:val="center"/>
-          </w:tcPr>
-          <w:p>
-            <w:pPr>
-              <w:pStyle w:val="TableContents"/>
-              <w:bidi w:val="0"/>
-              <w:spacing w:before="120" w:after="120"/>
-              <w:jc w:val="left"/>
-              <w:rPr/>
-            </w:pPr>
-            <w:r>
-              <w:rPr/>
-              <w:t>Marker missing or stale by N commits; N rules unpriced; N rules with undeclared reach. An unreadable value renders as "unknown" and fires.</w:t>
-            </w:r>
-          </w:p>
-        </w:tc>
-        <w:tc>
-          <w:tcPr>
-            <w:tcW w:w="3008" w:type="dxa"/>
-            <w:tcBorders/>
-            <w:vAlign w:val="center"/>
-          </w:tcPr>
-          <w:p>
-            <w:pPr>
-              <w:pStyle w:val="TableContents"/>
-              <w:bidi w:val="0"/>
-              <w:spacing w:before="120" w:after="120"/>
-              <w:jc w:val="left"/>
-              <w:rPr/>
-            </w:pPr>
-            <w:r>
-              <w:rPr/>
-              <w:t>The manager tells you what to declare or price instead of you discovering it from a slow hook.</w:t>
+              <w:t>doc-builder</w:t>
+            </w:r>
+            <w:r>
+              <w:rPr/>
+              <w:t xml:space="preserve"> (a separate marketplace entry) renders any hand-authored guide or runbook to house style, and to DOCX/PDF through Microsoft Word or LibreOffice depending on the host.</w:t>
             </w:r>
           </w:p>
         </w:tc>
@@ -5415,59 +5076,14 @@
     </w:tbl>
     <w:p>
       <w:pPr>
-        <w:pStyle w:val="Heading3"/>
+        <w:pStyle w:val="Heading2"/>
         <w:bidi w:val="0"/>
         <w:jc w:val="left"/>
         <w:rPr/>
       </w:pPr>
       <w:r>
         <w:rPr/>
-        <w:t>Review so far</w:t>
-      </w:r>
-    </w:p>
-    <w:p>
-      <w:pPr>
-        <w:pStyle w:val="BodyText"/>
-        <w:bidi w:val="0"/>
-        <w:ind w:hanging="0" w:left="0" w:right="0"/>
-        <w:jc w:val="left"/>
-        <w:rPr/>
-      </w:pPr>
-      <w:r>
-        <w:rPr/>
-        <w:t xml:space="preserve">Five Codex rounds plus a PowerShell security specialist have reviewed the branch; 31 findings were fixed with a test for each, and a self-check test now runs this repository's real rule map through the classifier. That self-check caught, in turn, </w:t>
-      </w:r>
-      <w:r>
-        <w:rPr>
-          <w:rStyle w:val="SourceText"/>
-        </w:rPr>
-        <w:t>python -m pytest</w:t>
-      </w:r>
-      <w:r>
-        <w:rPr/>
-        <w:t xml:space="preserve"> being read as a wrapper script, the word "curl" in a comment, and the parse-only case. Four rounds of the wrapper scanner each found a new way shell syntax could hide a script, which is why the design was inverted to reject-only in round four. </w:t>
-      </w:r>
-      <w:r>
-        <w:rPr>
-          <w:color w:val="B45309"/>
-        </w:rPr>
-        <w:t>One fix pass (splitting compound commands on shell operators) is in progress; then one more review round, then merge.</w:t>
-      </w:r>
-      <w:r>
-        <w:rPr/>
-        <w:t xml:space="preserve"> Its effect on live sessions is not yet measured.</w:t>
-      </w:r>
-    </w:p>
-    <w:p>
-      <w:pPr>
-        <w:pStyle w:val="Heading3"/>
-        <w:bidi w:val="0"/>
-        <w:jc w:val="left"/>
-        <w:rPr/>
-      </w:pPr>
-      <w:r>
-        <w:rPr/>
-        <w:t>What a repository has to do after upgrading</w:t>
+        <w:t>9. Getting Started</w:t>
       </w:r>
     </w:p>
     <w:p>
@@ -5489,17 +5105,17 @@
       </w:pPr>
       <w:r>
         <w:rPr/>
-        <w:t xml:space="preserve">Declare </w:t>
+        <w:t xml:space="preserve">Install the marketplace and the crew plugin in Claude Code, then </w:t>
       </w:r>
       <w:r>
         <w:rPr>
           <w:rStyle w:val="SourceText"/>
         </w:rPr>
-        <w:t>reach: local</w:t>
-      </w:r>
-      <w:r>
-        <w:rPr/>
-        <w:t xml:space="preserve"> on rules that run a script, or the PM pulse will name them and they will be deferred until declared. </w:t>
+        <w:t>/reload-plugins</w:t>
+      </w:r>
+      <w:r>
+        <w:rPr/>
+        <w:t xml:space="preserve"> in any open session. </w:t>
       </w:r>
     </w:p>
     <w:p>
@@ -5521,17 +5137,71 @@
       </w:pPr>
       <w:r>
         <w:rPr/>
-        <w:t xml:space="preserve">Run </w:t>
+        <w:t xml:space="preserve">In a repository, run </w:t>
       </w:r>
       <w:r>
         <w:rPr>
           <w:rStyle w:val="SourceText"/>
         </w:rPr>
-        <w:t>/crew:verify --price</w:t>
-      </w:r>
-      <w:r>
-        <w:rPr/>
-        <w:t xml:space="preserve"> once, or let the cache price rules as they run. </w:t>
+        <w:t>/crew:init</w:t>
+      </w:r>
+      <w:r>
+        <w:rPr/>
+        <w:t xml:space="preserve">. It is phased and resumable; nothing is written without saying so. </w:t>
+      </w:r>
+    </w:p>
+    <w:p>
+      <w:pPr>
+        <w:pStyle w:val="BodyText"/>
+        <w:numPr>
+          <w:ilvl w:val="0"/>
+          <w:numId w:val="3"/>
+        </w:numPr>
+        <w:tabs>
+          <w:tab w:val="clear" w:pos="1134"/>
+          <w:tab w:val="left" w:pos="829" w:leader="none"/>
+        </w:tabs>
+        <w:bidi w:val="0"/>
+        <w:spacing w:before="120" w:after="0"/>
+        <w:ind w:hanging="283" w:left="829"/>
+        <w:jc w:val="left"/>
+        <w:rPr/>
+      </w:pPr>
+      <w:r>
+        <w:rPr/>
+        <w:t xml:space="preserve">Build the smoke harness when init asks. Everything downstream stands on it. </w:t>
+      </w:r>
+    </w:p>
+    <w:p>
+      <w:pPr>
+        <w:pStyle w:val="BodyText"/>
+        <w:numPr>
+          <w:ilvl w:val="0"/>
+          <w:numId w:val="3"/>
+        </w:numPr>
+        <w:tabs>
+          <w:tab w:val="clear" w:pos="1134"/>
+          <w:tab w:val="left" w:pos="829" w:leader="none"/>
+        </w:tabs>
+        <w:bidi w:val="0"/>
+        <w:spacing w:before="120" w:after="0"/>
+        <w:ind w:hanging="283" w:left="829"/>
+        <w:jc w:val="left"/>
+        <w:rPr/>
+      </w:pPr>
+      <w:r>
+        <w:rPr/>
+        <w:t xml:space="preserve">Run </w:t>
+      </w:r>
+      <w:r>
+        <w:rPr>
+          <w:rStyle w:val="SourceText"/>
+        </w:rPr>
+        <w:t>/crew:onboard</w:t>
+      </w:r>
+      <w:r>
+        <w:rPr/>
+        <w:t xml:space="preserve"> so the crew learns the codebase once and writes it down. </w:t>
       </w:r>
     </w:p>
     <w:p>
@@ -5552,7 +5222,27 @@
       </w:pPr>
       <w:r>
         <w:rPr/>
-        <w:t xml:space="preserve">Create the marker on a verified commit only. Marking an unverified commit as verified means the gate will not look at it again. </w:t>
+        <w:t xml:space="preserve">Write a ticket with </w:t>
+      </w:r>
+      <w:r>
+        <w:rPr>
+          <w:rStyle w:val="SourceText"/>
+        </w:rPr>
+        <w:t>/crew:ticket</w:t>
+      </w:r>
+      <w:r>
+        <w:rPr/>
+        <w:t xml:space="preserve">, then </w:t>
+      </w:r>
+      <w:r>
+        <w:rPr>
+          <w:rStyle w:val="SourceText"/>
+        </w:rPr>
+        <w:t>/crew:work</w:t>
+      </w:r>
+      <w:r>
+        <w:rPr/>
+        <w:t xml:space="preserve">. Read the review. Merge when the gate is green. </w:t>
       </w:r>
     </w:p>
     <w:p>
@@ -5564,7 +5254,7 @@
       </w:pPr>
       <w:r>
         <w:rPr/>
-        <w:t>9. Integrations</w:t>
+        <w:t>10. Glossary</w:t>
       </w:r>
     </w:p>
     <w:tbl>
@@ -5581,8 +5271,8 @@
         </w:tblCellMar>
       </w:tblPr>
       <w:tblGrid>
-        <w:gridCol w:w="1772"/>
-        <w:gridCol w:w="9567"/>
+        <w:gridCol w:w="2634"/>
+        <w:gridCol w:w="8705"/>
       </w:tblGrid>
       <w:tr>
         <w:trPr>
@@ -5590,7 +5280,7 @@
         </w:trPr>
         <w:tc>
           <w:tcPr>
-            <w:tcW w:w="1772" w:type="dxa"/>
+            <w:tcW w:w="2634" w:type="dxa"/>
             <w:tcBorders/>
             <w:vAlign w:val="center"/>
           </w:tcPr>
@@ -5606,13 +5296,13 @@
             </w:pPr>
             <w:r>
               <w:rPr/>
-              <w:t>Area</w:t>
-            </w:r>
-          </w:p>
-        </w:tc>
-        <w:tc>
-          <w:tcPr>
-            <w:tcW w:w="9567" w:type="dxa"/>
+              <w:t>Term</w:t>
+            </w:r>
+          </w:p>
+        </w:tc>
+        <w:tc>
+          <w:tcPr>
+            <w:tcW w:w="8705" w:type="dxa"/>
             <w:tcBorders/>
             <w:vAlign w:val="center"/>
           </w:tcPr>
@@ -5628,471 +5318,6 @@
             </w:pPr>
             <w:r>
               <w:rPr/>
-              <w:t>What crew connects to</w:t>
-            </w:r>
-          </w:p>
-        </w:tc>
-      </w:tr>
-      <w:tr>
-        <w:trPr/>
-        <w:tc>
-          <w:tcPr>
-            <w:tcW w:w="1772" w:type="dxa"/>
-            <w:tcBorders/>
-            <w:vAlign w:val="center"/>
-          </w:tcPr>
-          <w:p>
-            <w:pPr>
-              <w:pStyle w:val="TableContents"/>
-              <w:bidi w:val="0"/>
-              <w:spacing w:before="120" w:after="120"/>
-              <w:jc w:val="left"/>
-              <w:rPr/>
-            </w:pPr>
-            <w:r>
-              <w:rPr/>
-              <w:t>Trackers</w:t>
-            </w:r>
-          </w:p>
-        </w:tc>
-        <w:tc>
-          <w:tcPr>
-            <w:tcW w:w="9567" w:type="dxa"/>
-            <w:tcBorders/>
-            <w:vAlign w:val="center"/>
-          </w:tcPr>
-          <w:p>
-            <w:pPr>
-              <w:pStyle w:val="TableContents"/>
-              <w:bidi w:val="0"/>
-              <w:spacing w:before="120" w:after="120"/>
-              <w:jc w:val="left"/>
-              <w:rPr/>
-            </w:pPr>
-            <w:r>
-              <w:rPr/>
-              <w:t>Jira and ServiceDesk Plus through MCP; an Obsidian Kanban board; a local file cache always.</w:t>
-            </w:r>
-          </w:p>
-        </w:tc>
-      </w:tr>
-      <w:tr>
-        <w:trPr/>
-        <w:tc>
-          <w:tcPr>
-            <w:tcW w:w="1772" w:type="dxa"/>
-            <w:tcBorders/>
-            <w:vAlign w:val="center"/>
-          </w:tcPr>
-          <w:p>
-            <w:pPr>
-              <w:pStyle w:val="TableContents"/>
-              <w:bidi w:val="0"/>
-              <w:spacing w:before="120" w:after="120"/>
-              <w:jc w:val="left"/>
-              <w:rPr/>
-            </w:pPr>
-            <w:r>
-              <w:rPr/>
-              <w:t>Reviewers and models</w:t>
-            </w:r>
-          </w:p>
-        </w:tc>
-        <w:tc>
-          <w:tcPr>
-            <w:tcW w:w="9567" w:type="dxa"/>
-            <w:tcBorders/>
-            <w:vAlign w:val="center"/>
-          </w:tcPr>
-          <w:p>
-            <w:pPr>
-              <w:pStyle w:val="TableContents"/>
-              <w:bidi w:val="0"/>
-              <w:spacing w:before="120" w:after="120"/>
-              <w:jc w:val="left"/>
-              <w:rPr/>
-            </w:pPr>
-            <w:r>
-              <w:rPr/>
-              <w:t>Codex (OpenAI) as the first-choice reviewer; GitHub Copilot models including Kimi as an alternative family; Gemini as a design partner; per-role model pins with a probe that confirms the model answers before it is trusted.</w:t>
-            </w:r>
-          </w:p>
-        </w:tc>
-      </w:tr>
-      <w:tr>
-        <w:trPr/>
-        <w:tc>
-          <w:tcPr>
-            <w:tcW w:w="1772" w:type="dxa"/>
-            <w:tcBorders/>
-            <w:vAlign w:val="center"/>
-          </w:tcPr>
-          <w:p>
-            <w:pPr>
-              <w:pStyle w:val="TableContents"/>
-              <w:bidi w:val="0"/>
-              <w:spacing w:before="120" w:after="120"/>
-              <w:jc w:val="left"/>
-              <w:rPr/>
-            </w:pPr>
-            <w:r>
-              <w:rPr/>
-              <w:t>Cloud</w:t>
-            </w:r>
-          </w:p>
-        </w:tc>
-        <w:tc>
-          <w:tcPr>
-            <w:tcW w:w="9567" w:type="dxa"/>
-            <w:tcBorders/>
-            <w:vAlign w:val="center"/>
-          </w:tcPr>
-          <w:p>
-            <w:pPr>
-              <w:pStyle w:val="TableContents"/>
-              <w:bidi w:val="0"/>
-              <w:spacing w:before="120" w:after="120"/>
-              <w:jc w:val="left"/>
-              <w:rPr/>
-            </w:pPr>
-            <w:r>
-              <w:rPr/>
-              <w:t>The official AWS and Azure MCP servers, configured per repository with guardrails.</w:t>
-            </w:r>
-          </w:p>
-        </w:tc>
-      </w:tr>
-      <w:tr>
-        <w:trPr/>
-        <w:tc>
-          <w:tcPr>
-            <w:tcW w:w="1772" w:type="dxa"/>
-            <w:tcBorders/>
-            <w:vAlign w:val="center"/>
-          </w:tcPr>
-          <w:p>
-            <w:pPr>
-              <w:pStyle w:val="TableContents"/>
-              <w:bidi w:val="0"/>
-              <w:spacing w:before="120" w:after="120"/>
-              <w:jc w:val="left"/>
-              <w:rPr/>
-            </w:pPr>
-            <w:r>
-              <w:rPr/>
-              <w:t>Notifications</w:t>
-            </w:r>
-          </w:p>
-        </w:tc>
-        <w:tc>
-          <w:tcPr>
-            <w:tcW w:w="9567" w:type="dxa"/>
-            <w:tcBorders/>
-            <w:vAlign w:val="center"/>
-          </w:tcPr>
-          <w:p>
-            <w:pPr>
-              <w:pStyle w:val="TableContents"/>
-              <w:bidi w:val="0"/>
-              <w:spacing w:before="120" w:after="120"/>
-              <w:jc w:val="left"/>
-              <w:rPr/>
-            </w:pPr>
-            <w:r>
-              <w:rPr/>
-              <w:t>Microsoft Teams and Telegram, outbound; two-way options documented.</w:t>
-            </w:r>
-          </w:p>
-        </w:tc>
-      </w:tr>
-      <w:tr>
-        <w:trPr/>
-        <w:tc>
-          <w:tcPr>
-            <w:tcW w:w="1772" w:type="dxa"/>
-            <w:tcBorders/>
-            <w:vAlign w:val="center"/>
-          </w:tcPr>
-          <w:p>
-            <w:pPr>
-              <w:pStyle w:val="TableContents"/>
-              <w:bidi w:val="0"/>
-              <w:spacing w:before="120" w:after="120"/>
-              <w:jc w:val="left"/>
-              <w:rPr/>
-            </w:pPr>
-            <w:r>
-              <w:rPr/>
-              <w:t>Memory</w:t>
-            </w:r>
-          </w:p>
-        </w:tc>
-        <w:tc>
-          <w:tcPr>
-            <w:tcW w:w="9567" w:type="dxa"/>
-            <w:tcBorders/>
-            <w:vAlign w:val="center"/>
-          </w:tcPr>
-          <w:p>
-            <w:pPr>
-              <w:pStyle w:val="TableContents"/>
-              <w:bidi w:val="0"/>
-              <w:spacing w:before="120" w:after="120"/>
-              <w:jc w:val="left"/>
-              <w:rPr/>
-            </w:pPr>
-            <w:r>
-              <w:rPr/>
-              <w:t>Optional Obsidian vault for cross-repository notes; never written to without explicit consent in the session.</w:t>
-            </w:r>
-          </w:p>
-        </w:tc>
-      </w:tr>
-    </w:tbl>
-    <w:p>
-      <w:pPr>
-        <w:pStyle w:val="Heading2"/>
-        <w:bidi w:val="0"/>
-        <w:jc w:val="left"/>
-        <w:rPr/>
-      </w:pPr>
-      <w:r>
-        <w:rPr/>
-        <w:t>10. Getting started</w:t>
-      </w:r>
-    </w:p>
-    <w:p>
-      <w:pPr>
-        <w:pStyle w:val="BodyText"/>
-        <w:numPr>
-          <w:ilvl w:val="0"/>
-          <w:numId w:val="4"/>
-        </w:numPr>
-        <w:tabs>
-          <w:tab w:val="clear" w:pos="1134"/>
-          <w:tab w:val="left" w:pos="829" w:leader="none"/>
-        </w:tabs>
-        <w:bidi w:val="0"/>
-        <w:spacing w:before="120" w:after="0"/>
-        <w:ind w:hanging="283" w:left="829"/>
-        <w:jc w:val="left"/>
-        <w:rPr/>
-      </w:pPr>
-      <w:r>
-        <w:rPr/>
-        <w:t xml:space="preserve">Install the marketplace and the crew plugin in Claude Code, then </w:t>
-      </w:r>
-      <w:r>
-        <w:rPr>
-          <w:rStyle w:val="SourceText"/>
-        </w:rPr>
-        <w:t>/reload-plugins</w:t>
-      </w:r>
-      <w:r>
-        <w:rPr/>
-        <w:t xml:space="preserve"> in any open session. </w:t>
-      </w:r>
-    </w:p>
-    <w:p>
-      <w:pPr>
-        <w:pStyle w:val="BodyText"/>
-        <w:numPr>
-          <w:ilvl w:val="0"/>
-          <w:numId w:val="4"/>
-        </w:numPr>
-        <w:tabs>
-          <w:tab w:val="clear" w:pos="1134"/>
-          <w:tab w:val="left" w:pos="829" w:leader="none"/>
-        </w:tabs>
-        <w:bidi w:val="0"/>
-        <w:spacing w:before="120" w:after="0"/>
-        <w:ind w:hanging="283" w:left="829"/>
-        <w:jc w:val="left"/>
-        <w:rPr/>
-      </w:pPr>
-      <w:r>
-        <w:rPr/>
-        <w:t xml:space="preserve">In a repository, run </w:t>
-      </w:r>
-      <w:r>
-        <w:rPr>
-          <w:rStyle w:val="SourceText"/>
-        </w:rPr>
-        <w:t>/crew:init</w:t>
-      </w:r>
-      <w:r>
-        <w:rPr/>
-        <w:t xml:space="preserve">. It is phased and resumable; nothing is written without saying so. </w:t>
-      </w:r>
-    </w:p>
-    <w:p>
-      <w:pPr>
-        <w:pStyle w:val="BodyText"/>
-        <w:numPr>
-          <w:ilvl w:val="0"/>
-          <w:numId w:val="4"/>
-        </w:numPr>
-        <w:tabs>
-          <w:tab w:val="clear" w:pos="1134"/>
-          <w:tab w:val="left" w:pos="829" w:leader="none"/>
-        </w:tabs>
-        <w:bidi w:val="0"/>
-        <w:spacing w:before="120" w:after="0"/>
-        <w:ind w:hanging="283" w:left="829"/>
-        <w:jc w:val="left"/>
-        <w:rPr/>
-      </w:pPr>
-      <w:r>
-        <w:rPr/>
-        <w:t xml:space="preserve">Build the smoke harness when init asks. Everything downstream stands on it. </w:t>
-      </w:r>
-    </w:p>
-    <w:p>
-      <w:pPr>
-        <w:pStyle w:val="BodyText"/>
-        <w:numPr>
-          <w:ilvl w:val="0"/>
-          <w:numId w:val="4"/>
-        </w:numPr>
-        <w:tabs>
-          <w:tab w:val="clear" w:pos="1134"/>
-          <w:tab w:val="left" w:pos="829" w:leader="none"/>
-        </w:tabs>
-        <w:bidi w:val="0"/>
-        <w:spacing w:before="120" w:after="0"/>
-        <w:ind w:hanging="283" w:left="829"/>
-        <w:jc w:val="left"/>
-        <w:rPr/>
-      </w:pPr>
-      <w:r>
-        <w:rPr/>
-        <w:t xml:space="preserve">Run </w:t>
-      </w:r>
-      <w:r>
-        <w:rPr>
-          <w:rStyle w:val="SourceText"/>
-        </w:rPr>
-        <w:t>/crew:onboard</w:t>
-      </w:r>
-      <w:r>
-        <w:rPr/>
-        <w:t xml:space="preserve"> so the crew learns the codebase once and writes it down. </w:t>
-      </w:r>
-    </w:p>
-    <w:p>
-      <w:pPr>
-        <w:pStyle w:val="BodyText"/>
-        <w:numPr>
-          <w:ilvl w:val="0"/>
-          <w:numId w:val="4"/>
-        </w:numPr>
-        <w:tabs>
-          <w:tab w:val="clear" w:pos="1134"/>
-          <w:tab w:val="left" w:pos="829" w:leader="none"/>
-        </w:tabs>
-        <w:bidi w:val="0"/>
-        <w:ind w:hanging="283" w:left="829"/>
-        <w:jc w:val="left"/>
-        <w:rPr/>
-      </w:pPr>
-      <w:r>
-        <w:rPr/>
-        <w:t xml:space="preserve">Write a ticket with </w:t>
-      </w:r>
-      <w:r>
-        <w:rPr>
-          <w:rStyle w:val="SourceText"/>
-        </w:rPr>
-        <w:t>/crew:ticket</w:t>
-      </w:r>
-      <w:r>
-        <w:rPr/>
-        <w:t xml:space="preserve">, then </w:t>
-      </w:r>
-      <w:r>
-        <w:rPr>
-          <w:rStyle w:val="SourceText"/>
-        </w:rPr>
-        <w:t>/crew:work</w:t>
-      </w:r>
-      <w:r>
-        <w:rPr/>
-        <w:t xml:space="preserve">. Read the review. Merge when the gate is green. </w:t>
-      </w:r>
-    </w:p>
-    <w:p>
-      <w:pPr>
-        <w:pStyle w:val="Heading2"/>
-        <w:bidi w:val="0"/>
-        <w:jc w:val="left"/>
-        <w:rPr/>
-      </w:pPr>
-      <w:r>
-        <w:rPr/>
-        <w:t>11. Glossary</w:t>
-      </w:r>
-    </w:p>
-    <w:tbl>
-      <w:tblPr>
-        <w:tblW w:w="5000" w:type="pct"/>
-        <w:jc w:val="left"/>
-        <w:tblInd w:w="28" w:type="dxa"/>
-        <w:tblLayout w:type="fixed"/>
-        <w:tblCellMar>
-          <w:top w:w="28" w:type="dxa"/>
-          <w:left w:w="28" w:type="dxa"/>
-          <w:bottom w:w="28" w:type="dxa"/>
-          <w:right w:w="28" w:type="dxa"/>
-        </w:tblCellMar>
-      </w:tblPr>
-      <w:tblGrid>
-        <w:gridCol w:w="2550"/>
-        <w:gridCol w:w="8789"/>
-      </w:tblGrid>
-      <w:tr>
-        <w:trPr>
-          <w:tblHeader w:val="true"/>
-        </w:trPr>
-        <w:tc>
-          <w:tcPr>
-            <w:tcW w:w="2550" w:type="dxa"/>
-            <w:tcBorders/>
-            <w:vAlign w:val="center"/>
-          </w:tcPr>
-          <w:p>
-            <w:pPr>
-              <w:pStyle w:val="TableHeading"/>
-              <w:suppressLineNumbers/>
-              <w:shd w:fill="1F4E79" w:val="clear"/>
-              <w:bidi w:val="0"/>
-              <w:spacing w:before="120" w:after="120"/>
-              <w:jc w:val="left"/>
-              <w:rPr/>
-            </w:pPr>
-            <w:r>
-              <w:rPr/>
-              <w:t>Term</w:t>
-            </w:r>
-          </w:p>
-        </w:tc>
-        <w:tc>
-          <w:tcPr>
-            <w:tcW w:w="8789" w:type="dxa"/>
-            <w:tcBorders/>
-            <w:vAlign w:val="center"/>
-          </w:tcPr>
-          <w:p>
-            <w:pPr>
-              <w:pStyle w:val="TableHeading"/>
-              <w:suppressLineNumbers/>
-              <w:shd w:fill="1F4E79" w:val="clear"/>
-              <w:bidi w:val="0"/>
-              <w:spacing w:before="120" w:after="120"/>
-              <w:jc w:val="left"/>
-              <w:rPr/>
-            </w:pPr>
-            <w:r>
-              <w:rPr/>
               <w:t>Meaning</w:t>
             </w:r>
           </w:p>
@@ -6102,7 +5327,7 @@
         <w:trPr/>
         <w:tc>
           <w:tcPr>
-            <w:tcW w:w="2550" w:type="dxa"/>
+            <w:tcW w:w="2634" w:type="dxa"/>
             <w:tcBorders/>
             <w:vAlign w:val="center"/>
           </w:tcPr>
@@ -6122,7 +5347,7 @@
         </w:tc>
         <w:tc>
           <w:tcPr>
-            <w:tcW w:w="8789" w:type="dxa"/>
+            <w:tcW w:w="8705" w:type="dxa"/>
             <w:tcBorders/>
             <w:vAlign w:val="center"/>
           </w:tcPr>
@@ -6145,7 +5370,7 @@
         <w:trPr/>
         <w:tc>
           <w:tcPr>
-            <w:tcW w:w="2550" w:type="dxa"/>
+            <w:tcW w:w="2634" w:type="dxa"/>
             <w:tcBorders/>
             <w:vAlign w:val="center"/>
           </w:tcPr>
@@ -6165,7 +5390,7 @@
         </w:tc>
         <w:tc>
           <w:tcPr>
-            <w:tcW w:w="8789" w:type="dxa"/>
+            <w:tcW w:w="8705" w:type="dxa"/>
             <w:tcBorders/>
             <w:vAlign w:val="center"/>
           </w:tcPr>
@@ -6188,7 +5413,7 @@
         <w:trPr/>
         <w:tc>
           <w:tcPr>
-            <w:tcW w:w="2550" w:type="dxa"/>
+            <w:tcW w:w="2634" w:type="dxa"/>
             <w:tcBorders/>
             <w:vAlign w:val="center"/>
           </w:tcPr>
@@ -6208,7 +5433,7 @@
         </w:tc>
         <w:tc>
           <w:tcPr>
-            <w:tcW w:w="8789" w:type="dxa"/>
+            <w:tcW w:w="8705" w:type="dxa"/>
             <w:tcBorders/>
             <w:vAlign w:val="center"/>
           </w:tcPr>
@@ -6231,7 +5456,7 @@
         <w:trPr/>
         <w:tc>
           <w:tcPr>
-            <w:tcW w:w="2550" w:type="dxa"/>
+            <w:tcW w:w="2634" w:type="dxa"/>
             <w:tcBorders/>
             <w:vAlign w:val="center"/>
           </w:tcPr>
@@ -6251,7 +5476,7 @@
         </w:tc>
         <w:tc>
           <w:tcPr>
-            <w:tcW w:w="8789" w:type="dxa"/>
+            <w:tcW w:w="8705" w:type="dxa"/>
             <w:tcBorders/>
             <w:vAlign w:val="center"/>
           </w:tcPr>
@@ -6274,7 +5499,7 @@
         <w:trPr/>
         <w:tc>
           <w:tcPr>
-            <w:tcW w:w="2550" w:type="dxa"/>
+            <w:tcW w:w="2634" w:type="dxa"/>
             <w:tcBorders/>
             <w:vAlign w:val="center"/>
           </w:tcPr>
@@ -6294,7 +5519,7 @@
         </w:tc>
         <w:tc>
           <w:tcPr>
-            <w:tcW w:w="8789" w:type="dxa"/>
+            <w:tcW w:w="8705" w:type="dxa"/>
             <w:tcBorders/>
             <w:vAlign w:val="center"/>
           </w:tcPr>
@@ -6317,7 +5542,7 @@
         <w:trPr/>
         <w:tc>
           <w:tcPr>
-            <w:tcW w:w="2550" w:type="dxa"/>
+            <w:tcW w:w="2634" w:type="dxa"/>
             <w:tcBorders/>
             <w:vAlign w:val="center"/>
           </w:tcPr>
@@ -6337,7 +5562,7 @@
         </w:tc>
         <w:tc>
           <w:tcPr>
-            <w:tcW w:w="8789" w:type="dxa"/>
+            <w:tcW w:w="8705" w:type="dxa"/>
             <w:tcBorders/>
             <w:vAlign w:val="center"/>
           </w:tcPr>
@@ -6360,7 +5585,7 @@
         <w:trPr/>
         <w:tc>
           <w:tcPr>
-            <w:tcW w:w="2550" w:type="dxa"/>
+            <w:tcW w:w="2634" w:type="dxa"/>
             <w:tcBorders/>
             <w:vAlign w:val="center"/>
           </w:tcPr>
@@ -6380,7 +5605,7 @@
         </w:tc>
         <w:tc>
           <w:tcPr>
-            <w:tcW w:w="8789" w:type="dxa"/>
+            <w:tcW w:w="8705" w:type="dxa"/>
             <w:tcBorders/>
             <w:vAlign w:val="center"/>
           </w:tcPr>
@@ -6403,7 +5628,7 @@
         <w:trPr/>
         <w:tc>
           <w:tcPr>
-            <w:tcW w:w="2550" w:type="dxa"/>
+            <w:tcW w:w="2634" w:type="dxa"/>
             <w:tcBorders/>
             <w:vAlign w:val="center"/>
           </w:tcPr>
@@ -6423,7 +5648,7 @@
         </w:tc>
         <w:tc>
           <w:tcPr>
-            <w:tcW w:w="8789" w:type="dxa"/>
+            <w:tcW w:w="8705" w:type="dxa"/>
             <w:tcBorders/>
             <w:vAlign w:val="center"/>
           </w:tcPr>
@@ -6446,7 +5671,7 @@
         <w:trPr/>
         <w:tc>
           <w:tcPr>
-            <w:tcW w:w="2550" w:type="dxa"/>
+            <w:tcW w:w="2634" w:type="dxa"/>
             <w:tcBorders/>
             <w:vAlign w:val="center"/>
           </w:tcPr>
@@ -6466,7 +5691,7 @@
         </w:tc>
         <w:tc>
           <w:tcPr>
-            <w:tcW w:w="8789" w:type="dxa"/>
+            <w:tcW w:w="8705" w:type="dxa"/>
             <w:tcBorders/>
             <w:vAlign w:val="center"/>
           </w:tcPr>
@@ -6489,7 +5714,7 @@
         <w:trPr/>
         <w:tc>
           <w:tcPr>
-            <w:tcW w:w="2550" w:type="dxa"/>
+            <w:tcW w:w="2634" w:type="dxa"/>
             <w:tcBorders/>
             <w:vAlign w:val="center"/>
           </w:tcPr>
@@ -6509,7 +5734,7 @@
         </w:tc>
         <w:tc>
           <w:tcPr>
-            <w:tcW w:w="8789" w:type="dxa"/>
+            <w:tcW w:w="8705" w:type="dxa"/>
             <w:tcBorders/>
             <w:vAlign w:val="center"/>
           </w:tcPr>
@@ -6539,17 +5764,87 @@
       </w:pPr>
       <w:r>
         <w:rPr/>
-        <w:t xml:space="preserve">Provenance: figures are read from the repository at commit 621d50dc (main) and branch crew-stop-gate-record at b6e8c4bb; counts are 28 commands, 54 agents, 20 skills, 20 hook registrations, 51 test modules. Review counts are from </w:t>
+        <w:t xml:space="preserve">Provenance: figures are read from the repository at commit 541b2b70; counts are 28 commands, 54 role definitions (13 on the growth ladder, 40 specialists, 1 PM), 20 skills, 20 hook registrations, 65 files under </w:t>
       </w:r>
       <w:r>
         <w:rPr>
           <w:rStyle w:val="SourceText"/>
         </w:rPr>
-        <w:t>.crew/metrics.md</w:t>
-      </w:r>
-      <w:r>
-        <w:rPr/>
-        <w:t>. Not verified: the Stop-gate fix's effect on live sessions, pending merge.</w:t>
+        <w:t>plugin/crew/tests/</w:t>
+      </w:r>
+      <w:r>
+        <w:rPr/>
+        <w:t xml:space="preserve">, 19 sections in </w:t>
+      </w:r>
+      <w:r>
+        <w:rPr>
+          <w:rStyle w:val="SourceText"/>
+        </w:rPr>
+        <w:t>CONFIG.md</w:t>
+      </w:r>
+      <w:r>
+        <w:rPr/>
+        <w:t xml:space="preserve">. The "what changed recently" table is drawn from </w:t>
+      </w:r>
+      <w:r>
+        <w:rPr>
+          <w:rStyle w:val="SourceText"/>
+        </w:rPr>
+        <w:t>CHANGELOG.md</w:t>
+      </w:r>
+      <w:r>
+        <w:rPr/>
+        <w:t xml:space="preserve">'s </w:t>
+      </w:r>
+      <w:r>
+        <w:rPr>
+          <w:rStyle w:val="SourceText"/>
+        </w:rPr>
+        <w:t>[Unreleased]</w:t>
+      </w:r>
+      <w:r>
+        <w:rPr/>
+        <w:t xml:space="preserve"> entry for crew 0.20.11. Not verified: this document's counts against any commit after 541b2b70; the requesting brief for this document set expected 53 roles, and the code at this commit carries 54 -- both </w:t>
+      </w:r>
+      <w:r>
+        <w:rPr>
+          <w:rStyle w:val="SourceText"/>
+        </w:rPr>
+        <w:t>crew_state.py</w:t>
+      </w:r>
+      <w:r>
+        <w:rPr/>
+        <w:t xml:space="preserve">'s </w:t>
+      </w:r>
+      <w:r>
+        <w:rPr>
+          <w:rStyle w:val="SourceText"/>
+        </w:rPr>
+        <w:t>ROLE_TIERS</w:t>
+      </w:r>
+      <w:r>
+        <w:rPr/>
+        <w:t>/</w:t>
+      </w:r>
+      <w:r>
+        <w:rPr>
+          <w:rStyle w:val="SourceText"/>
+        </w:rPr>
+        <w:t>SPECIALIST_ROLES</w:t>
+      </w:r>
+      <w:r>
+        <w:rPr/>
+        <w:t xml:space="preserve"> and the file count under </w:t>
+      </w:r>
+      <w:r>
+        <w:rPr>
+          <w:rStyle w:val="SourceText"/>
+        </w:rPr>
+        <w:t>plugin/crew/agents/</w:t>
+      </w:r>
+      <w:r>
+        <w:rPr/>
+        <w:t xml:space="preserve"> agree on 54, so that is the figure used here.</w:t>
       </w:r>
     </w:p>
     <w:sectPr>
@@ -6844,143 +6139,6 @@
   <w:abstractNum w:abstractNumId="3">
     <w:lvl w:ilvl="0">
       <w:start w:val="1"/>
-      <w:numFmt w:val="bullet"/>
-      <w:lvlText w:val=""/>
-      <w:lvlJc w:val="left"/>
-      <w:pPr>
-        <w:tabs>
-          <w:tab w:val="num" w:pos="709"/>
-        </w:tabs>
-        <w:ind w:left="709" w:hanging="283"/>
-      </w:pPr>
-      <w:rPr>
-        <w:rFonts w:ascii="Symbol" w:hAnsi="Symbol" w:cs="Symbol" w:hint="default"/>
-      </w:rPr>
-    </w:lvl>
-    <w:lvl w:ilvl="1">
-      <w:start w:val="1"/>
-      <w:numFmt w:val="bullet"/>
-      <w:lvlText w:val=""/>
-      <w:lvlJc w:val="left"/>
-      <w:pPr>
-        <w:tabs>
-          <w:tab w:val="num" w:pos="1418"/>
-        </w:tabs>
-        <w:ind w:left="1418" w:hanging="283"/>
-      </w:pPr>
-      <w:rPr>
-        <w:rFonts w:ascii="Symbol" w:hAnsi="Symbol" w:cs="Symbol" w:hint="default"/>
-      </w:rPr>
-    </w:lvl>
-    <w:lvl w:ilvl="2">
-      <w:start w:val="1"/>
-      <w:numFmt w:val="bullet"/>
-      <w:lvlText w:val=""/>
-      <w:lvlJc w:val="left"/>
-      <w:pPr>
-        <w:tabs>
-          <w:tab w:val="num" w:pos="2127"/>
-        </w:tabs>
-        <w:ind w:left="2127" w:hanging="283"/>
-      </w:pPr>
-      <w:rPr>
-        <w:rFonts w:ascii="Symbol" w:hAnsi="Symbol" w:cs="Symbol" w:hint="default"/>
-      </w:rPr>
-    </w:lvl>
-    <w:lvl w:ilvl="3">
-      <w:start w:val="1"/>
-      <w:numFmt w:val="bullet"/>
-      <w:lvlText w:val=""/>
-      <w:lvlJc w:val="left"/>
-      <w:pPr>
-        <w:tabs>
-          <w:tab w:val="num" w:pos="2836"/>
-        </w:tabs>
-        <w:ind w:left="2836" w:hanging="283"/>
-      </w:pPr>
-      <w:rPr>
-        <w:rFonts w:ascii="Symbol" w:hAnsi="Symbol" w:cs="Symbol" w:hint="default"/>
-      </w:rPr>
-    </w:lvl>
-    <w:lvl w:ilvl="4">
-      <w:start w:val="1"/>
-      <w:numFmt w:val="bullet"/>
-      <w:lvlText w:val=""/>
-      <w:lvlJc w:val="left"/>
-      <w:pPr>
-        <w:tabs>
-          <w:tab w:val="num" w:pos="3545"/>
-        </w:tabs>
-        <w:ind w:left="3545" w:hanging="283"/>
-      </w:pPr>
-      <w:rPr>
-        <w:rFonts w:ascii="Symbol" w:hAnsi="Symbol" w:cs="Symbol" w:hint="default"/>
-      </w:rPr>
-    </w:lvl>
-    <w:lvl w:ilvl="5">
-      <w:start w:val="1"/>
-      <w:numFmt w:val="bullet"/>
-      <w:lvlText w:val=""/>
-      <w:lvlJc w:val="left"/>
-      <w:pPr>
-        <w:tabs>
-          <w:tab w:val="num" w:pos="4254"/>
-        </w:tabs>
-        <w:ind w:left="4254" w:hanging="283"/>
-      </w:pPr>
-      <w:rPr>
-        <w:rFonts w:ascii="Symbol" w:hAnsi="Symbol" w:cs="Symbol" w:hint="default"/>
-      </w:rPr>
-    </w:lvl>
-    <w:lvl w:ilvl="6">
-      <w:start w:val="1"/>
-      <w:numFmt w:val="bullet"/>
-      <w:lvlText w:val=""/>
-      <w:lvlJc w:val="left"/>
-      <w:pPr>
-        <w:tabs>
-          <w:tab w:val="num" w:pos="4963"/>
-        </w:tabs>
-        <w:ind w:left="4963" w:hanging="283"/>
-      </w:pPr>
-      <w:rPr>
-        <w:rFonts w:ascii="Symbol" w:hAnsi="Symbol" w:cs="Symbol" w:hint="default"/>
-      </w:rPr>
-    </w:lvl>
-    <w:lvl w:ilvl="7">
-      <w:start w:val="1"/>
-      <w:numFmt w:val="bullet"/>
-      <w:lvlText w:val=""/>
-      <w:lvlJc w:val="left"/>
-      <w:pPr>
-        <w:tabs>
-          <w:tab w:val="num" w:pos="5672"/>
-        </w:tabs>
-        <w:ind w:left="5672" w:hanging="283"/>
-      </w:pPr>
-      <w:rPr>
-        <w:rFonts w:ascii="Symbol" w:hAnsi="Symbol" w:cs="Symbol" w:hint="default"/>
-      </w:rPr>
-    </w:lvl>
-    <w:lvl w:ilvl="8">
-      <w:start w:val="1"/>
-      <w:numFmt w:val="bullet"/>
-      <w:lvlText w:val=""/>
-      <w:lvlJc w:val="left"/>
-      <w:pPr>
-        <w:tabs>
-          <w:tab w:val="num" w:pos="6381"/>
-        </w:tabs>
-        <w:ind w:left="6381" w:hanging="283"/>
-      </w:pPr>
-      <w:rPr>
-        <w:rFonts w:ascii="Symbol" w:hAnsi="Symbol" w:cs="Symbol" w:hint="default"/>
-      </w:rPr>
-    </w:lvl>
-  </w:abstractNum>
-  <w:abstractNum w:abstractNumId="4">
-    <w:lvl w:ilvl="0">
-      <w:start w:val="1"/>
       <w:numFmt w:val="decimal"/>
       <w:lvlText w:val="%1."/>
       <w:lvlJc w:val="left"/>
@@ -7097,7 +6255,7 @@
       <w:rPr/>
     </w:lvl>
   </w:abstractNum>
-  <w:abstractNum w:abstractNumId="5">
+  <w:abstractNum w:abstractNumId="4">
     <w:lvl w:ilvl="0">
       <w:start w:val="1"/>
       <w:numFmt w:val="none"/>
@@ -7229,9 +6387,6 @@
   </w:num>
   <w:num w:numId="4">
     <w:abstractNumId w:val="4"/>
-  </w:num>
-  <w:num w:numId="5">
-    <w:abstractNumId w:val="5"/>
   </w:num>
 </w:numbering>
 </file>
@@ -7259,12 +6414,12 @@
     <w:pPr>
       <w:widowControl w:val="false"/>
       <w:bidi w:val="0"/>
-      <w:spacing w:lineRule="auto" w:line="336" w:before="1134" w:after="1134"/>
+      <w:spacing w:lineRule="auto" w:line="348" w:before="1134" w:after="1134"/>
       <w:ind w:left="1134" w:right="1134"/>
     </w:pPr>
     <w:rPr>
-      <w:rFonts w:ascii="Calibri;Arial;sans-serif" w:hAnsi="Calibri;Arial;sans-serif" w:eastAsia="Calibri;Arial;sans-serif" w:cs="Calibri;Arial;sans-serif"/>
-      <w:color w:val="1A1A1A"/>
+      <w:rFonts w:ascii="Segoe UI;Calibri;Arial;sans-serif" w:hAnsi="Segoe UI;Calibri;Arial;sans-serif" w:eastAsia="Segoe UI;Calibri;Arial;sans-serif" w:cs="Segoe UI;Calibri;Arial;sans-serif"/>
+      <w:color w:val="1B1B1F"/>
       <w:sz w:val="22"/>
       <w:szCs w:val="22"/>
       <w:lang w:val="en-US" w:eastAsia="zh-CN" w:bidi="hi-IN"/>
@@ -7293,9 +6448,10 @@
     <w:qFormat/>
     <w:pPr>
       <w:pBdr>
-        <w:bottom w:val="single" w:sz="2" w:space="3" w:color="5C6670"/>
+        <w:bottom w:val="single" w:sz="2" w:space="3" w:color="DCDEE5"/>
       </w:pBdr>
-      <w:spacing w:before="480" w:after="120"/>
+      <w:spacing w:before="480" w:after="160"/>
+      <w:ind w:left="480" w:right="480"/>
       <w:outlineLvl w:val="1"/>
     </w:pPr>
     <w:rPr>
@@ -7314,6 +6470,7 @@
     <w:qFormat/>
     <w:pPr>
       <w:spacing w:before="320" w:after="120"/>
+      <w:ind w:left="320" w:right="320"/>
       <w:outlineLvl w:val="2"/>
     </w:pPr>
     <w:rPr>
@@ -7402,11 +6559,10 @@
     <w:name w:val="Table Contents"/>
     <w:basedOn w:val="BodyText"/>
     <w:qFormat/>
-    <w:pPr/>
-    <w:rPr>
-      <w:sz w:val="20"/>
-      <w:szCs w:val="20"/>
-    </w:rPr>
+    <w:pPr>
+      <w:jc w:val="left"/>
+    </w:pPr>
+    <w:rPr/>
   </w:style>
   <w:style w:type="paragraph" w:styleId="Index">
     <w:name w:val="Index"/>
@@ -7473,7 +6629,7 @@
     <w:qFormat/>
     <w:pPr/>
     <w:rPr>
-      <w:color w:val="5C6670"/>
+      <w:color w:val="5C5F6B"/>
       <w:sz w:val="19"/>
       <w:szCs w:val="19"/>
     </w:rPr>
@@ -7491,8 +6647,6 @@
       <w:b/>
       <w:bCs/>
       <w:color w:val="FFFFFF"/>
-      <w:sz w:val="20"/>
-      <w:szCs w:val="20"/>
     </w:rPr>
   </w:style>
 </w:styles>

</xml_diff>

<commit_message>
WIP backup before worktree cleanup 2026-10-07
</commit_message>
<xml_diff>
--- a/docs/guides/crew-capabilities.docx
+++ b/docs/guides/crew-capabilities.docx
@@ -12,7 +12,7 @@
       </w:pPr>
       <w:r>
         <w:rPr/>
-        <w:t>The crew plugin: what it does and why</w:t>
+        <w:t>The Crew Plugin: What It Does and Why</w:t>
       </w:r>
     </w:p>
     <w:p>
@@ -24,6 +24,8 @@
       </w:pPr>
       <w:r>
         <w:rPr/>
+        <w:t>Generated from useful-claude-add-ons@541b2b70 on 2026-09-22. Verify before trusting.</w:t>
+        <w:br/>
         <w:t xml:space="preserve">The combined guide: high-level and technical in one document. Two companion documents split it: </w:t>
       </w:r>
       <w:r>
@@ -44,17 +46,7 @@
       </w:r>
       <w:r>
         <w:rPr/>
-        <w:t xml:space="preserve"> for the people who run it. Written 20 September 2026 against crew 0.19.92 on </w:t>
-      </w:r>
-      <w:r>
-        <w:rPr>
-          <w:rStyle w:val="SourceText"/>
-        </w:rPr>
-        <w:t>main</w:t>
-      </w:r>
-      <w:r>
-        <w:rPr/>
-        <w:t xml:space="preserve"> (commit 621d50dc), with the Stop-gate fix (0.19.93) described as it stands in review.</w:t>
+        <w:t xml:space="preserve"> for the people who run it. Written against crew 0.20.11.</w:t>
       </w:r>
     </w:p>
     <w:p>
@@ -66,21 +58,21 @@
         <w:jc w:val="left"/>
         <w:rPr>
           <w:bdr w:val="single" w:sz="2" w:space="8" w:color="1F4E79"/>
-          <w:shd w:fill="F3F6FA" w:val="clear"/>
+          <w:shd w:fill="F6F7F9" w:val="clear"/>
         </w:rPr>
       </w:pPr>
       <w:r>
         <w:rPr>
           <w:b/>
           <w:bdr w:val="single" w:sz="2" w:space="8" w:color="1F4E79"/>
-          <w:shd w:fill="F3F6FA" w:val="clear"/>
+          <w:shd w:fill="F6F7F9" w:val="clear"/>
         </w:rPr>
         <w:t>In one paragraph.</w:t>
       </w:r>
       <w:r>
         <w:rPr>
           <w:bdr w:val="single" w:sz="2" w:space="8" w:color="1F4E79"/>
-          <w:shd w:fill="F3F6FA" w:val="clear"/>
+          <w:shd w:fill="F6F7F9" w:val="clear"/>
         </w:rPr>
         <w:t xml:space="preserve"> Crew turns Claude Code from a single assistant into a small, disciplined software team. One agent manages, one investigates, one implements, an independent one from a different AI vendor reviews, and automatic gates stop anything that fails from being merged or released. Everything it knows about a codebase is written down in files that live with the code, so nothing depends on one person's memory or one chat session. It exists because an AI that writes code, reviews its own work, and never loses focus is a fiction; crew makes each of those a separate, checkable step.</w:t>
       </w:r>
@@ -95,7 +87,7 @@
       </w:pPr>
       <w:r>
         <w:rPr/>
-        <w:t>1. The problem it solves</w:t>
+        <w:t>1. The Problem It Solves</w:t>
       </w:r>
     </w:p>
     <w:p>
@@ -242,7 +234,7 @@
       </w:pPr>
       <w:r>
         <w:rPr/>
-        <w:t>2. How it works, in plain terms</w:t>
+        <w:t>2. How It Works, in Plain Terms</w:t>
       </w:r>
     </w:p>
     <w:p>
@@ -254,21 +246,21 @@
         <w:jc w:val="left"/>
         <w:rPr>
           <w:bdr w:val="single" w:sz="24" w:space="10" w:color="1F4E79"/>
-          <w:shd w:fill="F7F9FB" w:val="clear"/>
+          <w:shd w:fill="F6F7F9" w:val="clear"/>
         </w:rPr>
       </w:pPr>
       <w:r>
         <w:rPr>
           <w:b/>
           <w:bdr w:val="single" w:sz="24" w:space="10" w:color="1F4E79"/>
-          <w:shd w:fill="F7F9FB" w:val="clear"/>
+          <w:shd w:fill="F6F7F9" w:val="clear"/>
         </w:rPr>
         <w:t>Think of it as a very small consultancy inside your editor.</w:t>
       </w:r>
       <w:r>
         <w:rPr>
           <w:bdr w:val="single" w:sz="24" w:space="10" w:color="1F4E79"/>
-          <w:shd w:fill="F7F9FB" w:val="clear"/>
+          <w:shd w:fill="F6F7F9" w:val="clear"/>
         </w:rPr>
         <w:t xml:space="preserve"> You write a ticket. A manager (the PM) decides who should do what and keeps the overall picture. A developer takes the ticket into a private workspace and does only that job. When it is done, a reviewer from a different company reads the change looking for defects, and reports them in a fixed format. A set of automatic checks runs before anything is merged or promoted, and if one fails, the release stops. Every decision and every lesson is written into files in the repository, so the next session, or the next person, starts where this one left off.</w:t>
       </w:r>
@@ -295,7 +287,7 @@
       </w:pPr>
       <w:r>
         <w:rPr/>
-        <w:t>The people, so to speak</w:t>
+        <w:t>The People, So to Speak</w:t>
       </w:r>
     </w:p>
     <w:tbl>
@@ -312,9 +304,9 @@
         </w:tblCellMar>
       </w:tblPr>
       <w:tblGrid>
-        <w:gridCol w:w="2480"/>
-        <w:gridCol w:w="4626"/>
-        <w:gridCol w:w="4233"/>
+        <w:gridCol w:w="2391"/>
+        <w:gridCol w:w="4300"/>
+        <w:gridCol w:w="4648"/>
       </w:tblGrid>
       <w:tr>
         <w:trPr>
@@ -322,7 +314,7 @@
         </w:trPr>
         <w:tc>
           <w:tcPr>
-            <w:tcW w:w="2480" w:type="dxa"/>
+            <w:tcW w:w="2391" w:type="dxa"/>
             <w:tcBorders/>
             <w:vAlign w:val="center"/>
           </w:tcPr>
@@ -344,7 +336,7 @@
         </w:tc>
         <w:tc>
           <w:tcPr>
-            <w:tcW w:w="4626" w:type="dxa"/>
+            <w:tcW w:w="4300" w:type="dxa"/>
             <w:tcBorders/>
             <w:vAlign w:val="center"/>
           </w:tcPr>
@@ -366,7 +358,7 @@
         </w:tc>
         <w:tc>
           <w:tcPr>
-            <w:tcW w:w="4233" w:type="dxa"/>
+            <w:tcW w:w="4648" w:type="dxa"/>
             <w:tcBorders/>
             <w:vAlign w:val="center"/>
           </w:tcPr>
@@ -391,7 +383,7 @@
         <w:trPr/>
         <w:tc>
           <w:tcPr>
-            <w:tcW w:w="2480" w:type="dxa"/>
+            <w:tcW w:w="2391" w:type="dxa"/>
             <w:tcBorders/>
             <w:vAlign w:val="center"/>
           </w:tcPr>
@@ -411,7 +403,7 @@
         </w:tc>
         <w:tc>
           <w:tcPr>
-            <w:tcW w:w="4626" w:type="dxa"/>
+            <w:tcW w:w="4300" w:type="dxa"/>
             <w:tcBorders/>
             <w:vAlign w:val="center"/>
           </w:tcPr>
@@ -431,30 +423,30 @@
         </w:tc>
         <w:tc>
           <w:tcPr>
-            <w:tcW w:w="4233" w:type="dxa"/>
-            <w:tcBorders/>
-            <w:vAlign w:val="center"/>
-          </w:tcPr>
-          <w:p>
-            <w:pPr>
-              <w:pStyle w:val="TableContents"/>
-              <w:bidi w:val="0"/>
-              <w:spacing w:before="120" w:after="120"/>
-              <w:jc w:val="left"/>
-              <w:rPr/>
-            </w:pPr>
-            <w:r>
-              <w:rPr/>
-              <w:t>Keeps the whole picture in one place. From 0.19.92 it is mechanically prevented from writing code by the write guard.</w:t>
-            </w:r>
-          </w:p>
-        </w:tc>
-      </w:tr>
-      <w:tr>
-        <w:trPr/>
-        <w:tc>
-          <w:tcPr>
-            <w:tcW w:w="2480" w:type="dxa"/>
+            <w:tcW w:w="4648" w:type="dxa"/>
+            <w:tcBorders/>
+            <w:vAlign w:val="center"/>
+          </w:tcPr>
+          <w:p>
+            <w:pPr>
+              <w:pStyle w:val="TableContents"/>
+              <w:bidi w:val="0"/>
+              <w:spacing w:before="120" w:after="120"/>
+              <w:jc w:val="left"/>
+              <w:rPr/>
+            </w:pPr>
+            <w:r>
+              <w:rPr/>
+              <w:t>Keeps the whole picture in one place. Mechanically prevented from writing code by the role write guard, off by default and turned on per repository.</w:t>
+            </w:r>
+          </w:p>
+        </w:tc>
+      </w:tr>
+      <w:tr>
+        <w:trPr/>
+        <w:tc>
+          <w:tcPr>
+            <w:tcW w:w="2391" w:type="dxa"/>
             <w:tcBorders/>
             <w:vAlign w:val="center"/>
           </w:tcPr>
@@ -474,7 +466,7 @@
         </w:tc>
         <w:tc>
           <w:tcPr>
-            <w:tcW w:w="4626" w:type="dxa"/>
+            <w:tcW w:w="4300" w:type="dxa"/>
             <w:tcBorders/>
             <w:vAlign w:val="center"/>
           </w:tcPr>
@@ -494,7 +486,7 @@
         </w:tc>
         <w:tc>
           <w:tcPr>
-            <w:tcW w:w="4233" w:type="dxa"/>
+            <w:tcW w:w="4648" w:type="dxa"/>
             <w:tcBorders/>
             <w:vAlign w:val="center"/>
           </w:tcPr>
@@ -517,7 +509,7 @@
         <w:trPr/>
         <w:tc>
           <w:tcPr>
-            <w:tcW w:w="2480" w:type="dxa"/>
+            <w:tcW w:w="2391" w:type="dxa"/>
             <w:tcBorders/>
             <w:vAlign w:val="center"/>
           </w:tcPr>
@@ -537,7 +529,7 @@
         </w:tc>
         <w:tc>
           <w:tcPr>
-            <w:tcW w:w="4626" w:type="dxa"/>
+            <w:tcW w:w="4300" w:type="dxa"/>
             <w:tcBorders/>
             <w:vAlign w:val="center"/>
           </w:tcPr>
@@ -557,7 +549,7 @@
         </w:tc>
         <w:tc>
           <w:tcPr>
-            <w:tcW w:w="4233" w:type="dxa"/>
+            <w:tcW w:w="4648" w:type="dxa"/>
             <w:tcBorders/>
             <w:vAlign w:val="center"/>
           </w:tcPr>
@@ -580,7 +572,7 @@
         <w:trPr/>
         <w:tc>
           <w:tcPr>
-            <w:tcW w:w="2480" w:type="dxa"/>
+            <w:tcW w:w="2391" w:type="dxa"/>
             <w:tcBorders/>
             <w:vAlign w:val="center"/>
           </w:tcPr>
@@ -600,7 +592,7 @@
         </w:tc>
         <w:tc>
           <w:tcPr>
-            <w:tcW w:w="4626" w:type="dxa"/>
+            <w:tcW w:w="4300" w:type="dxa"/>
             <w:tcBorders/>
             <w:vAlign w:val="center"/>
           </w:tcPr>
@@ -620,7 +612,7 @@
         </w:tc>
         <w:tc>
           <w:tcPr>
-            <w:tcW w:w="4233" w:type="dxa"/>
+            <w:tcW w:w="4648" w:type="dxa"/>
             <w:tcBorders/>
             <w:vAlign w:val="center"/>
           </w:tcPr>
@@ -643,7 +635,7 @@
         <w:trPr/>
         <w:tc>
           <w:tcPr>
-            <w:tcW w:w="2480" w:type="dxa"/>
+            <w:tcW w:w="2391" w:type="dxa"/>
             <w:tcBorders/>
             <w:vAlign w:val="center"/>
           </w:tcPr>
@@ -663,7 +655,7 @@
         </w:tc>
         <w:tc>
           <w:tcPr>
-            <w:tcW w:w="4626" w:type="dxa"/>
+            <w:tcW w:w="4300" w:type="dxa"/>
             <w:tcBorders/>
             <w:vAlign w:val="center"/>
           </w:tcPr>
@@ -683,7 +675,7 @@
         </w:tc>
         <w:tc>
           <w:tcPr>
-            <w:tcW w:w="4233" w:type="dxa"/>
+            <w:tcW w:w="4648" w:type="dxa"/>
             <w:tcBorders/>
             <w:vAlign w:val="center"/>
           </w:tcPr>
@@ -706,7 +698,7 @@
         <w:trPr/>
         <w:tc>
           <w:tcPr>
-            <w:tcW w:w="2480" w:type="dxa"/>
+            <w:tcW w:w="2391" w:type="dxa"/>
             <w:tcBorders/>
             <w:vAlign w:val="center"/>
           </w:tcPr>
@@ -726,7 +718,7 @@
         </w:tc>
         <w:tc>
           <w:tcPr>
-            <w:tcW w:w="4626" w:type="dxa"/>
+            <w:tcW w:w="4300" w:type="dxa"/>
             <w:tcBorders/>
             <w:vAlign w:val="center"/>
           </w:tcPr>
@@ -746,7 +738,7 @@
         </w:tc>
         <w:tc>
           <w:tcPr>
-            <w:tcW w:w="4233" w:type="dxa"/>
+            <w:tcW w:w="4648" w:type="dxa"/>
             <w:tcBorders/>
             <w:vAlign w:val="center"/>
           </w:tcPr>
@@ -769,7 +761,7 @@
         <w:trPr/>
         <w:tc>
           <w:tcPr>
-            <w:tcW w:w="2480" w:type="dxa"/>
+            <w:tcW w:w="2391" w:type="dxa"/>
             <w:tcBorders/>
             <w:vAlign w:val="center"/>
           </w:tcPr>
@@ -789,7 +781,7 @@
         </w:tc>
         <w:tc>
           <w:tcPr>
-            <w:tcW w:w="4626" w:type="dxa"/>
+            <w:tcW w:w="4300" w:type="dxa"/>
             <w:tcBorders/>
             <w:vAlign w:val="center"/>
           </w:tcPr>
@@ -809,7 +801,7 @@
         </w:tc>
         <w:tc>
           <w:tcPr>
-            <w:tcW w:w="4233" w:type="dxa"/>
+            <w:tcW w:w="4648" w:type="dxa"/>
             <w:tcBorders/>
             <w:vAlign w:val="center"/>
           </w:tcPr>
@@ -832,7 +824,7 @@
         <w:trPr/>
         <w:tc>
           <w:tcPr>
-            <w:tcW w:w="2480" w:type="dxa"/>
+            <w:tcW w:w="2391" w:type="dxa"/>
             <w:tcBorders/>
             <w:vAlign w:val="center"/>
           </w:tcPr>
@@ -852,7 +844,7 @@
         </w:tc>
         <w:tc>
           <w:tcPr>
-            <w:tcW w:w="4626" w:type="dxa"/>
+            <w:tcW w:w="4300" w:type="dxa"/>
             <w:tcBorders/>
             <w:vAlign w:val="center"/>
           </w:tcPr>
@@ -872,7 +864,7 @@
         </w:tc>
         <w:tc>
           <w:tcPr>
-            <w:tcW w:w="4233" w:type="dxa"/>
+            <w:tcW w:w="4648" w:type="dxa"/>
             <w:tcBorders/>
             <w:vAlign w:val="center"/>
           </w:tcPr>
@@ -901,7 +893,7 @@
       </w:pPr>
       <w:r>
         <w:rPr/>
-        <w:t>Tiers: the crew grows only when there is evidence it should</w:t>
+        <w:t>Tiers: The Crew Grows Only When There Is Evidence It Should</w:t>
       </w:r>
     </w:p>
     <w:tbl>
@@ -918,9 +910,9 @@
         </w:tblCellMar>
       </w:tblPr>
       <w:tblGrid>
-        <w:gridCol w:w="617"/>
-        <w:gridCol w:w="4031"/>
-        <w:gridCol w:w="6691"/>
+        <w:gridCol w:w="675"/>
+        <w:gridCol w:w="4043"/>
+        <w:gridCol w:w="6621"/>
       </w:tblGrid>
       <w:tr>
         <w:trPr>
@@ -928,7 +920,7 @@
         </w:trPr>
         <w:tc>
           <w:tcPr>
-            <w:tcW w:w="617" w:type="dxa"/>
+            <w:tcW w:w="675" w:type="dxa"/>
             <w:tcBorders/>
             <w:vAlign w:val="center"/>
           </w:tcPr>
@@ -950,7 +942,7 @@
         </w:tc>
         <w:tc>
           <w:tcPr>
-            <w:tcW w:w="4031" w:type="dxa"/>
+            <w:tcW w:w="4043" w:type="dxa"/>
             <w:tcBorders/>
             <w:vAlign w:val="center"/>
           </w:tcPr>
@@ -972,7 +964,7 @@
         </w:tc>
         <w:tc>
           <w:tcPr>
-            <w:tcW w:w="6691" w:type="dxa"/>
+            <w:tcW w:w="6621" w:type="dxa"/>
             <w:tcBorders/>
             <w:vAlign w:val="center"/>
           </w:tcPr>
@@ -997,7 +989,7 @@
         <w:trPr/>
         <w:tc>
           <w:tcPr>
-            <w:tcW w:w="617" w:type="dxa"/>
+            <w:tcW w:w="675" w:type="dxa"/>
             <w:tcBorders/>
             <w:vAlign w:val="center"/>
           </w:tcPr>
@@ -1017,7 +1009,7 @@
         </w:tc>
         <w:tc>
           <w:tcPr>
-            <w:tcW w:w="4031" w:type="dxa"/>
+            <w:tcW w:w="4043" w:type="dxa"/>
             <w:tcBorders/>
             <w:vAlign w:val="center"/>
           </w:tcPr>
@@ -1037,7 +1029,7 @@
         </w:tc>
         <w:tc>
           <w:tcPr>
-            <w:tcW w:w="6691" w:type="dxa"/>
+            <w:tcW w:w="6621" w:type="dxa"/>
             <w:tcBorders/>
             <w:vAlign w:val="center"/>
           </w:tcPr>
@@ -1060,7 +1052,7 @@
         <w:trPr/>
         <w:tc>
           <w:tcPr>
-            <w:tcW w:w="617" w:type="dxa"/>
+            <w:tcW w:w="675" w:type="dxa"/>
             <w:tcBorders/>
             <w:vAlign w:val="center"/>
           </w:tcPr>
@@ -1080,7 +1072,7 @@
         </w:tc>
         <w:tc>
           <w:tcPr>
-            <w:tcW w:w="4031" w:type="dxa"/>
+            <w:tcW w:w="4043" w:type="dxa"/>
             <w:tcBorders/>
             <w:vAlign w:val="center"/>
           </w:tcPr>
@@ -1100,7 +1092,7 @@
         </w:tc>
         <w:tc>
           <w:tcPr>
-            <w:tcW w:w="6691" w:type="dxa"/>
+            <w:tcW w:w="6621" w:type="dxa"/>
             <w:tcBorders/>
             <w:vAlign w:val="center"/>
           </w:tcPr>
@@ -1123,7 +1115,7 @@
         <w:trPr/>
         <w:tc>
           <w:tcPr>
-            <w:tcW w:w="617" w:type="dxa"/>
+            <w:tcW w:w="675" w:type="dxa"/>
             <w:tcBorders/>
             <w:vAlign w:val="center"/>
           </w:tcPr>
@@ -1143,7 +1135,7 @@
         </w:tc>
         <w:tc>
           <w:tcPr>
-            <w:tcW w:w="4031" w:type="dxa"/>
+            <w:tcW w:w="4043" w:type="dxa"/>
             <w:tcBorders/>
             <w:vAlign w:val="center"/>
           </w:tcPr>
@@ -1163,7 +1155,7 @@
         </w:tc>
         <w:tc>
           <w:tcPr>
-            <w:tcW w:w="6691" w:type="dxa"/>
+            <w:tcW w:w="6621" w:type="dxa"/>
             <w:tcBorders/>
             <w:vAlign w:val="center"/>
           </w:tcPr>
@@ -1186,7 +1178,7 @@
         <w:trPr/>
         <w:tc>
           <w:tcPr>
-            <w:tcW w:w="617" w:type="dxa"/>
+            <w:tcW w:w="675" w:type="dxa"/>
             <w:tcBorders/>
             <w:vAlign w:val="center"/>
           </w:tcPr>
@@ -1206,7 +1198,7 @@
         </w:tc>
         <w:tc>
           <w:tcPr>
-            <w:tcW w:w="4031" w:type="dxa"/>
+            <w:tcW w:w="4043" w:type="dxa"/>
             <w:tcBorders/>
             <w:vAlign w:val="center"/>
           </w:tcPr>
@@ -1226,7 +1218,7 @@
         </w:tc>
         <w:tc>
           <w:tcPr>
-            <w:tcW w:w="6691" w:type="dxa"/>
+            <w:tcW w:w="6621" w:type="dxa"/>
             <w:tcBorders/>
             <w:vAlign w:val="center"/>
           </w:tcPr>
@@ -1277,7 +1269,7 @@
       </w:pPr>
       <w:r>
         <w:rPr/>
-        <w:t>Specialists: 40 more roles you switch on per repository</w:t>
+        <w:t>Specialists: Forty More Roles You Switch on per Repository</w:t>
       </w:r>
     </w:p>
     <w:p>
@@ -1316,8 +1308,8 @@
         </w:tblCellMar>
       </w:tblPr>
       <w:tblGrid>
-        <w:gridCol w:w="2063"/>
-        <w:gridCol w:w="9276"/>
+        <w:gridCol w:w="2221"/>
+        <w:gridCol w:w="9118"/>
       </w:tblGrid>
       <w:tr>
         <w:trPr>
@@ -1325,7 +1317,7 @@
         </w:trPr>
         <w:tc>
           <w:tcPr>
-            <w:tcW w:w="2063" w:type="dxa"/>
+            <w:tcW w:w="2221" w:type="dxa"/>
             <w:tcBorders/>
             <w:vAlign w:val="center"/>
           </w:tcPr>
@@ -1347,7 +1339,7 @@
         </w:tc>
         <w:tc>
           <w:tcPr>
-            <w:tcW w:w="9276" w:type="dxa"/>
+            <w:tcW w:w="9118" w:type="dxa"/>
             <w:tcBorders/>
             <w:vAlign w:val="center"/>
           </w:tcPr>
@@ -1372,7 +1364,7 @@
         <w:trPr/>
         <w:tc>
           <w:tcPr>
-            <w:tcW w:w="2063" w:type="dxa"/>
+            <w:tcW w:w="2221" w:type="dxa"/>
             <w:tcBorders/>
             <w:vAlign w:val="center"/>
           </w:tcPr>
@@ -1392,7 +1384,7 @@
         </w:tc>
         <w:tc>
           <w:tcPr>
-            <w:tcW w:w="9276" w:type="dxa"/>
+            <w:tcW w:w="9118" w:type="dxa"/>
             <w:tcBorders/>
             <w:vAlign w:val="center"/>
           </w:tcPr>
@@ -1415,7 +1407,7 @@
         <w:trPr/>
         <w:tc>
           <w:tcPr>
-            <w:tcW w:w="2063" w:type="dxa"/>
+            <w:tcW w:w="2221" w:type="dxa"/>
             <w:tcBorders/>
             <w:vAlign w:val="center"/>
           </w:tcPr>
@@ -1435,7 +1427,7 @@
         </w:tc>
         <w:tc>
           <w:tcPr>
-            <w:tcW w:w="9276" w:type="dxa"/>
+            <w:tcW w:w="9118" w:type="dxa"/>
             <w:tcBorders/>
             <w:vAlign w:val="center"/>
           </w:tcPr>
@@ -1458,7 +1450,7 @@
         <w:trPr/>
         <w:tc>
           <w:tcPr>
-            <w:tcW w:w="2063" w:type="dxa"/>
+            <w:tcW w:w="2221" w:type="dxa"/>
             <w:tcBorders/>
             <w:vAlign w:val="center"/>
           </w:tcPr>
@@ -1478,7 +1470,7 @@
         </w:tc>
         <w:tc>
           <w:tcPr>
-            <w:tcW w:w="9276" w:type="dxa"/>
+            <w:tcW w:w="9118" w:type="dxa"/>
             <w:tcBorders/>
             <w:vAlign w:val="center"/>
           </w:tcPr>
@@ -1501,7 +1493,7 @@
         <w:trPr/>
         <w:tc>
           <w:tcPr>
-            <w:tcW w:w="2063" w:type="dxa"/>
+            <w:tcW w:w="2221" w:type="dxa"/>
             <w:tcBorders/>
             <w:vAlign w:val="center"/>
           </w:tcPr>
@@ -1521,7 +1513,7 @@
         </w:tc>
         <w:tc>
           <w:tcPr>
-            <w:tcW w:w="9276" w:type="dxa"/>
+            <w:tcW w:w="9118" w:type="dxa"/>
             <w:tcBorders/>
             <w:vAlign w:val="center"/>
           </w:tcPr>
@@ -1544,7 +1536,7 @@
         <w:trPr/>
         <w:tc>
           <w:tcPr>
-            <w:tcW w:w="2063" w:type="dxa"/>
+            <w:tcW w:w="2221" w:type="dxa"/>
             <w:tcBorders/>
             <w:vAlign w:val="center"/>
           </w:tcPr>
@@ -1564,7 +1556,7 @@
         </w:tc>
         <w:tc>
           <w:tcPr>
-            <w:tcW w:w="9276" w:type="dxa"/>
+            <w:tcW w:w="9118" w:type="dxa"/>
             <w:tcBorders/>
             <w:vAlign w:val="center"/>
           </w:tcPr>
@@ -1593,7 +1585,7 @@
       </w:pPr>
       <w:r>
         <w:rPr/>
-        <w:t>3. Commands: what you can ask for</w:t>
+        <w:t>3. Commands: What You Can Ask For</w:t>
       </w:r>
     </w:p>
     <w:p>
@@ -1615,7 +1607,7 @@
       </w:r>
       <w:r>
         <w:rPr/>
-        <w:t xml:space="preserve"> in Claude Code. The right-hand column says what it means for someone who does not read code.</w:t>
+        <w:t xml:space="preserve"> in Claude Code. 28 ship with crew. The right-hand column says what it means for someone who does not read code.</w:t>
       </w:r>
     </w:p>
     <w:tbl>
@@ -1632,9 +1624,9 @@
         </w:tblCellMar>
       </w:tblPr>
       <w:tblGrid>
-        <w:gridCol w:w="1942"/>
-        <w:gridCol w:w="5038"/>
-        <w:gridCol w:w="4359"/>
+        <w:gridCol w:w="2038"/>
+        <w:gridCol w:w="4915"/>
+        <w:gridCol w:w="4386"/>
       </w:tblGrid>
       <w:tr>
         <w:trPr>
@@ -1642,7 +1634,7 @@
         </w:trPr>
         <w:tc>
           <w:tcPr>
-            <w:tcW w:w="1942" w:type="dxa"/>
+            <w:tcW w:w="2038" w:type="dxa"/>
             <w:tcBorders/>
             <w:vAlign w:val="center"/>
           </w:tcPr>
@@ -1664,7 +1656,7 @@
         </w:tc>
         <w:tc>
           <w:tcPr>
-            <w:tcW w:w="5038" w:type="dxa"/>
+            <w:tcW w:w="4915" w:type="dxa"/>
             <w:tcBorders/>
             <w:vAlign w:val="center"/>
           </w:tcPr>
@@ -1686,7 +1678,7 @@
         </w:tc>
         <w:tc>
           <w:tcPr>
-            <w:tcW w:w="4359" w:type="dxa"/>
+            <w:tcW w:w="4386" w:type="dxa"/>
             <w:tcBorders/>
             <w:vAlign w:val="center"/>
           </w:tcPr>
@@ -1711,7 +1703,7 @@
         <w:trPr/>
         <w:tc>
           <w:tcPr>
-            <w:tcW w:w="1942" w:type="dxa"/>
+            <w:tcW w:w="2038" w:type="dxa"/>
             <w:tcBorders/>
             <w:vAlign w:val="center"/>
           </w:tcPr>
@@ -1731,7 +1723,7 @@
         </w:tc>
         <w:tc>
           <w:tcPr>
-            <w:tcW w:w="5038" w:type="dxa"/>
+            <w:tcW w:w="4915" w:type="dxa"/>
             <w:tcBorders/>
             <w:vAlign w:val="center"/>
           </w:tcPr>
@@ -1751,7 +1743,7 @@
         </w:tc>
         <w:tc>
           <w:tcPr>
-            <w:tcW w:w="4359" w:type="dxa"/>
+            <w:tcW w:w="4386" w:type="dxa"/>
             <w:tcBorders/>
             <w:vAlign w:val="center"/>
           </w:tcPr>
@@ -1774,7 +1766,7 @@
         <w:trPr/>
         <w:tc>
           <w:tcPr>
-            <w:tcW w:w="1942" w:type="dxa"/>
+            <w:tcW w:w="2038" w:type="dxa"/>
             <w:tcBorders/>
             <w:vAlign w:val="center"/>
           </w:tcPr>
@@ -1794,7 +1786,7 @@
         </w:tc>
         <w:tc>
           <w:tcPr>
-            <w:tcW w:w="5038" w:type="dxa"/>
+            <w:tcW w:w="4915" w:type="dxa"/>
             <w:tcBorders/>
             <w:vAlign w:val="center"/>
           </w:tcPr>
@@ -1814,7 +1806,7 @@
         </w:tc>
         <w:tc>
           <w:tcPr>
-            <w:tcW w:w="4359" w:type="dxa"/>
+            <w:tcW w:w="4386" w:type="dxa"/>
             <w:tcBorders/>
             <w:vAlign w:val="center"/>
           </w:tcPr>
@@ -1837,7 +1829,7 @@
         <w:trPr/>
         <w:tc>
           <w:tcPr>
-            <w:tcW w:w="1942" w:type="dxa"/>
+            <w:tcW w:w="2038" w:type="dxa"/>
             <w:tcBorders/>
             <w:vAlign w:val="center"/>
           </w:tcPr>
@@ -1857,7 +1849,7 @@
         </w:tc>
         <w:tc>
           <w:tcPr>
-            <w:tcW w:w="5038" w:type="dxa"/>
+            <w:tcW w:w="4915" w:type="dxa"/>
             <w:tcBorders/>
             <w:vAlign w:val="center"/>
           </w:tcPr>
@@ -1877,7 +1869,7 @@
         </w:tc>
         <w:tc>
           <w:tcPr>
-            <w:tcW w:w="4359" w:type="dxa"/>
+            <w:tcW w:w="4386" w:type="dxa"/>
             <w:tcBorders/>
             <w:vAlign w:val="center"/>
           </w:tcPr>
@@ -1900,7 +1892,7 @@
         <w:trPr/>
         <w:tc>
           <w:tcPr>
-            <w:tcW w:w="1942" w:type="dxa"/>
+            <w:tcW w:w="2038" w:type="dxa"/>
             <w:tcBorders/>
             <w:vAlign w:val="center"/>
           </w:tcPr>
@@ -1920,7 +1912,7 @@
         </w:tc>
         <w:tc>
           <w:tcPr>
-            <w:tcW w:w="5038" w:type="dxa"/>
+            <w:tcW w:w="4915" w:type="dxa"/>
             <w:tcBorders/>
             <w:vAlign w:val="center"/>
           </w:tcPr>
@@ -1940,7 +1932,7 @@
         </w:tc>
         <w:tc>
           <w:tcPr>
-            <w:tcW w:w="4359" w:type="dxa"/>
+            <w:tcW w:w="4386" w:type="dxa"/>
             <w:tcBorders/>
             <w:vAlign w:val="center"/>
           </w:tcPr>
@@ -1963,7 +1955,7 @@
         <w:trPr/>
         <w:tc>
           <w:tcPr>
-            <w:tcW w:w="1942" w:type="dxa"/>
+            <w:tcW w:w="2038" w:type="dxa"/>
             <w:tcBorders/>
             <w:vAlign w:val="center"/>
           </w:tcPr>
@@ -1983,7 +1975,7 @@
         </w:tc>
         <w:tc>
           <w:tcPr>
-            <w:tcW w:w="5038" w:type="dxa"/>
+            <w:tcW w:w="4915" w:type="dxa"/>
             <w:tcBorders/>
             <w:vAlign w:val="center"/>
           </w:tcPr>
@@ -2003,7 +1995,7 @@
         </w:tc>
         <w:tc>
           <w:tcPr>
-            <w:tcW w:w="4359" w:type="dxa"/>
+            <w:tcW w:w="4386" w:type="dxa"/>
             <w:tcBorders/>
             <w:vAlign w:val="center"/>
           </w:tcPr>
@@ -2026,7 +2018,7 @@
         <w:trPr/>
         <w:tc>
           <w:tcPr>
-            <w:tcW w:w="1942" w:type="dxa"/>
+            <w:tcW w:w="2038" w:type="dxa"/>
             <w:tcBorders/>
             <w:vAlign w:val="center"/>
           </w:tcPr>
@@ -2046,7 +2038,7 @@
         </w:tc>
         <w:tc>
           <w:tcPr>
-            <w:tcW w:w="5038" w:type="dxa"/>
+            <w:tcW w:w="4915" w:type="dxa"/>
             <w:tcBorders/>
             <w:vAlign w:val="center"/>
           </w:tcPr>
@@ -2066,7 +2058,7 @@
         </w:tc>
         <w:tc>
           <w:tcPr>
-            <w:tcW w:w="4359" w:type="dxa"/>
+            <w:tcW w:w="4386" w:type="dxa"/>
             <w:tcBorders/>
             <w:vAlign w:val="center"/>
           </w:tcPr>
@@ -2089,7 +2081,7 @@
         <w:trPr/>
         <w:tc>
           <w:tcPr>
-            <w:tcW w:w="1942" w:type="dxa"/>
+            <w:tcW w:w="2038" w:type="dxa"/>
             <w:tcBorders/>
             <w:vAlign w:val="center"/>
           </w:tcPr>
@@ -2109,7 +2101,7 @@
         </w:tc>
         <w:tc>
           <w:tcPr>
-            <w:tcW w:w="5038" w:type="dxa"/>
+            <w:tcW w:w="4915" w:type="dxa"/>
             <w:tcBorders/>
             <w:vAlign w:val="center"/>
           </w:tcPr>
@@ -2129,7 +2121,7 @@
         </w:tc>
         <w:tc>
           <w:tcPr>
-            <w:tcW w:w="4359" w:type="dxa"/>
+            <w:tcW w:w="4386" w:type="dxa"/>
             <w:tcBorders/>
             <w:vAlign w:val="center"/>
           </w:tcPr>
@@ -2152,7 +2144,7 @@
         <w:trPr/>
         <w:tc>
           <w:tcPr>
-            <w:tcW w:w="1942" w:type="dxa"/>
+            <w:tcW w:w="2038" w:type="dxa"/>
             <w:tcBorders/>
             <w:vAlign w:val="center"/>
           </w:tcPr>
@@ -2172,7 +2164,7 @@
         </w:tc>
         <w:tc>
           <w:tcPr>
-            <w:tcW w:w="5038" w:type="dxa"/>
+            <w:tcW w:w="4915" w:type="dxa"/>
             <w:tcBorders/>
             <w:vAlign w:val="center"/>
           </w:tcPr>
@@ -2192,7 +2184,7 @@
         </w:tc>
         <w:tc>
           <w:tcPr>
-            <w:tcW w:w="4359" w:type="dxa"/>
+            <w:tcW w:w="4386" w:type="dxa"/>
             <w:tcBorders/>
             <w:vAlign w:val="center"/>
           </w:tcPr>
@@ -2215,7 +2207,7 @@
         <w:trPr/>
         <w:tc>
           <w:tcPr>
-            <w:tcW w:w="1942" w:type="dxa"/>
+            <w:tcW w:w="2038" w:type="dxa"/>
             <w:tcBorders/>
             <w:vAlign w:val="center"/>
           </w:tcPr>
@@ -2235,7 +2227,7 @@
         </w:tc>
         <w:tc>
           <w:tcPr>
-            <w:tcW w:w="5038" w:type="dxa"/>
+            <w:tcW w:w="4915" w:type="dxa"/>
             <w:tcBorders/>
             <w:vAlign w:val="center"/>
           </w:tcPr>
@@ -2255,7 +2247,7 @@
         </w:tc>
         <w:tc>
           <w:tcPr>
-            <w:tcW w:w="4359" w:type="dxa"/>
+            <w:tcW w:w="4386" w:type="dxa"/>
             <w:tcBorders/>
             <w:vAlign w:val="center"/>
           </w:tcPr>
@@ -2278,7 +2270,7 @@
         <w:trPr/>
         <w:tc>
           <w:tcPr>
-            <w:tcW w:w="1942" w:type="dxa"/>
+            <w:tcW w:w="2038" w:type="dxa"/>
             <w:tcBorders/>
             <w:vAlign w:val="center"/>
           </w:tcPr>
@@ -2298,7 +2290,7 @@
         </w:tc>
         <w:tc>
           <w:tcPr>
-            <w:tcW w:w="5038" w:type="dxa"/>
+            <w:tcW w:w="4915" w:type="dxa"/>
             <w:tcBorders/>
             <w:vAlign w:val="center"/>
           </w:tcPr>
@@ -2318,7 +2310,7 @@
         </w:tc>
         <w:tc>
           <w:tcPr>
-            <w:tcW w:w="4359" w:type="dxa"/>
+            <w:tcW w:w="4386" w:type="dxa"/>
             <w:tcBorders/>
             <w:vAlign w:val="center"/>
           </w:tcPr>
@@ -2341,7 +2333,7 @@
         <w:trPr/>
         <w:tc>
           <w:tcPr>
-            <w:tcW w:w="1942" w:type="dxa"/>
+            <w:tcW w:w="2038" w:type="dxa"/>
             <w:tcBorders/>
             <w:vAlign w:val="center"/>
           </w:tcPr>
@@ -2361,7 +2353,7 @@
         </w:tc>
         <w:tc>
           <w:tcPr>
-            <w:tcW w:w="5038" w:type="dxa"/>
+            <w:tcW w:w="4915" w:type="dxa"/>
             <w:tcBorders/>
             <w:vAlign w:val="center"/>
           </w:tcPr>
@@ -2381,7 +2373,7 @@
         </w:tc>
         <w:tc>
           <w:tcPr>
-            <w:tcW w:w="4359" w:type="dxa"/>
+            <w:tcW w:w="4386" w:type="dxa"/>
             <w:tcBorders/>
             <w:vAlign w:val="center"/>
           </w:tcPr>
@@ -2404,7 +2396,7 @@
         <w:trPr/>
         <w:tc>
           <w:tcPr>
-            <w:tcW w:w="1942" w:type="dxa"/>
+            <w:tcW w:w="2038" w:type="dxa"/>
             <w:tcBorders/>
             <w:vAlign w:val="center"/>
           </w:tcPr>
@@ -2424,7 +2416,7 @@
         </w:tc>
         <w:tc>
           <w:tcPr>
-            <w:tcW w:w="5038" w:type="dxa"/>
+            <w:tcW w:w="4915" w:type="dxa"/>
             <w:tcBorders/>
             <w:vAlign w:val="center"/>
           </w:tcPr>
@@ -2444,7 +2436,7 @@
         </w:tc>
         <w:tc>
           <w:tcPr>
-            <w:tcW w:w="4359" w:type="dxa"/>
+            <w:tcW w:w="4386" w:type="dxa"/>
             <w:tcBorders/>
             <w:vAlign w:val="center"/>
           </w:tcPr>
@@ -2467,7 +2459,7 @@
         <w:trPr/>
         <w:tc>
           <w:tcPr>
-            <w:tcW w:w="1942" w:type="dxa"/>
+            <w:tcW w:w="2038" w:type="dxa"/>
             <w:tcBorders/>
             <w:vAlign w:val="center"/>
           </w:tcPr>
@@ -2487,7 +2479,7 @@
         </w:tc>
         <w:tc>
           <w:tcPr>
-            <w:tcW w:w="5038" w:type="dxa"/>
+            <w:tcW w:w="4915" w:type="dxa"/>
             <w:tcBorders/>
             <w:vAlign w:val="center"/>
           </w:tcPr>
@@ -2507,7 +2499,7 @@
         </w:tc>
         <w:tc>
           <w:tcPr>
-            <w:tcW w:w="4359" w:type="dxa"/>
+            <w:tcW w:w="4386" w:type="dxa"/>
             <w:tcBorders/>
             <w:vAlign w:val="center"/>
           </w:tcPr>
@@ -2530,7 +2522,7 @@
         <w:trPr/>
         <w:tc>
           <w:tcPr>
-            <w:tcW w:w="1942" w:type="dxa"/>
+            <w:tcW w:w="2038" w:type="dxa"/>
             <w:tcBorders/>
             <w:vAlign w:val="center"/>
           </w:tcPr>
@@ -2550,7 +2542,7 @@
         </w:tc>
         <w:tc>
           <w:tcPr>
-            <w:tcW w:w="5038" w:type="dxa"/>
+            <w:tcW w:w="4915" w:type="dxa"/>
             <w:tcBorders/>
             <w:vAlign w:val="center"/>
           </w:tcPr>
@@ -2570,7 +2562,7 @@
         </w:tc>
         <w:tc>
           <w:tcPr>
-            <w:tcW w:w="4359" w:type="dxa"/>
+            <w:tcW w:w="4386" w:type="dxa"/>
             <w:tcBorders/>
             <w:vAlign w:val="center"/>
           </w:tcPr>
@@ -2593,7 +2585,7 @@
         <w:trPr/>
         <w:tc>
           <w:tcPr>
-            <w:tcW w:w="1942" w:type="dxa"/>
+            <w:tcW w:w="2038" w:type="dxa"/>
             <w:tcBorders/>
             <w:vAlign w:val="center"/>
           </w:tcPr>
@@ -2613,7 +2605,7 @@
         </w:tc>
         <w:tc>
           <w:tcPr>
-            <w:tcW w:w="5038" w:type="dxa"/>
+            <w:tcW w:w="4915" w:type="dxa"/>
             <w:tcBorders/>
             <w:vAlign w:val="center"/>
           </w:tcPr>
@@ -2633,7 +2625,7 @@
         </w:tc>
         <w:tc>
           <w:tcPr>
-            <w:tcW w:w="4359" w:type="dxa"/>
+            <w:tcW w:w="4386" w:type="dxa"/>
             <w:tcBorders/>
             <w:vAlign w:val="center"/>
           </w:tcPr>
@@ -2656,7 +2648,7 @@
         <w:trPr/>
         <w:tc>
           <w:tcPr>
-            <w:tcW w:w="1942" w:type="dxa"/>
+            <w:tcW w:w="2038" w:type="dxa"/>
             <w:tcBorders/>
             <w:vAlign w:val="center"/>
           </w:tcPr>
@@ -2676,7 +2668,7 @@
         </w:tc>
         <w:tc>
           <w:tcPr>
-            <w:tcW w:w="5038" w:type="dxa"/>
+            <w:tcW w:w="4915" w:type="dxa"/>
             <w:tcBorders/>
             <w:vAlign w:val="center"/>
           </w:tcPr>
@@ -2696,7 +2688,7 @@
         </w:tc>
         <w:tc>
           <w:tcPr>
-            <w:tcW w:w="4359" w:type="dxa"/>
+            <w:tcW w:w="4386" w:type="dxa"/>
             <w:tcBorders/>
             <w:vAlign w:val="center"/>
           </w:tcPr>
@@ -2719,7 +2711,7 @@
         <w:trPr/>
         <w:tc>
           <w:tcPr>
-            <w:tcW w:w="1942" w:type="dxa"/>
+            <w:tcW w:w="2038" w:type="dxa"/>
             <w:tcBorders/>
             <w:vAlign w:val="center"/>
           </w:tcPr>
@@ -2739,7 +2731,7 @@
         </w:tc>
         <w:tc>
           <w:tcPr>
-            <w:tcW w:w="5038" w:type="dxa"/>
+            <w:tcW w:w="4915" w:type="dxa"/>
             <w:tcBorders/>
             <w:vAlign w:val="center"/>
           </w:tcPr>
@@ -2759,7 +2751,7 @@
         </w:tc>
         <w:tc>
           <w:tcPr>
-            <w:tcW w:w="4359" w:type="dxa"/>
+            <w:tcW w:w="4386" w:type="dxa"/>
             <w:tcBorders/>
             <w:vAlign w:val="center"/>
           </w:tcPr>
@@ -2782,7 +2774,7 @@
         <w:trPr/>
         <w:tc>
           <w:tcPr>
-            <w:tcW w:w="1942" w:type="dxa"/>
+            <w:tcW w:w="2038" w:type="dxa"/>
             <w:tcBorders/>
             <w:vAlign w:val="center"/>
           </w:tcPr>
@@ -2802,7 +2794,7 @@
         </w:tc>
         <w:tc>
           <w:tcPr>
-            <w:tcW w:w="5038" w:type="dxa"/>
+            <w:tcW w:w="4915" w:type="dxa"/>
             <w:tcBorders/>
             <w:vAlign w:val="center"/>
           </w:tcPr>
@@ -2822,7 +2814,7 @@
         </w:tc>
         <w:tc>
           <w:tcPr>
-            <w:tcW w:w="4359" w:type="dxa"/>
+            <w:tcW w:w="4386" w:type="dxa"/>
             <w:tcBorders/>
             <w:vAlign w:val="center"/>
           </w:tcPr>
@@ -2845,7 +2837,7 @@
         <w:trPr/>
         <w:tc>
           <w:tcPr>
-            <w:tcW w:w="1942" w:type="dxa"/>
+            <w:tcW w:w="2038" w:type="dxa"/>
             <w:tcBorders/>
             <w:vAlign w:val="center"/>
           </w:tcPr>
@@ -2865,7 +2857,7 @@
         </w:tc>
         <w:tc>
           <w:tcPr>
-            <w:tcW w:w="5038" w:type="dxa"/>
+            <w:tcW w:w="4915" w:type="dxa"/>
             <w:tcBorders/>
             <w:vAlign w:val="center"/>
           </w:tcPr>
@@ -2885,7 +2877,7 @@
         </w:tc>
         <w:tc>
           <w:tcPr>
-            <w:tcW w:w="4359" w:type="dxa"/>
+            <w:tcW w:w="4386" w:type="dxa"/>
             <w:tcBorders/>
             <w:vAlign w:val="center"/>
           </w:tcPr>
@@ -2908,7 +2900,7 @@
         <w:trPr/>
         <w:tc>
           <w:tcPr>
-            <w:tcW w:w="1942" w:type="dxa"/>
+            <w:tcW w:w="2038" w:type="dxa"/>
             <w:tcBorders/>
             <w:vAlign w:val="center"/>
           </w:tcPr>
@@ -2928,7 +2920,7 @@
         </w:tc>
         <w:tc>
           <w:tcPr>
-            <w:tcW w:w="5038" w:type="dxa"/>
+            <w:tcW w:w="4915" w:type="dxa"/>
             <w:tcBorders/>
             <w:vAlign w:val="center"/>
           </w:tcPr>
@@ -2948,7 +2940,7 @@
         </w:tc>
         <w:tc>
           <w:tcPr>
-            <w:tcW w:w="4359" w:type="dxa"/>
+            <w:tcW w:w="4386" w:type="dxa"/>
             <w:tcBorders/>
             <w:vAlign w:val="center"/>
           </w:tcPr>
@@ -2971,7 +2963,7 @@
         <w:trPr/>
         <w:tc>
           <w:tcPr>
-            <w:tcW w:w="1942" w:type="dxa"/>
+            <w:tcW w:w="2038" w:type="dxa"/>
             <w:tcBorders/>
             <w:vAlign w:val="center"/>
           </w:tcPr>
@@ -2991,7 +2983,7 @@
         </w:tc>
         <w:tc>
           <w:tcPr>
-            <w:tcW w:w="5038" w:type="dxa"/>
+            <w:tcW w:w="4915" w:type="dxa"/>
             <w:tcBorders/>
             <w:vAlign w:val="center"/>
           </w:tcPr>
@@ -3011,7 +3003,7 @@
         </w:tc>
         <w:tc>
           <w:tcPr>
-            <w:tcW w:w="4359" w:type="dxa"/>
+            <w:tcW w:w="4386" w:type="dxa"/>
             <w:tcBorders/>
             <w:vAlign w:val="center"/>
           </w:tcPr>
@@ -3034,7 +3026,7 @@
         <w:trPr/>
         <w:tc>
           <w:tcPr>
-            <w:tcW w:w="1942" w:type="dxa"/>
+            <w:tcW w:w="2038" w:type="dxa"/>
             <w:tcBorders/>
             <w:vAlign w:val="center"/>
           </w:tcPr>
@@ -3054,7 +3046,7 @@
         </w:tc>
         <w:tc>
           <w:tcPr>
-            <w:tcW w:w="5038" w:type="dxa"/>
+            <w:tcW w:w="4915" w:type="dxa"/>
             <w:tcBorders/>
             <w:vAlign w:val="center"/>
           </w:tcPr>
@@ -3074,7 +3066,7 @@
         </w:tc>
         <w:tc>
           <w:tcPr>
-            <w:tcW w:w="4359" w:type="dxa"/>
+            <w:tcW w:w="4386" w:type="dxa"/>
             <w:tcBorders/>
             <w:vAlign w:val="center"/>
           </w:tcPr>
@@ -3097,7 +3089,7 @@
         <w:trPr/>
         <w:tc>
           <w:tcPr>
-            <w:tcW w:w="1942" w:type="dxa"/>
+            <w:tcW w:w="2038" w:type="dxa"/>
             <w:tcBorders/>
             <w:vAlign w:val="center"/>
           </w:tcPr>
@@ -3117,7 +3109,7 @@
         </w:tc>
         <w:tc>
           <w:tcPr>
-            <w:tcW w:w="5038" w:type="dxa"/>
+            <w:tcW w:w="4915" w:type="dxa"/>
             <w:tcBorders/>
             <w:vAlign w:val="center"/>
           </w:tcPr>
@@ -3137,7 +3129,7 @@
         </w:tc>
         <w:tc>
           <w:tcPr>
-            <w:tcW w:w="4359" w:type="dxa"/>
+            <w:tcW w:w="4386" w:type="dxa"/>
             <w:tcBorders/>
             <w:vAlign w:val="center"/>
           </w:tcPr>
@@ -3166,7 +3158,7 @@
       </w:pPr>
       <w:r>
         <w:rPr/>
-        <w:t>4. Skills: the know-how behind the commands</w:t>
+        <w:t>4. Skills: The Know-How Behind the Commands</w:t>
       </w:r>
     </w:p>
     <w:p>
@@ -3195,8 +3187,8 @@
         </w:tblCellMar>
       </w:tblPr>
       <w:tblGrid>
-        <w:gridCol w:w="3641"/>
-        <w:gridCol w:w="7698"/>
+        <w:gridCol w:w="3417"/>
+        <w:gridCol w:w="7922"/>
       </w:tblGrid>
       <w:tr>
         <w:trPr>
@@ -3204,7 +3196,7 @@
         </w:trPr>
         <w:tc>
           <w:tcPr>
-            <w:tcW w:w="3641" w:type="dxa"/>
+            <w:tcW w:w="3417" w:type="dxa"/>
             <w:tcBorders/>
             <w:vAlign w:val="center"/>
           </w:tcPr>
@@ -3226,7 +3218,7 @@
         </w:tc>
         <w:tc>
           <w:tcPr>
-            <w:tcW w:w="7698" w:type="dxa"/>
+            <w:tcW w:w="7922" w:type="dxa"/>
             <w:tcBorders/>
             <w:vAlign w:val="center"/>
           </w:tcPr>
@@ -3251,7 +3243,7 @@
         <w:trPr/>
         <w:tc>
           <w:tcPr>
-            <w:tcW w:w="3641" w:type="dxa"/>
+            <w:tcW w:w="3417" w:type="dxa"/>
             <w:tcBorders/>
             <w:vAlign w:val="center"/>
           </w:tcPr>
@@ -3271,7 +3263,7 @@
         </w:tc>
         <w:tc>
           <w:tcPr>
-            <w:tcW w:w="7698" w:type="dxa"/>
+            <w:tcW w:w="7922" w:type="dxa"/>
             <w:tcBorders/>
             <w:vAlign w:val="center"/>
           </w:tcPr>
@@ -3294,7 +3286,7 @@
         <w:trPr/>
         <w:tc>
           <w:tcPr>
-            <w:tcW w:w="3641" w:type="dxa"/>
+            <w:tcW w:w="3417" w:type="dxa"/>
             <w:tcBorders/>
             <w:vAlign w:val="center"/>
           </w:tcPr>
@@ -3314,7 +3306,7 @@
         </w:tc>
         <w:tc>
           <w:tcPr>
-            <w:tcW w:w="7698" w:type="dxa"/>
+            <w:tcW w:w="7922" w:type="dxa"/>
             <w:tcBorders/>
             <w:vAlign w:val="center"/>
           </w:tcPr>
@@ -3337,7 +3329,7 @@
         <w:trPr/>
         <w:tc>
           <w:tcPr>
-            <w:tcW w:w="3641" w:type="dxa"/>
+            <w:tcW w:w="3417" w:type="dxa"/>
             <w:tcBorders/>
             <w:vAlign w:val="center"/>
           </w:tcPr>
@@ -3357,7 +3349,7 @@
         </w:tc>
         <w:tc>
           <w:tcPr>
-            <w:tcW w:w="7698" w:type="dxa"/>
+            <w:tcW w:w="7922" w:type="dxa"/>
             <w:tcBorders/>
             <w:vAlign w:val="center"/>
           </w:tcPr>
@@ -3380,7 +3372,7 @@
         <w:trPr/>
         <w:tc>
           <w:tcPr>
-            <w:tcW w:w="3641" w:type="dxa"/>
+            <w:tcW w:w="3417" w:type="dxa"/>
             <w:tcBorders/>
             <w:vAlign w:val="center"/>
           </w:tcPr>
@@ -3400,7 +3392,7 @@
         </w:tc>
         <w:tc>
           <w:tcPr>
-            <w:tcW w:w="7698" w:type="dxa"/>
+            <w:tcW w:w="7922" w:type="dxa"/>
             <w:tcBorders/>
             <w:vAlign w:val="center"/>
           </w:tcPr>
@@ -3423,7 +3415,7 @@
         <w:trPr/>
         <w:tc>
           <w:tcPr>
-            <w:tcW w:w="3641" w:type="dxa"/>
+            <w:tcW w:w="3417" w:type="dxa"/>
             <w:tcBorders/>
             <w:vAlign w:val="center"/>
           </w:tcPr>
@@ -3443,7 +3435,7 @@
         </w:tc>
         <w:tc>
           <w:tcPr>
-            <w:tcW w:w="7698" w:type="dxa"/>
+            <w:tcW w:w="7922" w:type="dxa"/>
             <w:tcBorders/>
             <w:vAlign w:val="center"/>
           </w:tcPr>
@@ -3466,7 +3458,7 @@
         <w:trPr/>
         <w:tc>
           <w:tcPr>
-            <w:tcW w:w="3641" w:type="dxa"/>
+            <w:tcW w:w="3417" w:type="dxa"/>
             <w:tcBorders/>
             <w:vAlign w:val="center"/>
           </w:tcPr>
@@ -3486,7 +3478,7 @@
         </w:tc>
         <w:tc>
           <w:tcPr>
-            <w:tcW w:w="7698" w:type="dxa"/>
+            <w:tcW w:w="7922" w:type="dxa"/>
             <w:tcBorders/>
             <w:vAlign w:val="center"/>
           </w:tcPr>
@@ -3509,7 +3501,7 @@
         <w:trPr/>
         <w:tc>
           <w:tcPr>
-            <w:tcW w:w="3641" w:type="dxa"/>
+            <w:tcW w:w="3417" w:type="dxa"/>
             <w:tcBorders/>
             <w:vAlign w:val="center"/>
           </w:tcPr>
@@ -3529,21 +3521,31 @@
         </w:tc>
         <w:tc>
           <w:tcPr>
-            <w:tcW w:w="7698" w:type="dxa"/>
-            <w:tcBorders/>
-            <w:vAlign w:val="center"/>
-          </w:tcPr>
-          <w:p>
-            <w:pPr>
-              <w:pStyle w:val="TableContents"/>
-              <w:bidi w:val="0"/>
-              <w:spacing w:before="120" w:after="120"/>
-              <w:jc w:val="left"/>
-              <w:rPr/>
-            </w:pPr>
-            <w:r>
-              <w:rPr/>
-              <w:t>The change-request template; document style for anything handed to a human; community practices for Claude Code; discovering skills from the open ecosystem.</w:t>
+            <w:tcW w:w="7922" w:type="dxa"/>
+            <w:tcBorders/>
+            <w:vAlign w:val="center"/>
+          </w:tcPr>
+          <w:p>
+            <w:pPr>
+              <w:pStyle w:val="TableContents"/>
+              <w:bidi w:val="0"/>
+              <w:spacing w:before="120" w:after="120"/>
+              <w:jc w:val="left"/>
+              <w:rPr/>
+            </w:pPr>
+            <w:r>
+              <w:rPr/>
+              <w:t xml:space="preserve">The change-request template; document style for anything handed to a human, including how HTML routes through </w:t>
+            </w:r>
+            <w:r>
+              <w:rPr>
+                <w:rStyle w:val="SourceText"/>
+              </w:rPr>
+              <w:t>doc-builder</w:t>
+            </w:r>
+            <w:r>
+              <w:rPr/>
+              <w:t>; community practices for Claude Code; discovering skills from the open ecosystem.</w:t>
             </w:r>
           </w:p>
         </w:tc>
@@ -3558,7 +3560,7 @@
       </w:pPr>
       <w:r>
         <w:rPr/>
-        <w:t>5. Safety: the gates and guards</w:t>
+        <w:t>5. Safety: The Gates and Guards</w:t>
       </w:r>
     </w:p>
     <w:p>
@@ -3597,9 +3599,9 @@
         </w:tblCellMar>
       </w:tblPr>
       <w:tblGrid>
-        <w:gridCol w:w="2301"/>
-        <w:gridCol w:w="5726"/>
-        <w:gridCol w:w="3312"/>
+        <w:gridCol w:w="2334"/>
+        <w:gridCol w:w="5649"/>
+        <w:gridCol w:w="3356"/>
       </w:tblGrid>
       <w:tr>
         <w:trPr>
@@ -3607,7 +3609,7 @@
         </w:trPr>
         <w:tc>
           <w:tcPr>
-            <w:tcW w:w="2301" w:type="dxa"/>
+            <w:tcW w:w="2334" w:type="dxa"/>
             <w:tcBorders/>
             <w:vAlign w:val="center"/>
           </w:tcPr>
@@ -3629,7 +3631,7 @@
         </w:tc>
         <w:tc>
           <w:tcPr>
-            <w:tcW w:w="5726" w:type="dxa"/>
+            <w:tcW w:w="5649" w:type="dxa"/>
             <w:tcBorders/>
             <w:vAlign w:val="center"/>
           </w:tcPr>
@@ -3651,7 +3653,7 @@
         </w:tc>
         <w:tc>
           <w:tcPr>
-            <w:tcW w:w="3312" w:type="dxa"/>
+            <w:tcW w:w="3356" w:type="dxa"/>
             <w:tcBorders/>
             <w:vAlign w:val="center"/>
           </w:tcPr>
@@ -3676,7 +3678,7 @@
         <w:trPr/>
         <w:tc>
           <w:tcPr>
-            <w:tcW w:w="2301" w:type="dxa"/>
+            <w:tcW w:w="2334" w:type="dxa"/>
             <w:tcBorders/>
             <w:vAlign w:val="center"/>
           </w:tcPr>
@@ -3696,7 +3698,7 @@
         </w:tc>
         <w:tc>
           <w:tcPr>
-            <w:tcW w:w="5726" w:type="dxa"/>
+            <w:tcW w:w="5649" w:type="dxa"/>
             <w:tcBorders/>
             <w:vAlign w:val="center"/>
           </w:tcPr>
@@ -3716,7 +3718,7 @@
         </w:tc>
         <w:tc>
           <w:tcPr>
-            <w:tcW w:w="3312" w:type="dxa"/>
+            <w:tcW w:w="3356" w:type="dxa"/>
             <w:tcBorders/>
             <w:vAlign w:val="center"/>
           </w:tcPr>
@@ -3739,7 +3741,7 @@
         <w:trPr/>
         <w:tc>
           <w:tcPr>
-            <w:tcW w:w="2301" w:type="dxa"/>
+            <w:tcW w:w="2334" w:type="dxa"/>
             <w:tcBorders/>
             <w:vAlign w:val="center"/>
           </w:tcPr>
@@ -3759,7 +3761,7 @@
         </w:tc>
         <w:tc>
           <w:tcPr>
-            <w:tcW w:w="5726" w:type="dxa"/>
+            <w:tcW w:w="5649" w:type="dxa"/>
             <w:tcBorders/>
             <w:vAlign w:val="center"/>
           </w:tcPr>
@@ -3799,7 +3801,7 @@
         </w:tc>
         <w:tc>
           <w:tcPr>
-            <w:tcW w:w="3312" w:type="dxa"/>
+            <w:tcW w:w="3356" w:type="dxa"/>
             <w:tcBorders/>
             <w:vAlign w:val="center"/>
           </w:tcPr>
@@ -3822,27 +3824,27 @@
         <w:trPr/>
         <w:tc>
           <w:tcPr>
-            <w:tcW w:w="2301" w:type="dxa"/>
-            <w:tcBorders/>
-            <w:vAlign w:val="center"/>
-          </w:tcPr>
-          <w:p>
-            <w:pPr>
-              <w:pStyle w:val="TableContents"/>
-              <w:bidi w:val="0"/>
-              <w:spacing w:before="120" w:after="120"/>
-              <w:jc w:val="left"/>
-              <w:rPr/>
-            </w:pPr>
-            <w:r>
-              <w:rPr/>
-              <w:t>Before a file write (new in 0.19.92)</w:t>
-            </w:r>
-          </w:p>
-        </w:tc>
-        <w:tc>
-          <w:tcPr>
-            <w:tcW w:w="5726" w:type="dxa"/>
+            <w:tcW w:w="2334" w:type="dxa"/>
+            <w:tcBorders/>
+            <w:vAlign w:val="center"/>
+          </w:tcPr>
+          <w:p>
+            <w:pPr>
+              <w:pStyle w:val="TableContents"/>
+              <w:bidi w:val="0"/>
+              <w:spacing w:before="120" w:after="120"/>
+              <w:jc w:val="left"/>
+              <w:rPr/>
+            </w:pPr>
+            <w:r>
+              <w:rPr/>
+              <w:t>Before a file write</w:t>
+            </w:r>
+          </w:p>
+        </w:tc>
+        <w:tc>
+          <w:tcPr>
+            <w:tcW w:w="5649" w:type="dxa"/>
             <w:tcBorders/>
             <w:vAlign w:val="center"/>
           </w:tcPr>
@@ -3862,7 +3864,7 @@
         </w:tc>
         <w:tc>
           <w:tcPr>
-            <w:tcW w:w="3312" w:type="dxa"/>
+            <w:tcW w:w="3356" w:type="dxa"/>
             <w:tcBorders/>
             <w:vAlign w:val="center"/>
           </w:tcPr>
@@ -3885,7 +3887,7 @@
         <w:trPr/>
         <w:tc>
           <w:tcPr>
-            <w:tcW w:w="2301" w:type="dxa"/>
+            <w:tcW w:w="2334" w:type="dxa"/>
             <w:tcBorders/>
             <w:vAlign w:val="center"/>
           </w:tcPr>
@@ -3905,7 +3907,7 @@
         </w:tc>
         <w:tc>
           <w:tcPr>
-            <w:tcW w:w="5726" w:type="dxa"/>
+            <w:tcW w:w="5649" w:type="dxa"/>
             <w:tcBorders/>
             <w:vAlign w:val="center"/>
           </w:tcPr>
@@ -3925,7 +3927,7 @@
         </w:tc>
         <w:tc>
           <w:tcPr>
-            <w:tcW w:w="3312" w:type="dxa"/>
+            <w:tcW w:w="3356" w:type="dxa"/>
             <w:tcBorders/>
             <w:vAlign w:val="center"/>
           </w:tcPr>
@@ -3948,7 +3950,7 @@
         <w:trPr/>
         <w:tc>
           <w:tcPr>
-            <w:tcW w:w="2301" w:type="dxa"/>
+            <w:tcW w:w="2334" w:type="dxa"/>
             <w:tcBorders/>
             <w:vAlign w:val="center"/>
           </w:tcPr>
@@ -3968,7 +3970,7 @@
         </w:tc>
         <w:tc>
           <w:tcPr>
-            <w:tcW w:w="5726" w:type="dxa"/>
+            <w:tcW w:w="5649" w:type="dxa"/>
             <w:tcBorders/>
             <w:vAlign w:val="center"/>
           </w:tcPr>
@@ -3988,7 +3990,7 @@
         </w:tc>
         <w:tc>
           <w:tcPr>
-            <w:tcW w:w="3312" w:type="dxa"/>
+            <w:tcW w:w="3356" w:type="dxa"/>
             <w:tcBorders/>
             <w:vAlign w:val="center"/>
           </w:tcPr>
@@ -4011,7 +4013,7 @@
         <w:trPr/>
         <w:tc>
           <w:tcPr>
-            <w:tcW w:w="2301" w:type="dxa"/>
+            <w:tcW w:w="2334" w:type="dxa"/>
             <w:tcBorders/>
             <w:vAlign w:val="center"/>
           </w:tcPr>
@@ -4031,41 +4033,41 @@
         </w:tc>
         <w:tc>
           <w:tcPr>
-            <w:tcW w:w="5726" w:type="dxa"/>
-            <w:tcBorders/>
-            <w:vAlign w:val="center"/>
-          </w:tcPr>
-          <w:p>
-            <w:pPr>
-              <w:pStyle w:val="TableContents"/>
-              <w:bidi w:val="0"/>
-              <w:spacing w:before="120" w:after="120"/>
-              <w:jc w:val="left"/>
-              <w:rPr/>
-            </w:pPr>
-            <w:r>
-              <w:rPr/>
-              <w:t>Runs the verification map for the files that changed; blocks the turn on failure.</w:t>
-            </w:r>
-          </w:p>
-        </w:tc>
-        <w:tc>
-          <w:tcPr>
-            <w:tcW w:w="3312" w:type="dxa"/>
-            <w:tcBorders/>
-            <w:vAlign w:val="center"/>
-          </w:tcPr>
-          <w:p>
-            <w:pPr>
-              <w:pStyle w:val="TableContents"/>
-              <w:bidi w:val="0"/>
-              <w:spacing w:before="120" w:after="120"/>
-              <w:jc w:val="left"/>
-              <w:rPr/>
-            </w:pPr>
-            <w:r>
-              <w:rPr/>
-              <w:t>The safety net under every change. Section 8 is about fixing it.</w:t>
+            <w:tcW w:w="5649" w:type="dxa"/>
+            <w:tcBorders/>
+            <w:vAlign w:val="center"/>
+          </w:tcPr>
+          <w:p>
+            <w:pPr>
+              <w:pStyle w:val="TableContents"/>
+              <w:bidi w:val="0"/>
+              <w:spacing w:before="120" w:after="120"/>
+              <w:jc w:val="left"/>
+              <w:rPr/>
+            </w:pPr>
+            <w:r>
+              <w:rPr/>
+              <w:t>Runs the verification map for the files that changed; blocks the turn on failure; now keeps the per-rule record even when one rule in the batch fails.</w:t>
+            </w:r>
+          </w:p>
+        </w:tc>
+        <w:tc>
+          <w:tcPr>
+            <w:tcW w:w="3356" w:type="dxa"/>
+            <w:tcBorders/>
+            <w:vAlign w:val="center"/>
+          </w:tcPr>
+          <w:p>
+            <w:pPr>
+              <w:pStyle w:val="TableContents"/>
+              <w:bidi w:val="0"/>
+              <w:spacing w:before="120" w:after="120"/>
+              <w:jc w:val="left"/>
+              <w:rPr/>
+            </w:pPr>
+            <w:r>
+              <w:rPr/>
+              <w:t>The safety net under every change, and no longer all-or-nothing.</w:t>
             </w:r>
           </w:p>
         </w:tc>
@@ -4134,7 +4136,7 @@
       </w:pPr>
       <w:r>
         <w:rPr/>
-        <w:t>6. Knowledge: what crew remembers, and where</w:t>
+        <w:t>6. Knowledge: What Crew Remembers, and Where</w:t>
       </w:r>
     </w:p>
     <w:p>
@@ -4347,7 +4349,7 @@
       </w:pPr>
       <w:r>
         <w:rPr/>
-        <w:t>7. What changed this week, and what it means</w:t>
+        <w:t>7. What Changed Recently, and What It Means</w:t>
       </w:r>
     </w:p>
     <w:p>
@@ -4359,17 +4361,27 @@
       </w:pPr>
       <w:r>
         <w:rPr/>
-        <w:t xml:space="preserve">Between 19 and 20 September, crew moved from 0.19.89 to 0.19.92 on </w:t>
+        <w:t xml:space="preserve">Crew is at 0.20.11. The most recent fix, recorded in </w:t>
       </w:r>
       <w:r>
         <w:rPr>
           <w:rStyle w:val="SourceText"/>
         </w:rPr>
-        <w:t>main</w:t>
-      </w:r>
-      <w:r>
-        <w:rPr/>
-        <w:t>, with 0.19.93 in review. Each change is the result of a root-cause finding, and each was reviewed by Codex across several rounds before merging.</w:t>
+        <w:t>CHANGELOG.md</w:t>
+      </w:r>
+      <w:r>
+        <w:rPr/>
+        <w:t xml:space="preserve">'s </w:t>
+      </w:r>
+      <w:r>
+        <w:rPr>
+          <w:rStyle w:val="SourceText"/>
+        </w:rPr>
+        <w:t>[Unreleased]</w:t>
+      </w:r>
+      <w:r>
+        <w:rPr/>
+        <w:t xml:space="preserve"> section, closes three problems in the Stop gate and the PM in one pass.</w:t>
       </w:r>
     </w:p>
     <w:tbl>
@@ -4386,9 +4398,8 @@
         </w:tblCellMar>
       </w:tblPr>
       <w:tblGrid>
-        <w:gridCol w:w="1038"/>
-        <w:gridCol w:w="5981"/>
-        <w:gridCol w:w="4320"/>
+        <w:gridCol w:w="2685"/>
+        <w:gridCol w:w="8654"/>
       </w:tblGrid>
       <w:tr>
         <w:trPr>
@@ -4396,7 +4407,7 @@
         </w:trPr>
         <w:tc>
           <w:tcPr>
-            <w:tcW w:w="1038" w:type="dxa"/>
+            <w:tcW w:w="2685" w:type="dxa"/>
             <w:tcBorders/>
             <w:vAlign w:val="center"/>
           </w:tcPr>
@@ -4412,13 +4423,13 @@
             </w:pPr>
             <w:r>
               <w:rPr/>
-              <w:t>Version</w:t>
-            </w:r>
-          </w:p>
-        </w:tc>
-        <w:tc>
-          <w:tcPr>
-            <w:tcW w:w="5981" w:type="dxa"/>
+              <w:t>Change</w:t>
+            </w:r>
+          </w:p>
+        </w:tc>
+        <w:tc>
+          <w:tcPr>
+            <w:tcW w:w="8654" w:type="dxa"/>
             <w:tcBorders/>
             <w:vAlign w:val="center"/>
           </w:tcPr>
@@ -4434,28 +4445,6 @@
             </w:pPr>
             <w:r>
               <w:rPr/>
-              <w:t>Change</w:t>
-            </w:r>
-          </w:p>
-        </w:tc>
-        <w:tc>
-          <w:tcPr>
-            <w:tcW w:w="4320" w:type="dxa"/>
-            <w:tcBorders/>
-            <w:vAlign w:val="center"/>
-          </w:tcPr>
-          <w:p>
-            <w:pPr>
-              <w:pStyle w:val="TableHeading"/>
-              <w:suppressLineNumbers/>
-              <w:shd w:fill="1F4E79" w:val="clear"/>
-              <w:bidi w:val="0"/>
-              <w:spacing w:before="120" w:after="120"/>
-              <w:jc w:val="left"/>
-              <w:rPr/>
-            </w:pPr>
-            <w:r>
-              <w:rPr/>
               <w:t>What it means for you</w:t>
             </w:r>
           </w:p>
@@ -4465,283 +4454,283 @@
         <w:trPr/>
         <w:tc>
           <w:tcPr>
-            <w:tcW w:w="1038" w:type="dxa"/>
-            <w:tcBorders/>
-            <w:vAlign w:val="center"/>
-          </w:tcPr>
-          <w:p>
-            <w:pPr>
-              <w:pStyle w:val="TableContents"/>
-              <w:bidi w:val="0"/>
-              <w:spacing w:before="120" w:after="120"/>
-              <w:jc w:val="left"/>
-              <w:rPr/>
-            </w:pPr>
-            <w:r>
-              <w:rPr/>
-              <w:t>0.19.90</w:t>
-            </w:r>
-          </w:p>
-        </w:tc>
-        <w:tc>
-          <w:tcPr>
-            <w:tcW w:w="5981" w:type="dxa"/>
-            <w:tcBorders/>
-            <w:vAlign w:val="center"/>
-          </w:tcPr>
-          <w:p>
-            <w:pPr>
-              <w:pStyle w:val="TableContents"/>
-              <w:bidi w:val="0"/>
-              <w:spacing w:before="120" w:after="120"/>
-              <w:jc w:val="left"/>
-              <w:rPr/>
-            </w:pPr>
-            <w:r>
-              <w:rPr>
-                <w:b/>
-              </w:rPr>
-              <w:t>The idle rule, in both directions.</w:t>
-            </w:r>
-            <w:r>
-              <w:rPr/>
-              <w:t xml:space="preserve"> Every role that runs a check runs it in the foreground and never ends its turn waiting on a background task, because a finished agent is never woken. The PM learns the other half: an idle signal is not proof a role stopped; check the workspace's file times against the clock and escalate rather than restart.</w:t>
-            </w:r>
-          </w:p>
-        </w:tc>
-        <w:tc>
-          <w:tcPr>
-            <w:tcW w:w="4320" w:type="dxa"/>
-            <w:tcBorders/>
-            <w:vAlign w:val="center"/>
-          </w:tcPr>
-          <w:p>
-            <w:pPr>
-              <w:pStyle w:val="TableContents"/>
-              <w:bidi w:val="0"/>
-              <w:spacing w:before="120" w:after="120"/>
-              <w:jc w:val="left"/>
-              <w:rPr/>
-            </w:pPr>
-            <w:r>
-              <w:rPr/>
-              <w:t>Three agents in one night had stalled forever "waiting for a notification". That cannot happen now, and the manager will not throw away live work by restarting it.</w:t>
-            </w:r>
-          </w:p>
-        </w:tc>
-      </w:tr>
-      <w:tr>
-        <w:trPr/>
-        <w:tc>
-          <w:tcPr>
-            <w:tcW w:w="1038" w:type="dxa"/>
-            <w:tcBorders/>
-            <w:vAlign w:val="center"/>
-          </w:tcPr>
-          <w:p>
-            <w:pPr>
-              <w:pStyle w:val="TableContents"/>
-              <w:bidi w:val="0"/>
-              <w:spacing w:before="120" w:after="120"/>
-              <w:jc w:val="left"/>
-              <w:rPr/>
-            </w:pPr>
-            <w:r>
-              <w:rPr/>
-              <w:t>0.19.91</w:t>
-            </w:r>
-          </w:p>
-        </w:tc>
-        <w:tc>
-          <w:tcPr>
-            <w:tcW w:w="5981" w:type="dxa"/>
-            <w:tcBorders/>
-            <w:vAlign w:val="center"/>
-          </w:tcPr>
-          <w:p>
-            <w:pPr>
-              <w:pStyle w:val="TableContents"/>
-              <w:bidi w:val="0"/>
-              <w:spacing w:before="120" w:after="120"/>
-              <w:jc w:val="left"/>
-              <w:rPr/>
-            </w:pPr>
-            <w:r>
-              <w:rPr>
-                <w:b/>
-              </w:rPr>
-              <w:t>A behaviour eval suite.</w:t>
-            </w:r>
-            <w:r>
-              <w:rPr/>
-              <w:t xml:space="preserve"> Five live tests, each tempting one documented rule, graded by structure rather than by a judge model. A matched pair of runner scripts and a CI workflow that skips visibly without an API key.</w:t>
-            </w:r>
-          </w:p>
-        </w:tc>
-        <w:tc>
-          <w:tcPr>
-            <w:tcW w:w="4320" w:type="dxa"/>
-            <w:tcBorders/>
-            <w:vAlign w:val="center"/>
-          </w:tcPr>
-          <w:p>
-            <w:pPr>
-              <w:pStyle w:val="TableContents"/>
-              <w:bidi w:val="0"/>
-              <w:spacing w:before="120" w:after="120"/>
-              <w:jc w:val="left"/>
-              <w:rPr/>
-            </w:pPr>
-            <w:r>
-              <w:rPr/>
-              <w:t>The rules are tested against a real model, not just read. The first run caught the PM writing code itself.</w:t>
-            </w:r>
-          </w:p>
-        </w:tc>
-      </w:tr>
-      <w:tr>
-        <w:trPr/>
-        <w:tc>
-          <w:tcPr>
-            <w:tcW w:w="1038" w:type="dxa"/>
-            <w:tcBorders/>
-            <w:vAlign w:val="center"/>
-          </w:tcPr>
-          <w:p>
-            <w:pPr>
-              <w:pStyle w:val="TableContents"/>
-              <w:bidi w:val="0"/>
-              <w:spacing w:before="120" w:after="120"/>
-              <w:jc w:val="left"/>
-              <w:rPr/>
-            </w:pPr>
-            <w:r>
-              <w:rPr/>
-              <w:t>0.19.92</w:t>
-            </w:r>
-          </w:p>
-        </w:tc>
-        <w:tc>
-          <w:tcPr>
-            <w:tcW w:w="5981" w:type="dxa"/>
-            <w:tcBorders/>
-            <w:vAlign w:val="center"/>
-          </w:tcPr>
-          <w:p>
-            <w:pPr>
-              <w:pStyle w:val="TableContents"/>
-              <w:bidi w:val="0"/>
-              <w:spacing w:before="120" w:after="120"/>
-              <w:jc w:val="left"/>
-              <w:rPr/>
-            </w:pPr>
-            <w:r>
-              <w:rPr>
-                <w:b/>
-              </w:rPr>
-              <w:t>The role write guard.</w:t>
-            </w:r>
-            <w:r>
-              <w:rPr/>
-              <w:t xml:space="preserve"> A hook that enforces each role's write scope from its own definition. Off by default; the strictest setting is the floor once enabled. Corrupt configuration forces the strict setting. Paths are resolved through symlinks and junctions with each operating system's own ordering.</w:t>
-            </w:r>
-          </w:p>
-        </w:tc>
-        <w:tc>
-          <w:tcPr>
-            <w:tcW w:w="4320" w:type="dxa"/>
-            <w:tcBorders/>
-            <w:vAlign w:val="center"/>
-          </w:tcPr>
-          <w:p>
-            <w:pPr>
-              <w:pStyle w:val="TableContents"/>
-              <w:bidi w:val="0"/>
-              <w:spacing w:before="120" w:after="120"/>
-              <w:jc w:val="left"/>
-              <w:rPr/>
-            </w:pPr>
-            <w:r>
-              <w:rPr/>
-              <w:t xml:space="preserve">Prose said the PM must not write code, and it did anyway for four hours. Now the tool refuses. Enable it per repository with </w:t>
+            <w:tcW w:w="2685" w:type="dxa"/>
+            <w:tcBorders/>
+            <w:vAlign w:val="center"/>
+          </w:tcPr>
+          <w:p>
+            <w:pPr>
+              <w:pStyle w:val="TableContents"/>
+              <w:bidi w:val="0"/>
+              <w:spacing w:before="120" w:after="120"/>
+              <w:jc w:val="left"/>
+              <w:rPr/>
+            </w:pPr>
+            <w:r>
+              <w:rPr/>
+              <w:t>The Stop gate kept no evidence when one rule failed.</w:t>
+            </w:r>
+          </w:p>
+        </w:tc>
+        <w:tc>
+          <w:tcPr>
+            <w:tcW w:w="8654" w:type="dxa"/>
+            <w:tcBorders/>
+            <w:vAlign w:val="center"/>
+          </w:tcPr>
+          <w:p>
+            <w:pPr>
+              <w:pStyle w:val="TableContents"/>
+              <w:bidi w:val="0"/>
+              <w:spacing w:before="120" w:after="120"/>
+              <w:jc w:val="left"/>
+              <w:rPr/>
+            </w:pPr>
+            <w:r>
+              <w:rPr/>
+              <w:t>Before: a single failing check discarded the passing record of every other check that turn, so the next turn re-verified everything. Now: each rule's own outcome is recorded on its own, and only the rule that actually failed is left unrecorded.</w:t>
+            </w:r>
+          </w:p>
+        </w:tc>
+      </w:tr>
+      <w:tr>
+        <w:trPr/>
+        <w:tc>
+          <w:tcPr>
+            <w:tcW w:w="2685" w:type="dxa"/>
+            <w:tcBorders/>
+            <w:vAlign w:val="center"/>
+          </w:tcPr>
+          <w:p>
+            <w:pPr>
+              <w:pStyle w:val="TableContents"/>
+              <w:bidi w:val="0"/>
+              <w:spacing w:before="120" w:after="120"/>
+              <w:jc w:val="left"/>
+              <w:rPr/>
+            </w:pPr>
+            <w:r>
+              <w:rPr/>
+              <w:t xml:space="preserve">A Git Bash </w:t>
             </w:r>
             <w:r>
               <w:rPr>
                 <w:rStyle w:val="SourceText"/>
               </w:rPr>
-              <w:t>guards.roleWrites: block</w:t>
-            </w:r>
-            <w:r>
-              <w:rPr/>
-              <w:t>.</w:t>
-            </w:r>
-          </w:p>
-        </w:tc>
-      </w:tr>
-      <w:tr>
-        <w:trPr/>
-        <w:tc>
-          <w:tcPr>
-            <w:tcW w:w="1038" w:type="dxa"/>
-            <w:tcBorders/>
-            <w:vAlign w:val="center"/>
-          </w:tcPr>
-          <w:p>
-            <w:pPr>
-              <w:pStyle w:val="TableContents"/>
-              <w:bidi w:val="0"/>
-              <w:spacing w:before="120" w:after="120"/>
-              <w:jc w:val="left"/>
-              <w:rPr/>
-            </w:pPr>
-            <w:r>
-              <w:rPr/>
-              <w:t>also merged</w:t>
-            </w:r>
-          </w:p>
-        </w:tc>
-        <w:tc>
-          <w:tcPr>
-            <w:tcW w:w="5981" w:type="dxa"/>
-            <w:tcBorders/>
-            <w:vAlign w:val="center"/>
-          </w:tcPr>
-          <w:p>
-            <w:pPr>
-              <w:pStyle w:val="TableContents"/>
-              <w:bidi w:val="0"/>
-              <w:spacing w:before="120" w:after="120"/>
-              <w:jc w:val="left"/>
-              <w:rPr/>
-            </w:pPr>
-            <w:r>
-              <w:rPr/>
-              <w:t>Frontmatter across all 54 agents and every command is parsed as YAML by the marketplace check, after four command files were found to load with no frontmatter at all. All 21 verification rules in this repository are priced.</w:t>
-            </w:r>
-          </w:p>
-        </w:tc>
-        <w:tc>
-          <w:tcPr>
-            <w:tcW w:w="4320" w:type="dxa"/>
-            <w:tcBorders/>
-            <w:vAlign w:val="center"/>
-          </w:tcPr>
-          <w:p>
-            <w:pPr>
-              <w:pStyle w:val="TableContents"/>
-              <w:bidi w:val="0"/>
-              <w:spacing w:before="120" w:after="120"/>
-              <w:jc w:val="left"/>
-              <w:rPr/>
-            </w:pPr>
-            <w:r>
-              <w:rPr/>
-              <w:t>Silent breakage in the definitions is now a failing check, and the Stop budget can defer instead of running everything.</w:t>
+              <w:t>python3</w:t>
+            </w:r>
+            <w:r>
+              <w:rPr/>
+              <w:t xml:space="preserve"> landmine reached the gate and three hooks.</w:t>
+            </w:r>
+          </w:p>
+        </w:tc>
+        <w:tc>
+          <w:tcPr>
+            <w:tcW w:w="8654" w:type="dxa"/>
+            <w:tcBorders/>
+            <w:vAlign w:val="center"/>
+          </w:tcPr>
+          <w:p>
+            <w:pPr>
+              <w:pStyle w:val="TableContents"/>
+              <w:bidi w:val="0"/>
+              <w:spacing w:before="120" w:after="120"/>
+              <w:jc w:val="left"/>
+              <w:rPr/>
+            </w:pPr>
+            <w:r>
+              <w:rPr/>
+              <w:t xml:space="preserve">The gate now builds a </w:t>
+            </w:r>
+            <w:r>
+              <w:rPr>
+                <w:rStyle w:val="SourceText"/>
+              </w:rPr>
+              <w:t>python3</w:t>
+            </w:r>
+            <w:r>
+              <w:rPr/>
+              <w:t xml:space="preserve"> shim from a proved resolver only when </w:t>
+            </w:r>
+            <w:r>
+              <w:rPr>
+                <w:rStyle w:val="SourceText"/>
+              </w:rPr>
+              <w:t>python3</w:t>
+            </w:r>
+            <w:r>
+              <w:rPr/>
+              <w:t xml:space="preserve"> is genuinely absent, never shadowing </w:t>
+            </w:r>
+            <w:r>
+              <w:rPr>
+                <w:rStyle w:val="SourceText"/>
+              </w:rPr>
+              <w:t>python</w:t>
+            </w:r>
+            <w:r>
+              <w:rPr/>
+              <w:t xml:space="preserve"> or </w:t>
+            </w:r>
+            <w:r>
+              <w:rPr>
+                <w:rStyle w:val="SourceText"/>
+              </w:rPr>
+              <w:t>py</w:t>
+            </w:r>
+            <w:r>
+              <w:rPr/>
+              <w:t xml:space="preserve">, and fails closed with a remediation hint when nothing resolves. </w:t>
+            </w:r>
+            <w:r>
+              <w:rPr>
+                <w:rStyle w:val="SourceText"/>
+              </w:rPr>
+              <w:t>context-watch</w:t>
+            </w:r>
+            <w:r>
+              <w:rPr/>
+              <w:t xml:space="preserve">, </w:t>
+            </w:r>
+            <w:r>
+              <w:rPr>
+                <w:rStyle w:val="SourceText"/>
+              </w:rPr>
+              <w:t>pm-brief</w:t>
+            </w:r>
+            <w:r>
+              <w:rPr/>
+              <w:t xml:space="preserve"> and </w:t>
+            </w:r>
+            <w:r>
+              <w:rPr>
+                <w:rStyle w:val="SourceText"/>
+              </w:rPr>
+              <w:t>platform-sync</w:t>
+            </w:r>
+            <w:r>
+              <w:rPr/>
+              <w:t xml:space="preserve"> go through the same strict resolver.</w:t>
+            </w:r>
+          </w:p>
+        </w:tc>
+      </w:tr>
+      <w:tr>
+        <w:trPr/>
+        <w:tc>
+          <w:tcPr>
+            <w:tcW w:w="2685" w:type="dxa"/>
+            <w:tcBorders/>
+            <w:vAlign w:val="center"/>
+          </w:tcPr>
+          <w:p>
+            <w:pPr>
+              <w:pStyle w:val="TableContents"/>
+              <w:bidi w:val="0"/>
+              <w:spacing w:before="120" w:after="120"/>
+              <w:jc w:val="left"/>
+              <w:rPr/>
+            </w:pPr>
+            <w:r>
+              <w:rPr/>
+              <w:t>The PM read project state once per pass, not once per decision.</w:t>
+            </w:r>
+          </w:p>
+        </w:tc>
+        <w:tc>
+          <w:tcPr>
+            <w:tcW w:w="8654" w:type="dxa"/>
+            <w:tcBorders/>
+            <w:vAlign w:val="center"/>
+          </w:tcPr>
+          <w:p>
+            <w:pPr>
+              <w:pStyle w:val="TableContents"/>
+              <w:bidi w:val="0"/>
+              <w:spacing w:before="120" w:after="120"/>
+              <w:jc w:val="left"/>
+              <w:rPr/>
+            </w:pPr>
+            <w:r>
+              <w:rPr/>
+              <w:t xml:space="preserve">It now re-reads </w:t>
+            </w:r>
+            <w:r>
+              <w:rPr>
+                <w:rStyle w:val="SourceText"/>
+              </w:rPr>
+              <w:t>crew_state.py</w:t>
+            </w:r>
+            <w:r>
+              <w:rPr/>
+              <w:t>'s output plus HEAD, branch and working-tree status before every dispatch, and checks its own HEAD position again on every return, so a backward, sideways or foreign-forward HEAD is reported rather than missed.</w:t>
+            </w:r>
+          </w:p>
+        </w:tc>
+      </w:tr>
+      <w:tr>
+        <w:trPr/>
+        <w:tc>
+          <w:tcPr>
+            <w:tcW w:w="2685" w:type="dxa"/>
+            <w:tcBorders/>
+            <w:vAlign w:val="center"/>
+          </w:tcPr>
+          <w:p>
+            <w:pPr>
+              <w:pStyle w:val="TableContents"/>
+              <w:bidi w:val="0"/>
+              <w:spacing w:before="120" w:after="120"/>
+              <w:jc w:val="left"/>
+              <w:rPr/>
+            </w:pPr>
+            <w:r>
+              <w:rPr>
+                <w:rStyle w:val="SourceText"/>
+              </w:rPr>
+              <w:t>render.sh</w:t>
+            </w:r>
+            <w:r>
+              <w:rPr/>
+              <w:t xml:space="preserve"> handles flags in any position.</w:t>
+            </w:r>
+          </w:p>
+        </w:tc>
+        <w:tc>
+          <w:tcPr>
+            <w:tcW w:w="8654" w:type="dxa"/>
+            <w:tcBorders/>
+            <w:vAlign w:val="center"/>
+          </w:tcPr>
+          <w:p>
+            <w:pPr>
+              <w:pStyle w:val="TableContents"/>
+              <w:bidi w:val="0"/>
+              <w:spacing w:before="120" w:after="120"/>
+              <w:jc w:val="left"/>
+              <w:rPr/>
+            </w:pPr>
+            <w:r>
+              <w:rPr/>
+              <w:t>It now exits 1 on an empty diagram directory and 2 on contradictory flags, renders to a temporary file so a failed re-render never overwrites the last good diagram, and prints separate ok/skipped/failed counts.</w:t>
             </w:r>
           </w:p>
         </w:tc>
       </w:tr>
     </w:tbl>
+    <w:p>
+      <w:pPr>
+        <w:pStyle w:val="BodyText"/>
+        <w:bidi w:val="0"/>
+        <w:jc w:val="left"/>
+        <w:rPr/>
+      </w:pPr>
+      <w:r>
+        <w:rPr/>
+        <w:t>Earlier in the 0.19.x and 0.20.x line: the idle rule stopped agents stalling forever waiting for a notification that would never wake them; a behaviour-eval suite started testing the rules against a live model rather than only reading them, and its first run caught the PM writing code itself; the role write guard now mechanically enforces each role's write scope, off by default and the strictest layer wins when enabled; and every registered PowerShell hook now stands down off Windows, closing a defect where a host with both interpreters silently ran every hook twice.</w:t>
+      </w:r>
+    </w:p>
     <w:p>
       <w:pPr>
         <w:pStyle w:val="Heading2"/>
@@ -4751,72 +4740,7 @@
       </w:pPr>
       <w:r>
         <w:rPr/>
-        <w:t>8. The Stop-gate fix (0.19.93, in review)</w:t>
-      </w:r>
-    </w:p>
-    <w:p>
-      <w:pPr>
-        <w:pStyle w:val="BodyText"/>
-        <w:bidi w:val="0"/>
-        <w:spacing w:before="160" w:after="160"/>
-        <w:ind w:hanging="0" w:left="160" w:right="160"/>
-        <w:jc w:val="left"/>
-        <w:rPr>
-          <w:bdr w:val="single" w:sz="24" w:space="10" w:color="1F4E79"/>
-          <w:shd w:fill="F7F9FB" w:val="clear"/>
-        </w:rPr>
-      </w:pPr>
-      <w:r>
-        <w:rPr>
-          <w:b/>
-          <w:bdr w:val="single" w:sz="24" w:space="10" w:color="1F4E79"/>
-          <w:shd w:fill="F7F9FB" w:val="clear"/>
-        </w:rPr>
-        <w:t>The problem in one sentence.</w:t>
-      </w:r>
-      <w:r>
-        <w:rPr>
-          <w:bdr w:val="single" w:sz="24" w:space="10" w:color="1F4E79"/>
-          <w:shd w:fill="F7F9FB" w:val="clear"/>
-        </w:rPr>
-        <w:t xml:space="preserve"> The safety net at the end of every turn was taking seven minutes, every turn, on this machine, and people were cancelling it, which is worse than not having it.</w:t>
-      </w:r>
-    </w:p>
-    <w:p>
-      <w:pPr>
-        <w:pStyle w:val="Heading3"/>
-        <w:bidi w:val="0"/>
-        <w:ind w:hanging="0"/>
-        <w:jc w:val="left"/>
-        <w:rPr/>
-      </w:pPr>
-      <w:r>
-        <w:rPr/>
-        <w:t>What was wrong</w:t>
-      </w:r>
-    </w:p>
-    <w:p>
-      <w:pPr>
-        <w:pStyle w:val="BodyText"/>
-        <w:bidi w:val="0"/>
-        <w:jc w:val="left"/>
-        <w:rPr/>
-      </w:pPr>
-      <w:r>
-        <w:rPr/>
-        <w:t>The gate decides what to check by comparing the current files against the last commit it fully verified, recorded in a marker file. That marker only advanced when nothing had been deferred. One rule in this repository costs 185 seconds against a 60-second budget, so it was deferred on every turn, the marker never moved, and every turn re-checked 59 files across 13 rules. Separately, a rule with no declared cost could never be deferred at all, so ten of them ran whole every turn regardless of budget. Two other repositories on the same machine were worse: one had no marker at all and no priced rules, with a 499-second Stop; the other had ten rules that ran a smoke script which, without a flag, fired commands at a live development web server over SSM on every turn, with the target chosen by an ambient environment variable.</w:t>
-      </w:r>
-    </w:p>
-    <w:p>
-      <w:pPr>
-        <w:pStyle w:val="Heading3"/>
-        <w:bidi w:val="0"/>
-        <w:jc w:val="left"/>
-        <w:rPr/>
-      </w:pPr>
-      <w:r>
-        <w:rPr/>
-        <w:t>What the fix does</w:t>
+        <w:t>8. Integrations</w:t>
       </w:r>
     </w:p>
     <w:tbl>
@@ -4833,9 +4757,8 @@
         </w:tblCellMar>
       </w:tblPr>
       <w:tblGrid>
-        <w:gridCol w:w="1585"/>
-        <w:gridCol w:w="6746"/>
-        <w:gridCol w:w="3008"/>
+        <w:gridCol w:w="1933"/>
+        <w:gridCol w:w="9406"/>
       </w:tblGrid>
       <w:tr>
         <w:trPr>
@@ -4843,7 +4766,7 @@
         </w:trPr>
         <w:tc>
           <w:tcPr>
-            <w:tcW w:w="1585" w:type="dxa"/>
+            <w:tcW w:w="1933" w:type="dxa"/>
             <w:tcBorders/>
             <w:vAlign w:val="center"/>
           </w:tcPr>
@@ -4859,13 +4782,13 @@
             </w:pPr>
             <w:r>
               <w:rPr/>
-              <w:t>Component</w:t>
-            </w:r>
-          </w:p>
-        </w:tc>
-        <w:tc>
-          <w:tcPr>
-            <w:tcW w:w="6746" w:type="dxa"/>
+              <w:t>Area</w:t>
+            </w:r>
+          </w:p>
+        </w:tc>
+        <w:tc>
+          <w:tcPr>
+            <w:tcW w:w="9406" w:type="dxa"/>
             <w:tcBorders/>
             <w:vAlign w:val="center"/>
           </w:tcPr>
@@ -4881,533 +4804,271 @@
             </w:pPr>
             <w:r>
               <w:rPr/>
-              <w:t>Technical</w:t>
-            </w:r>
-          </w:p>
-        </w:tc>
-        <w:tc>
-          <w:tcPr>
-            <w:tcW w:w="3008" w:type="dxa"/>
-            <w:tcBorders/>
-            <w:vAlign w:val="center"/>
-          </w:tcPr>
-          <w:p>
-            <w:pPr>
-              <w:pStyle w:val="TableHeading"/>
-              <w:suppressLineNumbers/>
-              <w:shd w:fill="1F4E79" w:val="clear"/>
-              <w:bidi w:val="0"/>
-              <w:spacing w:before="120" w:after="120"/>
-              <w:jc w:val="left"/>
-              <w:rPr/>
-            </w:pPr>
-            <w:r>
-              <w:rPr/>
-              <w:t>Plain terms</w:t>
-            </w:r>
-          </w:p>
-        </w:tc>
-      </w:tr>
-      <w:tr>
-        <w:trPr/>
-        <w:tc>
-          <w:tcPr>
-            <w:tcW w:w="1585" w:type="dxa"/>
-            <w:tcBorders/>
-            <w:vAlign w:val="center"/>
-          </w:tcPr>
-          <w:p>
-            <w:pPr>
-              <w:pStyle w:val="TableContents"/>
-              <w:bidi w:val="0"/>
-              <w:spacing w:before="120" w:after="120"/>
-              <w:jc w:val="left"/>
-              <w:rPr/>
-            </w:pPr>
-            <w:r>
-              <w:rPr/>
-              <w:t>Per-rule verified record</w:t>
-            </w:r>
-          </w:p>
-        </w:tc>
-        <w:tc>
-          <w:tcPr>
-            <w:tcW w:w="6746" w:type="dxa"/>
-            <w:tcBorders/>
-            <w:vAlign w:val="center"/>
-          </w:tcPr>
-          <w:p>
-            <w:pPr>
-              <w:pStyle w:val="TableContents"/>
-              <w:bidi w:val="0"/>
-              <w:spacing w:before="120" w:after="120"/>
-              <w:jc w:val="left"/>
-              <w:rPr/>
-            </w:pPr>
-            <w:r>
-              <w:rPr/>
-              <w:t xml:space="preserve">Each rule that ran and passed on the current tree is recorded by content hash; the record advances rule by rule. A chronically over-budget rule, one excluded for reach, one needing a clean tree, or one that skipped is listed as unverified until </w:t>
-            </w:r>
+              <w:t>What crew connects to</w:t>
+            </w:r>
+          </w:p>
+        </w:tc>
+      </w:tr>
+      <w:tr>
+        <w:trPr/>
+        <w:tc>
+          <w:tcPr>
+            <w:tcW w:w="1933" w:type="dxa"/>
+            <w:tcBorders/>
+            <w:vAlign w:val="center"/>
+          </w:tcPr>
+          <w:p>
+            <w:pPr>
+              <w:pStyle w:val="TableContents"/>
+              <w:bidi w:val="0"/>
+              <w:spacing w:before="120" w:after="120"/>
+              <w:jc w:val="left"/>
+              <w:rPr/>
+            </w:pPr>
+            <w:r>
+              <w:rPr/>
+              <w:t>Trackers</w:t>
+            </w:r>
+          </w:p>
+        </w:tc>
+        <w:tc>
+          <w:tcPr>
+            <w:tcW w:w="9406" w:type="dxa"/>
+            <w:tcBorders/>
+            <w:vAlign w:val="center"/>
+          </w:tcPr>
+          <w:p>
+            <w:pPr>
+              <w:pStyle w:val="TableContents"/>
+              <w:bidi w:val="0"/>
+              <w:spacing w:before="120" w:after="120"/>
+              <w:jc w:val="left"/>
+              <w:rPr/>
+            </w:pPr>
+            <w:r>
+              <w:rPr/>
+              <w:t>Jira and ServiceDesk Plus through MCP; an Obsidian Kanban board; a local file cache always.</w:t>
+            </w:r>
+          </w:p>
+        </w:tc>
+      </w:tr>
+      <w:tr>
+        <w:trPr/>
+        <w:tc>
+          <w:tcPr>
+            <w:tcW w:w="1933" w:type="dxa"/>
+            <w:tcBorders/>
+            <w:vAlign w:val="center"/>
+          </w:tcPr>
+          <w:p>
+            <w:pPr>
+              <w:pStyle w:val="TableContents"/>
+              <w:bidi w:val="0"/>
+              <w:spacing w:before="120" w:after="120"/>
+              <w:jc w:val="left"/>
+              <w:rPr/>
+            </w:pPr>
+            <w:r>
+              <w:rPr/>
+              <w:t>Reviewers and models</w:t>
+            </w:r>
+          </w:p>
+        </w:tc>
+        <w:tc>
+          <w:tcPr>
+            <w:tcW w:w="9406" w:type="dxa"/>
+            <w:tcBorders/>
+            <w:vAlign w:val="center"/>
+          </w:tcPr>
+          <w:p>
+            <w:pPr>
+              <w:pStyle w:val="TableContents"/>
+              <w:bidi w:val="0"/>
+              <w:spacing w:before="120" w:after="120"/>
+              <w:jc w:val="left"/>
+              <w:rPr/>
+            </w:pPr>
+            <w:r>
+              <w:rPr/>
+              <w:t>Codex (OpenAI) as the first-choice reviewer; GitHub Copilot models including Kimi as an alternative family; Gemini as a design partner; per-role model pins with a probe that confirms the model answers before it is trusted.</w:t>
+            </w:r>
+          </w:p>
+        </w:tc>
+      </w:tr>
+      <w:tr>
+        <w:trPr/>
+        <w:tc>
+          <w:tcPr>
+            <w:tcW w:w="1933" w:type="dxa"/>
+            <w:tcBorders/>
+            <w:vAlign w:val="center"/>
+          </w:tcPr>
+          <w:p>
+            <w:pPr>
+              <w:pStyle w:val="TableContents"/>
+              <w:bidi w:val="0"/>
+              <w:spacing w:before="120" w:after="120"/>
+              <w:jc w:val="left"/>
+              <w:rPr/>
+            </w:pPr>
+            <w:r>
+              <w:rPr/>
+              <w:t>Cloud</w:t>
+            </w:r>
+          </w:p>
+        </w:tc>
+        <w:tc>
+          <w:tcPr>
+            <w:tcW w:w="9406" w:type="dxa"/>
+            <w:tcBorders/>
+            <w:vAlign w:val="center"/>
+          </w:tcPr>
+          <w:p>
+            <w:pPr>
+              <w:pStyle w:val="TableContents"/>
+              <w:bidi w:val="0"/>
+              <w:spacing w:before="120" w:after="120"/>
+              <w:jc w:val="left"/>
+              <w:rPr/>
+            </w:pPr>
+            <w:r>
+              <w:rPr/>
+              <w:t>The official AWS and Azure MCP servers, configured per repository with guardrails.</w:t>
+            </w:r>
+          </w:p>
+        </w:tc>
+      </w:tr>
+      <w:tr>
+        <w:trPr/>
+        <w:tc>
+          <w:tcPr>
+            <w:tcW w:w="1933" w:type="dxa"/>
+            <w:tcBorders/>
+            <w:vAlign w:val="center"/>
+          </w:tcPr>
+          <w:p>
+            <w:pPr>
+              <w:pStyle w:val="TableContents"/>
+              <w:bidi w:val="0"/>
+              <w:spacing w:before="120" w:after="120"/>
+              <w:jc w:val="left"/>
+              <w:rPr/>
+            </w:pPr>
+            <w:r>
+              <w:rPr/>
+              <w:t>Notifications</w:t>
+            </w:r>
+          </w:p>
+        </w:tc>
+        <w:tc>
+          <w:tcPr>
+            <w:tcW w:w="9406" w:type="dxa"/>
+            <w:tcBorders/>
+            <w:vAlign w:val="center"/>
+          </w:tcPr>
+          <w:p>
+            <w:pPr>
+              <w:pStyle w:val="TableContents"/>
+              <w:bidi w:val="0"/>
+              <w:spacing w:before="120" w:after="120"/>
+              <w:jc w:val="left"/>
+              <w:rPr/>
+            </w:pPr>
+            <w:r>
+              <w:rPr/>
+              <w:t>Microsoft Teams and Telegram, outbound; two-way options documented.</w:t>
+            </w:r>
+          </w:p>
+        </w:tc>
+      </w:tr>
+      <w:tr>
+        <w:trPr/>
+        <w:tc>
+          <w:tcPr>
+            <w:tcW w:w="1933" w:type="dxa"/>
+            <w:tcBorders/>
+            <w:vAlign w:val="center"/>
+          </w:tcPr>
+          <w:p>
+            <w:pPr>
+              <w:pStyle w:val="TableContents"/>
+              <w:bidi w:val="0"/>
+              <w:spacing w:before="120" w:after="120"/>
+              <w:jc w:val="left"/>
+              <w:rPr/>
+            </w:pPr>
+            <w:r>
+              <w:rPr/>
+              <w:t>Memory</w:t>
+            </w:r>
+          </w:p>
+        </w:tc>
+        <w:tc>
+          <w:tcPr>
+            <w:tcW w:w="9406" w:type="dxa"/>
+            <w:tcBorders/>
+            <w:vAlign w:val="center"/>
+          </w:tcPr>
+          <w:p>
+            <w:pPr>
+              <w:pStyle w:val="TableContents"/>
+              <w:bidi w:val="0"/>
+              <w:spacing w:before="120" w:after="120"/>
+              <w:jc w:val="left"/>
+              <w:rPr/>
+            </w:pPr>
+            <w:r>
+              <w:rPr/>
+              <w:t>Optional Obsidian vault for cross-repository notes; never written to without explicit consent in the session.</w:t>
+            </w:r>
+          </w:p>
+        </w:tc>
+      </w:tr>
+      <w:tr>
+        <w:trPr/>
+        <w:tc>
+          <w:tcPr>
+            <w:tcW w:w="1933" w:type="dxa"/>
+            <w:tcBorders/>
+            <w:vAlign w:val="center"/>
+          </w:tcPr>
+          <w:p>
+            <w:pPr>
+              <w:pStyle w:val="TableContents"/>
+              <w:bidi w:val="0"/>
+              <w:spacing w:before="120" w:after="120"/>
+              <w:jc w:val="left"/>
+              <w:rPr/>
+            </w:pPr>
+            <w:r>
+              <w:rPr/>
+              <w:t>Documents</w:t>
+            </w:r>
+          </w:p>
+        </w:tc>
+        <w:tc>
+          <w:tcPr>
+            <w:tcW w:w="9406" w:type="dxa"/>
+            <w:tcBorders/>
+            <w:vAlign w:val="center"/>
+          </w:tcPr>
+          <w:p>
+            <w:pPr>
+              <w:pStyle w:val="TableContents"/>
+              <w:bidi w:val="0"/>
+              <w:spacing w:before="120" w:after="120"/>
+              <w:jc w:val="left"/>
+              <w:rPr/>
+            </w:pPr>
             <w:r>
               <w:rPr>
                 <w:rStyle w:val="SourceText"/>
               </w:rPr>
-              <w:t>/crew:verify --all</w:t>
-            </w:r>
-            <w:r>
-              <w:rPr/>
-              <w:t xml:space="preserve"> runs it, and reported every turn.</w:t>
-            </w:r>
-          </w:p>
-        </w:tc>
-        <w:tc>
-          <w:tcPr>
-            <w:tcW w:w="3008" w:type="dxa"/>
-            <w:tcBorders/>
-            <w:vAlign w:val="center"/>
-          </w:tcPr>
-          <w:p>
-            <w:pPr>
-              <w:pStyle w:val="TableContents"/>
-              <w:bidi w:val="0"/>
-              <w:spacing w:before="120" w:after="120"/>
-              <w:jc w:val="left"/>
-              <w:rPr/>
-            </w:pPr>
-            <w:r>
-              <w:rPr/>
-              <w:t>One slow check no longer freezes all the others. Nothing is forgotten; it is listed.</w:t>
-            </w:r>
-          </w:p>
-        </w:tc>
-      </w:tr>
-      <w:tr>
-        <w:trPr/>
-        <w:tc>
-          <w:tcPr>
-            <w:tcW w:w="1585" w:type="dxa"/>
-            <w:tcBorders/>
-            <w:vAlign w:val="center"/>
-          </w:tcPr>
-          <w:p>
-            <w:pPr>
-              <w:pStyle w:val="TableContents"/>
-              <w:bidi w:val="0"/>
-              <w:spacing w:before="120" w:after="120"/>
-              <w:jc w:val="left"/>
-              <w:rPr/>
-            </w:pPr>
-            <w:r>
-              <w:rPr/>
-              <w:t>Measure and cache</w:t>
-            </w:r>
-          </w:p>
-        </w:tc>
-        <w:tc>
-          <w:tcPr>
-            <w:tcW w:w="6746" w:type="dxa"/>
-            <w:tcBorders/>
-            <w:vAlign w:val="center"/>
-          </w:tcPr>
-          <w:p>
-            <w:pPr>
-              <w:pStyle w:val="TableContents"/>
-              <w:bidi w:val="0"/>
-              <w:spacing w:before="120" w:after="120"/>
-              <w:jc w:val="left"/>
-              <w:rPr/>
-            </w:pPr>
-            <w:r>
-              <w:rPr/>
-              <w:t xml:space="preserve">An unpriced rule is timed on its first run and the measurement cached locally, so it is deferrable next turn. </w:t>
-            </w:r>
-            <w:r>
-              <w:rPr>
-                <w:rStyle w:val="SourceText"/>
-              </w:rPr>
-              <w:t>--price</w:t>
-            </w:r>
-            <w:r>
-              <w:rPr/>
-              <w:t xml:space="preserve"> writes </w:t>
-            </w:r>
-            <w:r>
-              <w:rPr>
-                <w:rStyle w:val="SourceText"/>
-              </w:rPr>
-              <w:t>seconds</w:t>
-            </w:r>
-            <w:r>
-              <w:rPr/>
-              <w:t xml:space="preserve"> into the map for the author; it is never reachable from the hook.</w:t>
-            </w:r>
-          </w:p>
-        </w:tc>
-        <w:tc>
-          <w:tcPr>
-            <w:tcW w:w="3008" w:type="dxa"/>
-            <w:tcBorders/>
-            <w:vAlign w:val="center"/>
-          </w:tcPr>
-          <w:p>
-            <w:pPr>
-              <w:pStyle w:val="TableContents"/>
-              <w:bidi w:val="0"/>
-              <w:spacing w:before="120" w:after="120"/>
-              <w:jc w:val="left"/>
-              <w:rPr/>
-            </w:pPr>
-            <w:r>
-              <w:rPr/>
-              <w:t>Checks price themselves. Unknown cost means "mandatory once", not "mandatory forever".</w:t>
-            </w:r>
-          </w:p>
-        </w:tc>
-      </w:tr>
-      <w:tr>
-        <w:trPr/>
-        <w:tc>
-          <w:tcPr>
-            <w:tcW w:w="1585" w:type="dxa"/>
-            <w:tcBorders/>
-            <w:vAlign w:val="center"/>
-          </w:tcPr>
-          <w:p>
-            <w:pPr>
-              <w:pStyle w:val="TableContents"/>
-              <w:bidi w:val="0"/>
-              <w:spacing w:before="120" w:after="120"/>
-              <w:jc w:val="left"/>
-              <w:rPr/>
-            </w:pPr>
-            <w:r>
-              <w:rPr/>
-              <w:t>Reach declarations</w:t>
-            </w:r>
-          </w:p>
-        </w:tc>
-        <w:tc>
-          <w:tcPr>
-            <w:tcW w:w="6746" w:type="dxa"/>
-            <w:tcBorders/>
-            <w:vAlign w:val="center"/>
-          </w:tcPr>
-          <w:p>
-            <w:pPr>
-              <w:pStyle w:val="TableContents"/>
-              <w:bidi w:val="0"/>
-              <w:spacing w:before="120" w:after="120"/>
-              <w:jc w:val="left"/>
-              <w:rPr/>
-            </w:pPr>
-            <w:r>
-              <w:rPr/>
-              <w:t xml:space="preserve">Rules declare </w:t>
-            </w:r>
-            <w:r>
-              <w:rPr>
-                <w:rStyle w:val="SourceText"/>
-              </w:rPr>
-              <w:t>local</w:t>
-            </w:r>
-            <w:r>
-              <w:rPr/>
-              <w:t xml:space="preserve">, </w:t>
-            </w:r>
-            <w:r>
-              <w:rPr>
-                <w:rStyle w:val="SourceText"/>
-              </w:rPr>
-              <w:t>network</w:t>
-            </w:r>
-            <w:r>
-              <w:rPr/>
-              <w:t xml:space="preserve"> or </w:t>
-            </w:r>
-            <w:r>
-              <w:rPr>
-                <w:rStyle w:val="SourceText"/>
-              </w:rPr>
-              <w:t>host</w:t>
-            </w:r>
-            <w:r>
-              <w:rPr/>
-              <w:t xml:space="preserve">. Only local rules run on Stop. Inspection may only reject: an undeclared rule that runs any script, inline shell or </w:t>
-            </w:r>
-            <w:r>
-              <w:rPr>
-                <w:rStyle w:val="SourceText"/>
-              </w:rPr>
-              <w:t>cd</w:t>
-            </w:r>
-            <w:r>
-              <w:rPr/>
-              <w:t xml:space="preserve"> is deferred until the map declares it. A parse-only </w:t>
-            </w:r>
-            <w:r>
-              <w:rPr>
-                <w:rStyle w:val="SourceText"/>
-              </w:rPr>
-              <w:t>bash -n</w:t>
-            </w:r>
-            <w:r>
-              <w:rPr/>
-              <w:t xml:space="preserve"> stays local.</w:t>
-            </w:r>
-          </w:p>
-        </w:tc>
-        <w:tc>
-          <w:tcPr>
-            <w:tcW w:w="3008" w:type="dxa"/>
-            <w:tcBorders/>
-            <w:vAlign w:val="center"/>
-          </w:tcPr>
-          <w:p>
-            <w:pPr>
-              <w:pStyle w:val="TableContents"/>
-              <w:bidi w:val="0"/>
-              <w:spacing w:before="120" w:after="120"/>
-              <w:jc w:val="left"/>
-              <w:rPr/>
-            </w:pPr>
-            <w:r>
-              <w:rPr/>
-              <w:t>Nothing reaches a live server unattended. Each repository declares its wrapper scripts once; the PM tells it which.</w:t>
-            </w:r>
-          </w:p>
-        </w:tc>
-      </w:tr>
-      <w:tr>
-        <w:trPr/>
-        <w:tc>
-          <w:tcPr>
-            <w:tcW w:w="1585" w:type="dxa"/>
-            <w:tcBorders/>
-            <w:vAlign w:val="center"/>
-          </w:tcPr>
-          <w:p>
-            <w:pPr>
-              <w:pStyle w:val="TableContents"/>
-              <w:bidi w:val="0"/>
-              <w:spacing w:before="120" w:after="120"/>
-              <w:jc w:val="left"/>
-              <w:rPr/>
-            </w:pPr>
-            <w:r>
-              <w:rPr/>
-              <w:t>Environment pinning</w:t>
-            </w:r>
-          </w:p>
-        </w:tc>
-        <w:tc>
-          <w:tcPr>
-            <w:tcW w:w="6746" w:type="dxa"/>
-            <w:tcBorders/>
-            <w:vAlign w:val="center"/>
-          </w:tcPr>
-          <w:p>
-            <w:pPr>
-              <w:pStyle w:val="TableContents"/>
-              <w:bidi w:val="0"/>
-              <w:spacing w:before="120" w:after="120"/>
-              <w:jc w:val="left"/>
-              <w:rPr/>
-            </w:pPr>
-            <w:r>
-              <w:rPr>
-                <w:rStyle w:val="SourceText"/>
-              </w:rPr>
-              <w:t>ENV</w:t>
-            </w:r>
-            <w:r>
-              <w:rPr/>
-              <w:t xml:space="preserve">, </w:t>
-            </w:r>
-            <w:r>
-              <w:rPr>
-                <w:rStyle w:val="SourceText"/>
-              </w:rPr>
-              <w:t>AWS_PROFILE</w:t>
-            </w:r>
-            <w:r>
-              <w:rPr/>
-              <w:t xml:space="preserve">, </w:t>
-            </w:r>
-            <w:r>
-              <w:rPr>
-                <w:rStyle w:val="SourceText"/>
-              </w:rPr>
-              <w:t>AWS_DEFAULT_REGION</w:t>
-            </w:r>
-            <w:r>
-              <w:rPr/>
-              <w:t xml:space="preserve">, </w:t>
-            </w:r>
-            <w:r>
-              <w:rPr>
-                <w:rStyle w:val="SourceText"/>
-              </w:rPr>
-              <w:t>KUBECONFIG</w:t>
-            </w:r>
-            <w:r>
-              <w:rPr/>
-              <w:t xml:space="preserve"> and </w:t>
-            </w:r>
-            <w:r>
-              <w:rPr>
-                <w:rStyle w:val="SourceText"/>
-              </w:rPr>
-              <w:t>TF_WORKSPACE</w:t>
-            </w:r>
-            <w:r>
-              <w:rPr/>
-              <w:t xml:space="preserve"> are unset for every rule unless the map declares them; the gate prints what it pinned.</w:t>
-            </w:r>
-          </w:p>
-        </w:tc>
-        <w:tc>
-          <w:tcPr>
-            <w:tcW w:w="3008" w:type="dxa"/>
-            <w:tcBorders/>
-            <w:vAlign w:val="center"/>
-          </w:tcPr>
-          <w:p>
-            <w:pPr>
-              <w:pStyle w:val="TableContents"/>
-              <w:bidi w:val="0"/>
-              <w:spacing w:before="120" w:after="120"/>
-              <w:jc w:val="left"/>
-              <w:rPr/>
-            </w:pPr>
-            <w:r>
-              <w:rPr/>
-              <w:t>A leftover variable in a terminal cannot point a check at production.</w:t>
-            </w:r>
-          </w:p>
-        </w:tc>
-      </w:tr>
-      <w:tr>
-        <w:trPr/>
-        <w:tc>
-          <w:tcPr>
-            <w:tcW w:w="1585" w:type="dxa"/>
-            <w:tcBorders/>
-            <w:vAlign w:val="center"/>
-          </w:tcPr>
-          <w:p>
-            <w:pPr>
-              <w:pStyle w:val="TableContents"/>
-              <w:bidi w:val="0"/>
-              <w:spacing w:before="120" w:after="120"/>
-              <w:jc w:val="left"/>
-              <w:rPr/>
-            </w:pPr>
-            <w:r>
-              <w:rPr/>
-              <w:t>Exit 77 as SKIP</w:t>
-            </w:r>
-          </w:p>
-        </w:tc>
-        <w:tc>
-          <w:tcPr>
-            <w:tcW w:w="6746" w:type="dxa"/>
-            <w:tcBorders/>
-            <w:vAlign w:val="center"/>
-          </w:tcPr>
-          <w:p>
-            <w:pPr>
-              <w:pStyle w:val="TableContents"/>
-              <w:bidi w:val="0"/>
-              <w:spacing w:before="120" w:after="120"/>
-              <w:jc w:val="left"/>
-              <w:rPr/>
-            </w:pPr>
-            <w:r>
-              <w:rPr/>
-              <w:t>The standard "environment absent" code is neither pass nor fail, never advances the marker, and deletes any earlier clean fingerprint.</w:t>
-            </w:r>
-          </w:p>
-        </w:tc>
-        <w:tc>
-          <w:tcPr>
-            <w:tcW w:w="3008" w:type="dxa"/>
-            <w:tcBorders/>
-            <w:vAlign w:val="center"/>
-          </w:tcPr>
-          <w:p>
-            <w:pPr>
-              <w:pStyle w:val="TableContents"/>
-              <w:bidi w:val="0"/>
-              <w:spacing w:before="120" w:after="120"/>
-              <w:jc w:val="left"/>
-              <w:rPr/>
-            </w:pPr>
-            <w:r>
-              <w:rPr/>
-              <w:t>A check that could not run is not counted as passed.</w:t>
-            </w:r>
-          </w:p>
-        </w:tc>
-      </w:tr>
-      <w:tr>
-        <w:trPr/>
-        <w:tc>
-          <w:tcPr>
-            <w:tcW w:w="1585" w:type="dxa"/>
-            <w:tcBorders/>
-            <w:vAlign w:val="center"/>
-          </w:tcPr>
-          <w:p>
-            <w:pPr>
-              <w:pStyle w:val="TableContents"/>
-              <w:bidi w:val="0"/>
-              <w:spacing w:before="120" w:after="120"/>
-              <w:jc w:val="left"/>
-              <w:rPr/>
-            </w:pPr>
-            <w:r>
-              <w:rPr/>
-              <w:t>Three PM triggers</w:t>
-            </w:r>
-          </w:p>
-        </w:tc>
-        <w:tc>
-          <w:tcPr>
-            <w:tcW w:w="6746" w:type="dxa"/>
-            <w:tcBorders/>
-            <w:vAlign w:val="center"/>
-          </w:tcPr>
-          <w:p>
-            <w:pPr>
-              <w:pStyle w:val="TableContents"/>
-              <w:bidi w:val="0"/>
-              <w:spacing w:before="120" w:after="120"/>
-              <w:jc w:val="left"/>
-              <w:rPr/>
-            </w:pPr>
-            <w:r>
-              <w:rPr/>
-              <w:t>Marker missing or stale by N commits; N rules unpriced; N rules with undeclared reach. An unreadable value renders as "unknown" and fires.</w:t>
-            </w:r>
-          </w:p>
-        </w:tc>
-        <w:tc>
-          <w:tcPr>
-            <w:tcW w:w="3008" w:type="dxa"/>
-            <w:tcBorders/>
-            <w:vAlign w:val="center"/>
-          </w:tcPr>
-          <w:p>
-            <w:pPr>
-              <w:pStyle w:val="TableContents"/>
-              <w:bidi w:val="0"/>
-              <w:spacing w:before="120" w:after="120"/>
-              <w:jc w:val="left"/>
-              <w:rPr/>
-            </w:pPr>
-            <w:r>
-              <w:rPr/>
-              <w:t>The manager tells you what to declare or price instead of you discovering it from a slow hook.</w:t>
+              <w:t>doc-builder</w:t>
+            </w:r>
+            <w:r>
+              <w:rPr/>
+              <w:t xml:space="preserve"> (a separate marketplace entry) renders any hand-authored guide or runbook to house style, and to DOCX/PDF through Microsoft Word or LibreOffice depending on the host.</w:t>
             </w:r>
           </w:p>
         </w:tc>
@@ -5415,59 +5076,14 @@
     </w:tbl>
     <w:p>
       <w:pPr>
-        <w:pStyle w:val="Heading3"/>
+        <w:pStyle w:val="Heading2"/>
         <w:bidi w:val="0"/>
         <w:jc w:val="left"/>
         <w:rPr/>
       </w:pPr>
       <w:r>
         <w:rPr/>
-        <w:t>Review so far</w:t>
-      </w:r>
-    </w:p>
-    <w:p>
-      <w:pPr>
-        <w:pStyle w:val="BodyText"/>
-        <w:bidi w:val="0"/>
-        <w:ind w:hanging="0" w:left="0" w:right="0"/>
-        <w:jc w:val="left"/>
-        <w:rPr/>
-      </w:pPr>
-      <w:r>
-        <w:rPr/>
-        <w:t xml:space="preserve">Five Codex rounds plus a PowerShell security specialist have reviewed the branch; 31 findings were fixed with a test for each, and a self-check test now runs this repository's real rule map through the classifier. That self-check caught, in turn, </w:t>
-      </w:r>
-      <w:r>
-        <w:rPr>
-          <w:rStyle w:val="SourceText"/>
-        </w:rPr>
-        <w:t>python -m pytest</w:t>
-      </w:r>
-      <w:r>
-        <w:rPr/>
-        <w:t xml:space="preserve"> being read as a wrapper script, the word "curl" in a comment, and the parse-only case. Four rounds of the wrapper scanner each found a new way shell syntax could hide a script, which is why the design was inverted to reject-only in round four. </w:t>
-      </w:r>
-      <w:r>
-        <w:rPr>
-          <w:color w:val="B45309"/>
-        </w:rPr>
-        <w:t>One fix pass (splitting compound commands on shell operators) is in progress; then one more review round, then merge.</w:t>
-      </w:r>
-      <w:r>
-        <w:rPr/>
-        <w:t xml:space="preserve"> Its effect on live sessions is not yet measured.</w:t>
-      </w:r>
-    </w:p>
-    <w:p>
-      <w:pPr>
-        <w:pStyle w:val="Heading3"/>
-        <w:bidi w:val="0"/>
-        <w:jc w:val="left"/>
-        <w:rPr/>
-      </w:pPr>
-      <w:r>
-        <w:rPr/>
-        <w:t>What a repository has to do after upgrading</w:t>
+        <w:t>9. Getting Started</w:t>
       </w:r>
     </w:p>
     <w:p>
@@ -5489,17 +5105,17 @@
       </w:pPr>
       <w:r>
         <w:rPr/>
-        <w:t xml:space="preserve">Declare </w:t>
+        <w:t xml:space="preserve">Install the marketplace and the crew plugin in Claude Code, then </w:t>
       </w:r>
       <w:r>
         <w:rPr>
           <w:rStyle w:val="SourceText"/>
         </w:rPr>
-        <w:t>reach: local</w:t>
-      </w:r>
-      <w:r>
-        <w:rPr/>
-        <w:t xml:space="preserve"> on rules that run a script, or the PM pulse will name them and they will be deferred until declared. </w:t>
+        <w:t>/reload-plugins</w:t>
+      </w:r>
+      <w:r>
+        <w:rPr/>
+        <w:t xml:space="preserve"> in any open session. </w:t>
       </w:r>
     </w:p>
     <w:p>
@@ -5521,17 +5137,71 @@
       </w:pPr>
       <w:r>
         <w:rPr/>
-        <w:t xml:space="preserve">Run </w:t>
+        <w:t xml:space="preserve">In a repository, run </w:t>
       </w:r>
       <w:r>
         <w:rPr>
           <w:rStyle w:val="SourceText"/>
         </w:rPr>
-        <w:t>/crew:verify --price</w:t>
-      </w:r>
-      <w:r>
-        <w:rPr/>
-        <w:t xml:space="preserve"> once, or let the cache price rules as they run. </w:t>
+        <w:t>/crew:init</w:t>
+      </w:r>
+      <w:r>
+        <w:rPr/>
+        <w:t xml:space="preserve">. It is phased and resumable; nothing is written without saying so. </w:t>
+      </w:r>
+    </w:p>
+    <w:p>
+      <w:pPr>
+        <w:pStyle w:val="BodyText"/>
+        <w:numPr>
+          <w:ilvl w:val="0"/>
+          <w:numId w:val="3"/>
+        </w:numPr>
+        <w:tabs>
+          <w:tab w:val="clear" w:pos="1134"/>
+          <w:tab w:val="left" w:pos="829" w:leader="none"/>
+        </w:tabs>
+        <w:bidi w:val="0"/>
+        <w:spacing w:before="120" w:after="0"/>
+        <w:ind w:hanging="283" w:left="829"/>
+        <w:jc w:val="left"/>
+        <w:rPr/>
+      </w:pPr>
+      <w:r>
+        <w:rPr/>
+        <w:t xml:space="preserve">Build the smoke harness when init asks. Everything downstream stands on it. </w:t>
+      </w:r>
+    </w:p>
+    <w:p>
+      <w:pPr>
+        <w:pStyle w:val="BodyText"/>
+        <w:numPr>
+          <w:ilvl w:val="0"/>
+          <w:numId w:val="3"/>
+        </w:numPr>
+        <w:tabs>
+          <w:tab w:val="clear" w:pos="1134"/>
+          <w:tab w:val="left" w:pos="829" w:leader="none"/>
+        </w:tabs>
+        <w:bidi w:val="0"/>
+        <w:spacing w:before="120" w:after="0"/>
+        <w:ind w:hanging="283" w:left="829"/>
+        <w:jc w:val="left"/>
+        <w:rPr/>
+      </w:pPr>
+      <w:r>
+        <w:rPr/>
+        <w:t xml:space="preserve">Run </w:t>
+      </w:r>
+      <w:r>
+        <w:rPr>
+          <w:rStyle w:val="SourceText"/>
+        </w:rPr>
+        <w:t>/crew:onboard</w:t>
+      </w:r>
+      <w:r>
+        <w:rPr/>
+        <w:t xml:space="preserve"> so the crew learns the codebase once and writes it down. </w:t>
       </w:r>
     </w:p>
     <w:p>
@@ -5552,7 +5222,27 @@
       </w:pPr>
       <w:r>
         <w:rPr/>
-        <w:t xml:space="preserve">Create the marker on a verified commit only. Marking an unverified commit as verified means the gate will not look at it again. </w:t>
+        <w:t xml:space="preserve">Write a ticket with </w:t>
+      </w:r>
+      <w:r>
+        <w:rPr>
+          <w:rStyle w:val="SourceText"/>
+        </w:rPr>
+        <w:t>/crew:ticket</w:t>
+      </w:r>
+      <w:r>
+        <w:rPr/>
+        <w:t xml:space="preserve">, then </w:t>
+      </w:r>
+      <w:r>
+        <w:rPr>
+          <w:rStyle w:val="SourceText"/>
+        </w:rPr>
+        <w:t>/crew:work</w:t>
+      </w:r>
+      <w:r>
+        <w:rPr/>
+        <w:t xml:space="preserve">. Read the review. Merge when the gate is green. </w:t>
       </w:r>
     </w:p>
     <w:p>
@@ -5564,7 +5254,7 @@
       </w:pPr>
       <w:r>
         <w:rPr/>
-        <w:t>9. Integrations</w:t>
+        <w:t>10. Glossary</w:t>
       </w:r>
     </w:p>
     <w:tbl>
@@ -5581,8 +5271,8 @@
         </w:tblCellMar>
       </w:tblPr>
       <w:tblGrid>
-        <w:gridCol w:w="1772"/>
-        <w:gridCol w:w="9567"/>
+        <w:gridCol w:w="2634"/>
+        <w:gridCol w:w="8705"/>
       </w:tblGrid>
       <w:tr>
         <w:trPr>
@@ -5590,7 +5280,7 @@
         </w:trPr>
         <w:tc>
           <w:tcPr>
-            <w:tcW w:w="1772" w:type="dxa"/>
+            <w:tcW w:w="2634" w:type="dxa"/>
             <w:tcBorders/>
             <w:vAlign w:val="center"/>
           </w:tcPr>
@@ -5606,13 +5296,13 @@
             </w:pPr>
             <w:r>
               <w:rPr/>
-              <w:t>Area</w:t>
-            </w:r>
-          </w:p>
-        </w:tc>
-        <w:tc>
-          <w:tcPr>
-            <w:tcW w:w="9567" w:type="dxa"/>
+              <w:t>Term</w:t>
+            </w:r>
+          </w:p>
+        </w:tc>
+        <w:tc>
+          <w:tcPr>
+            <w:tcW w:w="8705" w:type="dxa"/>
             <w:tcBorders/>
             <w:vAlign w:val="center"/>
           </w:tcPr>
@@ -5628,471 +5318,6 @@
             </w:pPr>
             <w:r>
               <w:rPr/>
-              <w:t>What crew connects to</w:t>
-            </w:r>
-          </w:p>
-        </w:tc>
-      </w:tr>
-      <w:tr>
-        <w:trPr/>
-        <w:tc>
-          <w:tcPr>
-            <w:tcW w:w="1772" w:type="dxa"/>
-            <w:tcBorders/>
-            <w:vAlign w:val="center"/>
-          </w:tcPr>
-          <w:p>
-            <w:pPr>
-              <w:pStyle w:val="TableContents"/>
-              <w:bidi w:val="0"/>
-              <w:spacing w:before="120" w:after="120"/>
-              <w:jc w:val="left"/>
-              <w:rPr/>
-            </w:pPr>
-            <w:r>
-              <w:rPr/>
-              <w:t>Trackers</w:t>
-            </w:r>
-          </w:p>
-        </w:tc>
-        <w:tc>
-          <w:tcPr>
-            <w:tcW w:w="9567" w:type="dxa"/>
-            <w:tcBorders/>
-            <w:vAlign w:val="center"/>
-          </w:tcPr>
-          <w:p>
-            <w:pPr>
-              <w:pStyle w:val="TableContents"/>
-              <w:bidi w:val="0"/>
-              <w:spacing w:before="120" w:after="120"/>
-              <w:jc w:val="left"/>
-              <w:rPr/>
-            </w:pPr>
-            <w:r>
-              <w:rPr/>
-              <w:t>Jira and ServiceDesk Plus through MCP; an Obsidian Kanban board; a local file cache always.</w:t>
-            </w:r>
-          </w:p>
-        </w:tc>
-      </w:tr>
-      <w:tr>
-        <w:trPr/>
-        <w:tc>
-          <w:tcPr>
-            <w:tcW w:w="1772" w:type="dxa"/>
-            <w:tcBorders/>
-            <w:vAlign w:val="center"/>
-          </w:tcPr>
-          <w:p>
-            <w:pPr>
-              <w:pStyle w:val="TableContents"/>
-              <w:bidi w:val="0"/>
-              <w:spacing w:before="120" w:after="120"/>
-              <w:jc w:val="left"/>
-              <w:rPr/>
-            </w:pPr>
-            <w:r>
-              <w:rPr/>
-              <w:t>Reviewers and models</w:t>
-            </w:r>
-          </w:p>
-        </w:tc>
-        <w:tc>
-          <w:tcPr>
-            <w:tcW w:w="9567" w:type="dxa"/>
-            <w:tcBorders/>
-            <w:vAlign w:val="center"/>
-          </w:tcPr>
-          <w:p>
-            <w:pPr>
-              <w:pStyle w:val="TableContents"/>
-              <w:bidi w:val="0"/>
-              <w:spacing w:before="120" w:after="120"/>
-              <w:jc w:val="left"/>
-              <w:rPr/>
-            </w:pPr>
-            <w:r>
-              <w:rPr/>
-              <w:t>Codex (OpenAI) as the first-choice reviewer; GitHub Copilot models including Kimi as an alternative family; Gemini as a design partner; per-role model pins with a probe that confirms the model answers before it is trusted.</w:t>
-            </w:r>
-          </w:p>
-        </w:tc>
-      </w:tr>
-      <w:tr>
-        <w:trPr/>
-        <w:tc>
-          <w:tcPr>
-            <w:tcW w:w="1772" w:type="dxa"/>
-            <w:tcBorders/>
-            <w:vAlign w:val="center"/>
-          </w:tcPr>
-          <w:p>
-            <w:pPr>
-              <w:pStyle w:val="TableContents"/>
-              <w:bidi w:val="0"/>
-              <w:spacing w:before="120" w:after="120"/>
-              <w:jc w:val="left"/>
-              <w:rPr/>
-            </w:pPr>
-            <w:r>
-              <w:rPr/>
-              <w:t>Cloud</w:t>
-            </w:r>
-          </w:p>
-        </w:tc>
-        <w:tc>
-          <w:tcPr>
-            <w:tcW w:w="9567" w:type="dxa"/>
-            <w:tcBorders/>
-            <w:vAlign w:val="center"/>
-          </w:tcPr>
-          <w:p>
-            <w:pPr>
-              <w:pStyle w:val="TableContents"/>
-              <w:bidi w:val="0"/>
-              <w:spacing w:before="120" w:after="120"/>
-              <w:jc w:val="left"/>
-              <w:rPr/>
-            </w:pPr>
-            <w:r>
-              <w:rPr/>
-              <w:t>The official AWS and Azure MCP servers, configured per repository with guardrails.</w:t>
-            </w:r>
-          </w:p>
-        </w:tc>
-      </w:tr>
-      <w:tr>
-        <w:trPr/>
-        <w:tc>
-          <w:tcPr>
-            <w:tcW w:w="1772" w:type="dxa"/>
-            <w:tcBorders/>
-            <w:vAlign w:val="center"/>
-          </w:tcPr>
-          <w:p>
-            <w:pPr>
-              <w:pStyle w:val="TableContents"/>
-              <w:bidi w:val="0"/>
-              <w:spacing w:before="120" w:after="120"/>
-              <w:jc w:val="left"/>
-              <w:rPr/>
-            </w:pPr>
-            <w:r>
-              <w:rPr/>
-              <w:t>Notifications</w:t>
-            </w:r>
-          </w:p>
-        </w:tc>
-        <w:tc>
-          <w:tcPr>
-            <w:tcW w:w="9567" w:type="dxa"/>
-            <w:tcBorders/>
-            <w:vAlign w:val="center"/>
-          </w:tcPr>
-          <w:p>
-            <w:pPr>
-              <w:pStyle w:val="TableContents"/>
-              <w:bidi w:val="0"/>
-              <w:spacing w:before="120" w:after="120"/>
-              <w:jc w:val="left"/>
-              <w:rPr/>
-            </w:pPr>
-            <w:r>
-              <w:rPr/>
-              <w:t>Microsoft Teams and Telegram, outbound; two-way options documented.</w:t>
-            </w:r>
-          </w:p>
-        </w:tc>
-      </w:tr>
-      <w:tr>
-        <w:trPr/>
-        <w:tc>
-          <w:tcPr>
-            <w:tcW w:w="1772" w:type="dxa"/>
-            <w:tcBorders/>
-            <w:vAlign w:val="center"/>
-          </w:tcPr>
-          <w:p>
-            <w:pPr>
-              <w:pStyle w:val="TableContents"/>
-              <w:bidi w:val="0"/>
-              <w:spacing w:before="120" w:after="120"/>
-              <w:jc w:val="left"/>
-              <w:rPr/>
-            </w:pPr>
-            <w:r>
-              <w:rPr/>
-              <w:t>Memory</w:t>
-            </w:r>
-          </w:p>
-        </w:tc>
-        <w:tc>
-          <w:tcPr>
-            <w:tcW w:w="9567" w:type="dxa"/>
-            <w:tcBorders/>
-            <w:vAlign w:val="center"/>
-          </w:tcPr>
-          <w:p>
-            <w:pPr>
-              <w:pStyle w:val="TableContents"/>
-              <w:bidi w:val="0"/>
-              <w:spacing w:before="120" w:after="120"/>
-              <w:jc w:val="left"/>
-              <w:rPr/>
-            </w:pPr>
-            <w:r>
-              <w:rPr/>
-              <w:t>Optional Obsidian vault for cross-repository notes; never written to without explicit consent in the session.</w:t>
-            </w:r>
-          </w:p>
-        </w:tc>
-      </w:tr>
-    </w:tbl>
-    <w:p>
-      <w:pPr>
-        <w:pStyle w:val="Heading2"/>
-        <w:bidi w:val="0"/>
-        <w:jc w:val="left"/>
-        <w:rPr/>
-      </w:pPr>
-      <w:r>
-        <w:rPr/>
-        <w:t>10. Getting started</w:t>
-      </w:r>
-    </w:p>
-    <w:p>
-      <w:pPr>
-        <w:pStyle w:val="BodyText"/>
-        <w:numPr>
-          <w:ilvl w:val="0"/>
-          <w:numId w:val="4"/>
-        </w:numPr>
-        <w:tabs>
-          <w:tab w:val="clear" w:pos="1134"/>
-          <w:tab w:val="left" w:pos="829" w:leader="none"/>
-        </w:tabs>
-        <w:bidi w:val="0"/>
-        <w:spacing w:before="120" w:after="0"/>
-        <w:ind w:hanging="283" w:left="829"/>
-        <w:jc w:val="left"/>
-        <w:rPr/>
-      </w:pPr>
-      <w:r>
-        <w:rPr/>
-        <w:t xml:space="preserve">Install the marketplace and the crew plugin in Claude Code, then </w:t>
-      </w:r>
-      <w:r>
-        <w:rPr>
-          <w:rStyle w:val="SourceText"/>
-        </w:rPr>
-        <w:t>/reload-plugins</w:t>
-      </w:r>
-      <w:r>
-        <w:rPr/>
-        <w:t xml:space="preserve"> in any open session. </w:t>
-      </w:r>
-    </w:p>
-    <w:p>
-      <w:pPr>
-        <w:pStyle w:val="BodyText"/>
-        <w:numPr>
-          <w:ilvl w:val="0"/>
-          <w:numId w:val="4"/>
-        </w:numPr>
-        <w:tabs>
-          <w:tab w:val="clear" w:pos="1134"/>
-          <w:tab w:val="left" w:pos="829" w:leader="none"/>
-        </w:tabs>
-        <w:bidi w:val="0"/>
-        <w:spacing w:before="120" w:after="0"/>
-        <w:ind w:hanging="283" w:left="829"/>
-        <w:jc w:val="left"/>
-        <w:rPr/>
-      </w:pPr>
-      <w:r>
-        <w:rPr/>
-        <w:t xml:space="preserve">In a repository, run </w:t>
-      </w:r>
-      <w:r>
-        <w:rPr>
-          <w:rStyle w:val="SourceText"/>
-        </w:rPr>
-        <w:t>/crew:init</w:t>
-      </w:r>
-      <w:r>
-        <w:rPr/>
-        <w:t xml:space="preserve">. It is phased and resumable; nothing is written without saying so. </w:t>
-      </w:r>
-    </w:p>
-    <w:p>
-      <w:pPr>
-        <w:pStyle w:val="BodyText"/>
-        <w:numPr>
-          <w:ilvl w:val="0"/>
-          <w:numId w:val="4"/>
-        </w:numPr>
-        <w:tabs>
-          <w:tab w:val="clear" w:pos="1134"/>
-          <w:tab w:val="left" w:pos="829" w:leader="none"/>
-        </w:tabs>
-        <w:bidi w:val="0"/>
-        <w:spacing w:before="120" w:after="0"/>
-        <w:ind w:hanging="283" w:left="829"/>
-        <w:jc w:val="left"/>
-        <w:rPr/>
-      </w:pPr>
-      <w:r>
-        <w:rPr/>
-        <w:t xml:space="preserve">Build the smoke harness when init asks. Everything downstream stands on it. </w:t>
-      </w:r>
-    </w:p>
-    <w:p>
-      <w:pPr>
-        <w:pStyle w:val="BodyText"/>
-        <w:numPr>
-          <w:ilvl w:val="0"/>
-          <w:numId w:val="4"/>
-        </w:numPr>
-        <w:tabs>
-          <w:tab w:val="clear" w:pos="1134"/>
-          <w:tab w:val="left" w:pos="829" w:leader="none"/>
-        </w:tabs>
-        <w:bidi w:val="0"/>
-        <w:spacing w:before="120" w:after="0"/>
-        <w:ind w:hanging="283" w:left="829"/>
-        <w:jc w:val="left"/>
-        <w:rPr/>
-      </w:pPr>
-      <w:r>
-        <w:rPr/>
-        <w:t xml:space="preserve">Run </w:t>
-      </w:r>
-      <w:r>
-        <w:rPr>
-          <w:rStyle w:val="SourceText"/>
-        </w:rPr>
-        <w:t>/crew:onboard</w:t>
-      </w:r>
-      <w:r>
-        <w:rPr/>
-        <w:t xml:space="preserve"> so the crew learns the codebase once and writes it down. </w:t>
-      </w:r>
-    </w:p>
-    <w:p>
-      <w:pPr>
-        <w:pStyle w:val="BodyText"/>
-        <w:numPr>
-          <w:ilvl w:val="0"/>
-          <w:numId w:val="4"/>
-        </w:numPr>
-        <w:tabs>
-          <w:tab w:val="clear" w:pos="1134"/>
-          <w:tab w:val="left" w:pos="829" w:leader="none"/>
-        </w:tabs>
-        <w:bidi w:val="0"/>
-        <w:ind w:hanging="283" w:left="829"/>
-        <w:jc w:val="left"/>
-        <w:rPr/>
-      </w:pPr>
-      <w:r>
-        <w:rPr/>
-        <w:t xml:space="preserve">Write a ticket with </w:t>
-      </w:r>
-      <w:r>
-        <w:rPr>
-          <w:rStyle w:val="SourceText"/>
-        </w:rPr>
-        <w:t>/crew:ticket</w:t>
-      </w:r>
-      <w:r>
-        <w:rPr/>
-        <w:t xml:space="preserve">, then </w:t>
-      </w:r>
-      <w:r>
-        <w:rPr>
-          <w:rStyle w:val="SourceText"/>
-        </w:rPr>
-        <w:t>/crew:work</w:t>
-      </w:r>
-      <w:r>
-        <w:rPr/>
-        <w:t xml:space="preserve">. Read the review. Merge when the gate is green. </w:t>
-      </w:r>
-    </w:p>
-    <w:p>
-      <w:pPr>
-        <w:pStyle w:val="Heading2"/>
-        <w:bidi w:val="0"/>
-        <w:jc w:val="left"/>
-        <w:rPr/>
-      </w:pPr>
-      <w:r>
-        <w:rPr/>
-        <w:t>11. Glossary</w:t>
-      </w:r>
-    </w:p>
-    <w:tbl>
-      <w:tblPr>
-        <w:tblW w:w="5000" w:type="pct"/>
-        <w:jc w:val="left"/>
-        <w:tblInd w:w="28" w:type="dxa"/>
-        <w:tblLayout w:type="fixed"/>
-        <w:tblCellMar>
-          <w:top w:w="28" w:type="dxa"/>
-          <w:left w:w="28" w:type="dxa"/>
-          <w:bottom w:w="28" w:type="dxa"/>
-          <w:right w:w="28" w:type="dxa"/>
-        </w:tblCellMar>
-      </w:tblPr>
-      <w:tblGrid>
-        <w:gridCol w:w="2550"/>
-        <w:gridCol w:w="8789"/>
-      </w:tblGrid>
-      <w:tr>
-        <w:trPr>
-          <w:tblHeader w:val="true"/>
-        </w:trPr>
-        <w:tc>
-          <w:tcPr>
-            <w:tcW w:w="2550" w:type="dxa"/>
-            <w:tcBorders/>
-            <w:vAlign w:val="center"/>
-          </w:tcPr>
-          <w:p>
-            <w:pPr>
-              <w:pStyle w:val="TableHeading"/>
-              <w:suppressLineNumbers/>
-              <w:shd w:fill="1F4E79" w:val="clear"/>
-              <w:bidi w:val="0"/>
-              <w:spacing w:before="120" w:after="120"/>
-              <w:jc w:val="left"/>
-              <w:rPr/>
-            </w:pPr>
-            <w:r>
-              <w:rPr/>
-              <w:t>Term</w:t>
-            </w:r>
-          </w:p>
-        </w:tc>
-        <w:tc>
-          <w:tcPr>
-            <w:tcW w:w="8789" w:type="dxa"/>
-            <w:tcBorders/>
-            <w:vAlign w:val="center"/>
-          </w:tcPr>
-          <w:p>
-            <w:pPr>
-              <w:pStyle w:val="TableHeading"/>
-              <w:suppressLineNumbers/>
-              <w:shd w:fill="1F4E79" w:val="clear"/>
-              <w:bidi w:val="0"/>
-              <w:spacing w:before="120" w:after="120"/>
-              <w:jc w:val="left"/>
-              <w:rPr/>
-            </w:pPr>
-            <w:r>
-              <w:rPr/>
               <w:t>Meaning</w:t>
             </w:r>
           </w:p>
@@ -6102,7 +5327,7 @@
         <w:trPr/>
         <w:tc>
           <w:tcPr>
-            <w:tcW w:w="2550" w:type="dxa"/>
+            <w:tcW w:w="2634" w:type="dxa"/>
             <w:tcBorders/>
             <w:vAlign w:val="center"/>
           </w:tcPr>
@@ -6122,7 +5347,7 @@
         </w:tc>
         <w:tc>
           <w:tcPr>
-            <w:tcW w:w="8789" w:type="dxa"/>
+            <w:tcW w:w="8705" w:type="dxa"/>
             <w:tcBorders/>
             <w:vAlign w:val="center"/>
           </w:tcPr>
@@ -6145,7 +5370,7 @@
         <w:trPr/>
         <w:tc>
           <w:tcPr>
-            <w:tcW w:w="2550" w:type="dxa"/>
+            <w:tcW w:w="2634" w:type="dxa"/>
             <w:tcBorders/>
             <w:vAlign w:val="center"/>
           </w:tcPr>
@@ -6165,7 +5390,7 @@
         </w:tc>
         <w:tc>
           <w:tcPr>
-            <w:tcW w:w="8789" w:type="dxa"/>
+            <w:tcW w:w="8705" w:type="dxa"/>
             <w:tcBorders/>
             <w:vAlign w:val="center"/>
           </w:tcPr>
@@ -6188,7 +5413,7 @@
         <w:trPr/>
         <w:tc>
           <w:tcPr>
-            <w:tcW w:w="2550" w:type="dxa"/>
+            <w:tcW w:w="2634" w:type="dxa"/>
             <w:tcBorders/>
             <w:vAlign w:val="center"/>
           </w:tcPr>
@@ -6208,7 +5433,7 @@
         </w:tc>
         <w:tc>
           <w:tcPr>
-            <w:tcW w:w="8789" w:type="dxa"/>
+            <w:tcW w:w="8705" w:type="dxa"/>
             <w:tcBorders/>
             <w:vAlign w:val="center"/>
           </w:tcPr>
@@ -6231,7 +5456,7 @@
         <w:trPr/>
         <w:tc>
           <w:tcPr>
-            <w:tcW w:w="2550" w:type="dxa"/>
+            <w:tcW w:w="2634" w:type="dxa"/>
             <w:tcBorders/>
             <w:vAlign w:val="center"/>
           </w:tcPr>
@@ -6251,7 +5476,7 @@
         </w:tc>
         <w:tc>
           <w:tcPr>
-            <w:tcW w:w="8789" w:type="dxa"/>
+            <w:tcW w:w="8705" w:type="dxa"/>
             <w:tcBorders/>
             <w:vAlign w:val="center"/>
           </w:tcPr>
@@ -6274,7 +5499,7 @@
         <w:trPr/>
         <w:tc>
           <w:tcPr>
-            <w:tcW w:w="2550" w:type="dxa"/>
+            <w:tcW w:w="2634" w:type="dxa"/>
             <w:tcBorders/>
             <w:vAlign w:val="center"/>
           </w:tcPr>
@@ -6294,7 +5519,7 @@
         </w:tc>
         <w:tc>
           <w:tcPr>
-            <w:tcW w:w="8789" w:type="dxa"/>
+            <w:tcW w:w="8705" w:type="dxa"/>
             <w:tcBorders/>
             <w:vAlign w:val="center"/>
           </w:tcPr>
@@ -6317,7 +5542,7 @@
         <w:trPr/>
         <w:tc>
           <w:tcPr>
-            <w:tcW w:w="2550" w:type="dxa"/>
+            <w:tcW w:w="2634" w:type="dxa"/>
             <w:tcBorders/>
             <w:vAlign w:val="center"/>
           </w:tcPr>
@@ -6337,7 +5562,7 @@
         </w:tc>
         <w:tc>
           <w:tcPr>
-            <w:tcW w:w="8789" w:type="dxa"/>
+            <w:tcW w:w="8705" w:type="dxa"/>
             <w:tcBorders/>
             <w:vAlign w:val="center"/>
           </w:tcPr>
@@ -6360,7 +5585,7 @@
         <w:trPr/>
         <w:tc>
           <w:tcPr>
-            <w:tcW w:w="2550" w:type="dxa"/>
+            <w:tcW w:w="2634" w:type="dxa"/>
             <w:tcBorders/>
             <w:vAlign w:val="center"/>
           </w:tcPr>
@@ -6380,7 +5605,7 @@
         </w:tc>
         <w:tc>
           <w:tcPr>
-            <w:tcW w:w="8789" w:type="dxa"/>
+            <w:tcW w:w="8705" w:type="dxa"/>
             <w:tcBorders/>
             <w:vAlign w:val="center"/>
           </w:tcPr>
@@ -6403,7 +5628,7 @@
         <w:trPr/>
         <w:tc>
           <w:tcPr>
-            <w:tcW w:w="2550" w:type="dxa"/>
+            <w:tcW w:w="2634" w:type="dxa"/>
             <w:tcBorders/>
             <w:vAlign w:val="center"/>
           </w:tcPr>
@@ -6423,7 +5648,7 @@
         </w:tc>
         <w:tc>
           <w:tcPr>
-            <w:tcW w:w="8789" w:type="dxa"/>
+            <w:tcW w:w="8705" w:type="dxa"/>
             <w:tcBorders/>
             <w:vAlign w:val="center"/>
           </w:tcPr>
@@ -6446,7 +5671,7 @@
         <w:trPr/>
         <w:tc>
           <w:tcPr>
-            <w:tcW w:w="2550" w:type="dxa"/>
+            <w:tcW w:w="2634" w:type="dxa"/>
             <w:tcBorders/>
             <w:vAlign w:val="center"/>
           </w:tcPr>
@@ -6466,7 +5691,7 @@
         </w:tc>
         <w:tc>
           <w:tcPr>
-            <w:tcW w:w="8789" w:type="dxa"/>
+            <w:tcW w:w="8705" w:type="dxa"/>
             <w:tcBorders/>
             <w:vAlign w:val="center"/>
           </w:tcPr>
@@ -6489,7 +5714,7 @@
         <w:trPr/>
         <w:tc>
           <w:tcPr>
-            <w:tcW w:w="2550" w:type="dxa"/>
+            <w:tcW w:w="2634" w:type="dxa"/>
             <w:tcBorders/>
             <w:vAlign w:val="center"/>
           </w:tcPr>
@@ -6509,7 +5734,7 @@
         </w:tc>
         <w:tc>
           <w:tcPr>
-            <w:tcW w:w="8789" w:type="dxa"/>
+            <w:tcW w:w="8705" w:type="dxa"/>
             <w:tcBorders/>
             <w:vAlign w:val="center"/>
           </w:tcPr>
@@ -6539,17 +5764,87 @@
       </w:pPr>
       <w:r>
         <w:rPr/>
-        <w:t xml:space="preserve">Provenance: figures are read from the repository at commit 621d50dc (main) and branch crew-stop-gate-record at b6e8c4bb; counts are 28 commands, 54 agents, 20 skills, 20 hook registrations, 51 test modules. Review counts are from </w:t>
+        <w:t xml:space="preserve">Provenance: figures are read from the repository at commit 541b2b70; counts are 28 commands, 54 role definitions (13 on the growth ladder, 40 specialists, 1 PM), 20 skills, 20 hook registrations, 65 files under </w:t>
       </w:r>
       <w:r>
         <w:rPr>
           <w:rStyle w:val="SourceText"/>
         </w:rPr>
-        <w:t>.crew/metrics.md</w:t>
-      </w:r>
-      <w:r>
-        <w:rPr/>
-        <w:t>. Not verified: the Stop-gate fix's effect on live sessions, pending merge.</w:t>
+        <w:t>plugin/crew/tests/</w:t>
+      </w:r>
+      <w:r>
+        <w:rPr/>
+        <w:t xml:space="preserve">, 19 sections in </w:t>
+      </w:r>
+      <w:r>
+        <w:rPr>
+          <w:rStyle w:val="SourceText"/>
+        </w:rPr>
+        <w:t>CONFIG.md</w:t>
+      </w:r>
+      <w:r>
+        <w:rPr/>
+        <w:t xml:space="preserve">. The "what changed recently" table is drawn from </w:t>
+      </w:r>
+      <w:r>
+        <w:rPr>
+          <w:rStyle w:val="SourceText"/>
+        </w:rPr>
+        <w:t>CHANGELOG.md</w:t>
+      </w:r>
+      <w:r>
+        <w:rPr/>
+        <w:t xml:space="preserve">'s </w:t>
+      </w:r>
+      <w:r>
+        <w:rPr>
+          <w:rStyle w:val="SourceText"/>
+        </w:rPr>
+        <w:t>[Unreleased]</w:t>
+      </w:r>
+      <w:r>
+        <w:rPr/>
+        <w:t xml:space="preserve"> entry for crew 0.20.11. Not verified: this document's counts against any commit after 541b2b70; the requesting brief for this document set expected 53 roles, and the code at this commit carries 54 -- both </w:t>
+      </w:r>
+      <w:r>
+        <w:rPr>
+          <w:rStyle w:val="SourceText"/>
+        </w:rPr>
+        <w:t>crew_state.py</w:t>
+      </w:r>
+      <w:r>
+        <w:rPr/>
+        <w:t xml:space="preserve">'s </w:t>
+      </w:r>
+      <w:r>
+        <w:rPr>
+          <w:rStyle w:val="SourceText"/>
+        </w:rPr>
+        <w:t>ROLE_TIERS</w:t>
+      </w:r>
+      <w:r>
+        <w:rPr/>
+        <w:t>/</w:t>
+      </w:r>
+      <w:r>
+        <w:rPr>
+          <w:rStyle w:val="SourceText"/>
+        </w:rPr>
+        <w:t>SPECIALIST_ROLES</w:t>
+      </w:r>
+      <w:r>
+        <w:rPr/>
+        <w:t xml:space="preserve"> and the file count under </w:t>
+      </w:r>
+      <w:r>
+        <w:rPr>
+          <w:rStyle w:val="SourceText"/>
+        </w:rPr>
+        <w:t>plugin/crew/agents/</w:t>
+      </w:r>
+      <w:r>
+        <w:rPr/>
+        <w:t xml:space="preserve"> agree on 54, so that is the figure used here.</w:t>
       </w:r>
     </w:p>
     <w:sectPr>
@@ -6844,143 +6139,6 @@
   <w:abstractNum w:abstractNumId="3">
     <w:lvl w:ilvl="0">
       <w:start w:val="1"/>
-      <w:numFmt w:val="bullet"/>
-      <w:lvlText w:val=""/>
-      <w:lvlJc w:val="left"/>
-      <w:pPr>
-        <w:tabs>
-          <w:tab w:val="num" w:pos="709"/>
-        </w:tabs>
-        <w:ind w:left="709" w:hanging="283"/>
-      </w:pPr>
-      <w:rPr>
-        <w:rFonts w:ascii="Symbol" w:hAnsi="Symbol" w:cs="Symbol" w:hint="default"/>
-      </w:rPr>
-    </w:lvl>
-    <w:lvl w:ilvl="1">
-      <w:start w:val="1"/>
-      <w:numFmt w:val="bullet"/>
-      <w:lvlText w:val=""/>
-      <w:lvlJc w:val="left"/>
-      <w:pPr>
-        <w:tabs>
-          <w:tab w:val="num" w:pos="1418"/>
-        </w:tabs>
-        <w:ind w:left="1418" w:hanging="283"/>
-      </w:pPr>
-      <w:rPr>
-        <w:rFonts w:ascii="Symbol" w:hAnsi="Symbol" w:cs="Symbol" w:hint="default"/>
-      </w:rPr>
-    </w:lvl>
-    <w:lvl w:ilvl="2">
-      <w:start w:val="1"/>
-      <w:numFmt w:val="bullet"/>
-      <w:lvlText w:val=""/>
-      <w:lvlJc w:val="left"/>
-      <w:pPr>
-        <w:tabs>
-          <w:tab w:val="num" w:pos="2127"/>
-        </w:tabs>
-        <w:ind w:left="2127" w:hanging="283"/>
-      </w:pPr>
-      <w:rPr>
-        <w:rFonts w:ascii="Symbol" w:hAnsi="Symbol" w:cs="Symbol" w:hint="default"/>
-      </w:rPr>
-    </w:lvl>
-    <w:lvl w:ilvl="3">
-      <w:start w:val="1"/>
-      <w:numFmt w:val="bullet"/>
-      <w:lvlText w:val=""/>
-      <w:lvlJc w:val="left"/>
-      <w:pPr>
-        <w:tabs>
-          <w:tab w:val="num" w:pos="2836"/>
-        </w:tabs>
-        <w:ind w:left="2836" w:hanging="283"/>
-      </w:pPr>
-      <w:rPr>
-        <w:rFonts w:ascii="Symbol" w:hAnsi="Symbol" w:cs="Symbol" w:hint="default"/>
-      </w:rPr>
-    </w:lvl>
-    <w:lvl w:ilvl="4">
-      <w:start w:val="1"/>
-      <w:numFmt w:val="bullet"/>
-      <w:lvlText w:val=""/>
-      <w:lvlJc w:val="left"/>
-      <w:pPr>
-        <w:tabs>
-          <w:tab w:val="num" w:pos="3545"/>
-        </w:tabs>
-        <w:ind w:left="3545" w:hanging="283"/>
-      </w:pPr>
-      <w:rPr>
-        <w:rFonts w:ascii="Symbol" w:hAnsi="Symbol" w:cs="Symbol" w:hint="default"/>
-      </w:rPr>
-    </w:lvl>
-    <w:lvl w:ilvl="5">
-      <w:start w:val="1"/>
-      <w:numFmt w:val="bullet"/>
-      <w:lvlText w:val=""/>
-      <w:lvlJc w:val="left"/>
-      <w:pPr>
-        <w:tabs>
-          <w:tab w:val="num" w:pos="4254"/>
-        </w:tabs>
-        <w:ind w:left="4254" w:hanging="283"/>
-      </w:pPr>
-      <w:rPr>
-        <w:rFonts w:ascii="Symbol" w:hAnsi="Symbol" w:cs="Symbol" w:hint="default"/>
-      </w:rPr>
-    </w:lvl>
-    <w:lvl w:ilvl="6">
-      <w:start w:val="1"/>
-      <w:numFmt w:val="bullet"/>
-      <w:lvlText w:val=""/>
-      <w:lvlJc w:val="left"/>
-      <w:pPr>
-        <w:tabs>
-          <w:tab w:val="num" w:pos="4963"/>
-        </w:tabs>
-        <w:ind w:left="4963" w:hanging="283"/>
-      </w:pPr>
-      <w:rPr>
-        <w:rFonts w:ascii="Symbol" w:hAnsi="Symbol" w:cs="Symbol" w:hint="default"/>
-      </w:rPr>
-    </w:lvl>
-    <w:lvl w:ilvl="7">
-      <w:start w:val="1"/>
-      <w:numFmt w:val="bullet"/>
-      <w:lvlText w:val=""/>
-      <w:lvlJc w:val="left"/>
-      <w:pPr>
-        <w:tabs>
-          <w:tab w:val="num" w:pos="5672"/>
-        </w:tabs>
-        <w:ind w:left="5672" w:hanging="283"/>
-      </w:pPr>
-      <w:rPr>
-        <w:rFonts w:ascii="Symbol" w:hAnsi="Symbol" w:cs="Symbol" w:hint="default"/>
-      </w:rPr>
-    </w:lvl>
-    <w:lvl w:ilvl="8">
-      <w:start w:val="1"/>
-      <w:numFmt w:val="bullet"/>
-      <w:lvlText w:val=""/>
-      <w:lvlJc w:val="left"/>
-      <w:pPr>
-        <w:tabs>
-          <w:tab w:val="num" w:pos="6381"/>
-        </w:tabs>
-        <w:ind w:left="6381" w:hanging="283"/>
-      </w:pPr>
-      <w:rPr>
-        <w:rFonts w:ascii="Symbol" w:hAnsi="Symbol" w:cs="Symbol" w:hint="default"/>
-      </w:rPr>
-    </w:lvl>
-  </w:abstractNum>
-  <w:abstractNum w:abstractNumId="4">
-    <w:lvl w:ilvl="0">
-      <w:start w:val="1"/>
       <w:numFmt w:val="decimal"/>
       <w:lvlText w:val="%1."/>
       <w:lvlJc w:val="left"/>
@@ -7097,7 +6255,7 @@
       <w:rPr/>
     </w:lvl>
   </w:abstractNum>
-  <w:abstractNum w:abstractNumId="5">
+  <w:abstractNum w:abstractNumId="4">
     <w:lvl w:ilvl="0">
       <w:start w:val="1"/>
       <w:numFmt w:val="none"/>
@@ -7229,9 +6387,6 @@
   </w:num>
   <w:num w:numId="4">
     <w:abstractNumId w:val="4"/>
-  </w:num>
-  <w:num w:numId="5">
-    <w:abstractNumId w:val="5"/>
   </w:num>
 </w:numbering>
 </file>
@@ -7259,12 +6414,12 @@
     <w:pPr>
       <w:widowControl w:val="false"/>
       <w:bidi w:val="0"/>
-      <w:spacing w:lineRule="auto" w:line="336" w:before="1134" w:after="1134"/>
+      <w:spacing w:lineRule="auto" w:line="348" w:before="1134" w:after="1134"/>
       <w:ind w:left="1134" w:right="1134"/>
     </w:pPr>
     <w:rPr>
-      <w:rFonts w:ascii="Calibri;Arial;sans-serif" w:hAnsi="Calibri;Arial;sans-serif" w:eastAsia="Calibri;Arial;sans-serif" w:cs="Calibri;Arial;sans-serif"/>
-      <w:color w:val="1A1A1A"/>
+      <w:rFonts w:ascii="Segoe UI;Calibri;Arial;sans-serif" w:hAnsi="Segoe UI;Calibri;Arial;sans-serif" w:eastAsia="Segoe UI;Calibri;Arial;sans-serif" w:cs="Segoe UI;Calibri;Arial;sans-serif"/>
+      <w:color w:val="1B1B1F"/>
       <w:sz w:val="22"/>
       <w:szCs w:val="22"/>
       <w:lang w:val="en-US" w:eastAsia="zh-CN" w:bidi="hi-IN"/>
@@ -7293,9 +6448,10 @@
     <w:qFormat/>
     <w:pPr>
       <w:pBdr>
-        <w:bottom w:val="single" w:sz="2" w:space="3" w:color="5C6670"/>
+        <w:bottom w:val="single" w:sz="2" w:space="3" w:color="DCDEE5"/>
       </w:pBdr>
-      <w:spacing w:before="480" w:after="120"/>
+      <w:spacing w:before="480" w:after="160"/>
+      <w:ind w:left="480" w:right="480"/>
       <w:outlineLvl w:val="1"/>
     </w:pPr>
     <w:rPr>
@@ -7314,6 +6470,7 @@
     <w:qFormat/>
     <w:pPr>
       <w:spacing w:before="320" w:after="120"/>
+      <w:ind w:left="320" w:right="320"/>
       <w:outlineLvl w:val="2"/>
     </w:pPr>
     <w:rPr>
@@ -7402,11 +6559,10 @@
     <w:name w:val="Table Contents"/>
     <w:basedOn w:val="BodyText"/>
     <w:qFormat/>
-    <w:pPr/>
-    <w:rPr>
-      <w:sz w:val="20"/>
-      <w:szCs w:val="20"/>
-    </w:rPr>
+    <w:pPr>
+      <w:jc w:val="left"/>
+    </w:pPr>
+    <w:rPr/>
   </w:style>
   <w:style w:type="paragraph" w:styleId="Index">
     <w:name w:val="Index"/>
@@ -7473,7 +6629,7 @@
     <w:qFormat/>
     <w:pPr/>
     <w:rPr>
-      <w:color w:val="5C6670"/>
+      <w:color w:val="5C5F6B"/>
       <w:sz w:val="19"/>
       <w:szCs w:val="19"/>
     </w:rPr>
@@ -7491,8 +6647,6 @@
       <w:b/>
       <w:bCs/>
       <w:color w:val="FFFFFF"/>
-      <w:sz w:val="20"/>
-      <w:szCs w:val="20"/>
     </w:rPr>
   </w:style>
 </w:styles>

</xml_diff>